<commit_message>
Vyřešeny všechny průsery Jde mazat uživatele Jde mazat články Nejde mazat recenze
</commit_message>
<xml_diff>
--- a/doc/dokumentace.DOCX
+++ b/doc/dokumentace.DOCX
@@ -2685,7 +2685,7 @@
           <w:szCs w:val="24"/>
           <w:lang w:eastAsia="cs-CZ"/>
         </w:rPr>
-        <w:t>HomeController.php</w:t>
+        <w:t>EditPostController.php</w:t>
       </w:r>
       <w:proofErr w:type="spellEnd"/>
     </w:p>
@@ -2728,7 +2728,7 @@
           <w:szCs w:val="24"/>
           <w:lang w:eastAsia="cs-CZ"/>
         </w:rPr>
-        <w:t>LoginErrorController.php</w:t>
+        <w:t>HomeController.php</w:t>
       </w:r>
       <w:proofErr w:type="spellEnd"/>
     </w:p>
@@ -2771,7 +2771,7 @@
           <w:szCs w:val="24"/>
           <w:lang w:eastAsia="cs-CZ"/>
         </w:rPr>
-        <w:t>LogoutController.php</w:t>
+        <w:t>LoginErrorController.php</w:t>
       </w:r>
       <w:proofErr w:type="spellEnd"/>
     </w:p>
@@ -2814,7 +2814,7 @@
           <w:szCs w:val="24"/>
           <w:lang w:eastAsia="cs-CZ"/>
         </w:rPr>
-        <w:t>ManagePostsController.php</w:t>
+        <w:t>LogoutController.php</w:t>
       </w:r>
       <w:proofErr w:type="spellEnd"/>
     </w:p>
@@ -2857,7 +2857,7 @@
           <w:szCs w:val="24"/>
           <w:lang w:eastAsia="cs-CZ"/>
         </w:rPr>
-        <w:t>ManageReviewsController.php</w:t>
+        <w:t>ManagePostsController.php</w:t>
       </w:r>
       <w:proofErr w:type="spellEnd"/>
     </w:p>
@@ -2901,7 +2901,7 @@
           <w:lang w:eastAsia="cs-CZ"/>
         </w:rPr>
         <w:lastRenderedPageBreak/>
-        <w:t>ProgramController.php</w:t>
+        <w:t>ManageReviewsController.php</w:t>
       </w:r>
       <w:proofErr w:type="spellEnd"/>
     </w:p>
@@ -2944,7 +2944,7 @@
           <w:szCs w:val="24"/>
           <w:lang w:eastAsia="cs-CZ"/>
         </w:rPr>
-        <w:t>RegistrationController.php</w:t>
+        <w:t>MyPostController.php</w:t>
       </w:r>
       <w:proofErr w:type="spellEnd"/>
     </w:p>
@@ -2987,7 +2987,7 @@
           <w:szCs w:val="24"/>
           <w:lang w:eastAsia="cs-CZ"/>
         </w:rPr>
-        <w:t>ReviewController.php</w:t>
+        <w:t>ProgramController.php</w:t>
       </w:r>
       <w:proofErr w:type="spellEnd"/>
     </w:p>
@@ -3030,7 +3030,7 @@
           <w:szCs w:val="24"/>
           <w:lang w:eastAsia="cs-CZ"/>
         </w:rPr>
-        <w:t>UploadController.php</w:t>
+        <w:t>RegistrationController.php</w:t>
       </w:r>
       <w:proofErr w:type="spellEnd"/>
     </w:p>
@@ -3073,7 +3073,7 @@
           <w:szCs w:val="24"/>
           <w:lang w:eastAsia="cs-CZ"/>
         </w:rPr>
-        <w:t>UserSettingsController.php</w:t>
+        <w:t>ReviewController.php</w:t>
       </w:r>
       <w:proofErr w:type="spellEnd"/>
     </w:p>
@@ -3081,7 +3081,7 @@
       <w:pPr>
         <w:pStyle w:val="Odstavecseseznamem"/>
         <w:numPr>
-          <w:ilvl w:val="1"/>
+          <w:ilvl w:val="2"/>
           <w:numId w:val="11"/>
         </w:numPr>
         <w:tabs>
@@ -3116,17 +3116,9 @@
           <w:szCs w:val="24"/>
           <w:lang w:eastAsia="cs-CZ"/>
         </w:rPr>
-        <w:t>models</w:t>
+        <w:t>UploadController.php</w:t>
       </w:r>
       <w:proofErr w:type="spellEnd"/>
-      <w:r>
-        <w:rPr>
-          <w:rFonts w:eastAsia="Times New Roman" w:cs="Times New Roman"/>
-          <w:szCs w:val="24"/>
-          <w:lang w:eastAsia="cs-CZ"/>
-        </w:rPr>
-        <w:t>/</w:t>
-      </w:r>
     </w:p>
     <w:p>
       <w:pPr>
@@ -3167,7 +3159,7 @@
           <w:szCs w:val="24"/>
           <w:lang w:eastAsia="cs-CZ"/>
         </w:rPr>
-        <w:t>Database.php</w:t>
+        <w:t>UserSettingsController.php</w:t>
       </w:r>
       <w:proofErr w:type="spellEnd"/>
     </w:p>
@@ -3175,7 +3167,7 @@
       <w:pPr>
         <w:pStyle w:val="Odstavecseseznamem"/>
         <w:numPr>
-          <w:ilvl w:val="3"/>
+          <w:ilvl w:val="1"/>
           <w:numId w:val="11"/>
         </w:numPr>
         <w:tabs>
@@ -3203,13 +3195,23 @@
           <w:lang w:eastAsia="cs-CZ"/>
         </w:rPr>
       </w:pPr>
-      <w:r>
-        <w:rPr>
-          <w:rFonts w:eastAsia="Times New Roman" w:cs="Times New Roman"/>
-          <w:szCs w:val="24"/>
-          <w:lang w:eastAsia="cs-CZ"/>
-        </w:rPr>
-        <w:t>Zajišťuje připojení k databázi</w:t>
+      <w:proofErr w:type="spellStart"/>
+      <w:r>
+        <w:rPr>
+          <w:rFonts w:eastAsia="Times New Roman" w:cs="Times New Roman"/>
+          <w:szCs w:val="24"/>
+          <w:lang w:eastAsia="cs-CZ"/>
+        </w:rPr>
+        <w:t>models</w:t>
+      </w:r>
+      <w:proofErr w:type="spellEnd"/>
+      <w:r>
+        <w:rPr>
+          <w:rFonts w:eastAsia="Times New Roman" w:cs="Times New Roman"/>
+          <w:szCs w:val="24"/>
+          <w:lang w:eastAsia="cs-CZ"/>
+        </w:rPr>
+        <w:t>/</w:t>
       </w:r>
     </w:p>
     <w:p>
@@ -3251,7 +3253,7 @@
           <w:szCs w:val="24"/>
           <w:lang w:eastAsia="cs-CZ"/>
         </w:rPr>
-        <w:t>PostModel.php</w:t>
+        <w:t>Database.php</w:t>
       </w:r>
       <w:proofErr w:type="spellEnd"/>
     </w:p>
@@ -3293,7 +3295,7 @@
           <w:szCs w:val="24"/>
           <w:lang w:eastAsia="cs-CZ"/>
         </w:rPr>
-        <w:t>Stará se o články</w:t>
+        <w:t>Zajišťuje připojení k databázi</w:t>
       </w:r>
     </w:p>
     <w:p>
@@ -3335,7 +3337,7 @@
           <w:szCs w:val="24"/>
           <w:lang w:eastAsia="cs-CZ"/>
         </w:rPr>
-        <w:t>ReviewModel.php</w:t>
+        <w:t>PostModel.php</w:t>
       </w:r>
       <w:proofErr w:type="spellEnd"/>
     </w:p>
@@ -3377,7 +3379,7 @@
           <w:szCs w:val="24"/>
           <w:lang w:eastAsia="cs-CZ"/>
         </w:rPr>
-        <w:t>Stará se o recenze</w:t>
+        <w:t>Stará se o články</w:t>
       </w:r>
     </w:p>
     <w:p>
@@ -3419,7 +3421,7 @@
           <w:szCs w:val="24"/>
           <w:lang w:eastAsia="cs-CZ"/>
         </w:rPr>
-        <w:t>UserModel.php</w:t>
+        <w:t>ReviewModel.php</w:t>
       </w:r>
       <w:proofErr w:type="spellEnd"/>
     </w:p>
@@ -3461,14 +3463,14 @@
           <w:szCs w:val="24"/>
           <w:lang w:eastAsia="cs-CZ"/>
         </w:rPr>
-        <w:t>Stará se o uživatele</w:t>
+        <w:t>Stará se o recenze</w:t>
       </w:r>
     </w:p>
     <w:p>
       <w:pPr>
         <w:pStyle w:val="Odstavecseseznamem"/>
         <w:numPr>
-          <w:ilvl w:val="1"/>
+          <w:ilvl w:val="2"/>
           <w:numId w:val="11"/>
         </w:numPr>
         <w:tabs>
@@ -3496,20 +3498,22 @@
           <w:lang w:eastAsia="cs-CZ"/>
         </w:rPr>
       </w:pPr>
-      <w:r>
-        <w:rPr>
-          <w:rFonts w:eastAsia="Times New Roman" w:cs="Times New Roman"/>
-          <w:szCs w:val="24"/>
-          <w:lang w:eastAsia="cs-CZ"/>
-        </w:rPr>
-        <w:t>script/</w:t>
-      </w:r>
+      <w:proofErr w:type="spellStart"/>
+      <w:r>
+        <w:rPr>
+          <w:rFonts w:eastAsia="Times New Roman" w:cs="Times New Roman"/>
+          <w:szCs w:val="24"/>
+          <w:lang w:eastAsia="cs-CZ"/>
+        </w:rPr>
+        <w:t>UserModel.php</w:t>
+      </w:r>
+      <w:proofErr w:type="spellEnd"/>
     </w:p>
     <w:p>
       <w:pPr>
         <w:pStyle w:val="Odstavecseseznamem"/>
         <w:numPr>
-          <w:ilvl w:val="2"/>
+          <w:ilvl w:val="3"/>
           <w:numId w:val="11"/>
         </w:numPr>
         <w:tabs>
@@ -3543,14 +3547,14 @@
           <w:szCs w:val="24"/>
           <w:lang w:eastAsia="cs-CZ"/>
         </w:rPr>
-        <w:t>script.js</w:t>
+        <w:t>Stará se o uživatele</w:t>
       </w:r>
     </w:p>
     <w:p>
       <w:pPr>
         <w:pStyle w:val="Odstavecseseznamem"/>
         <w:numPr>
-          <w:ilvl w:val="3"/>
+          <w:ilvl w:val="1"/>
           <w:numId w:val="11"/>
         </w:numPr>
         <w:tabs>
@@ -3584,14 +3588,14 @@
           <w:szCs w:val="24"/>
           <w:lang w:eastAsia="cs-CZ"/>
         </w:rPr>
-        <w:t>zajišťuje správu uživatelů a animace</w:t>
+        <w:t>script/</w:t>
       </w:r>
     </w:p>
     <w:p>
       <w:pPr>
         <w:pStyle w:val="Odstavecseseznamem"/>
         <w:numPr>
-          <w:ilvl w:val="1"/>
+          <w:ilvl w:val="2"/>
           <w:numId w:val="11"/>
         </w:numPr>
         <w:tabs>
@@ -3625,14 +3629,14 @@
           <w:szCs w:val="24"/>
           <w:lang w:eastAsia="cs-CZ"/>
         </w:rPr>
-        <w:t>style/</w:t>
+        <w:t>script.js</w:t>
       </w:r>
     </w:p>
     <w:p>
       <w:pPr>
         <w:pStyle w:val="Odstavecseseznamem"/>
         <w:numPr>
-          <w:ilvl w:val="2"/>
+          <w:ilvl w:val="3"/>
           <w:numId w:val="11"/>
         </w:numPr>
         <w:tabs>
@@ -3666,14 +3670,14 @@
           <w:szCs w:val="24"/>
           <w:lang w:eastAsia="cs-CZ"/>
         </w:rPr>
-        <w:t>style.css</w:t>
+        <w:t>zajišťuje správu uživatelů a animace</w:t>
       </w:r>
     </w:p>
     <w:p>
       <w:pPr>
         <w:pStyle w:val="Odstavecseseznamem"/>
         <w:numPr>
-          <w:ilvl w:val="3"/>
+          <w:ilvl w:val="1"/>
           <w:numId w:val="11"/>
         </w:numPr>
         <w:tabs>
@@ -3707,14 +3711,14 @@
           <w:szCs w:val="24"/>
           <w:lang w:eastAsia="cs-CZ"/>
         </w:rPr>
-        <w:t>vlastní styly</w:t>
+        <w:t>style/</w:t>
       </w:r>
     </w:p>
     <w:p>
       <w:pPr>
         <w:pStyle w:val="Odstavecseseznamem"/>
         <w:numPr>
-          <w:ilvl w:val="1"/>
+          <w:ilvl w:val="2"/>
           <w:numId w:val="11"/>
         </w:numPr>
         <w:tabs>
@@ -3742,48 +3746,20 @@
           <w:lang w:eastAsia="cs-CZ"/>
         </w:rPr>
       </w:pPr>
-      <w:proofErr w:type="spellStart"/>
-      <w:r>
-        <w:rPr>
-          <w:rFonts w:eastAsia="Times New Roman" w:cs="Times New Roman"/>
-          <w:szCs w:val="24"/>
-          <w:lang w:eastAsia="cs-CZ"/>
-        </w:rPr>
-        <w:t>views</w:t>
-      </w:r>
-      <w:proofErr w:type="spellEnd"/>
-      <w:r>
-        <w:rPr>
-          <w:rFonts w:eastAsia="Times New Roman" w:cs="Times New Roman"/>
-          <w:szCs w:val="24"/>
-          <w:lang w:eastAsia="cs-CZ"/>
-        </w:rPr>
-        <w:t>/</w:t>
-      </w:r>
-      <w:proofErr w:type="spellStart"/>
-      <w:r>
-        <w:rPr>
-          <w:rFonts w:eastAsia="Times New Roman" w:cs="Times New Roman"/>
-          <w:szCs w:val="24"/>
-          <w:lang w:eastAsia="cs-CZ"/>
-        </w:rPr>
-        <w:t>twig</w:t>
-      </w:r>
-      <w:proofErr w:type="spellEnd"/>
-      <w:r>
-        <w:rPr>
-          <w:rFonts w:eastAsia="Times New Roman" w:cs="Times New Roman"/>
-          <w:szCs w:val="24"/>
-          <w:lang w:eastAsia="cs-CZ"/>
-        </w:rPr>
-        <w:t>/</w:t>
+      <w:r>
+        <w:rPr>
+          <w:rFonts w:eastAsia="Times New Roman" w:cs="Times New Roman"/>
+          <w:szCs w:val="24"/>
+          <w:lang w:eastAsia="cs-CZ"/>
+        </w:rPr>
+        <w:t>style.css</w:t>
       </w:r>
     </w:p>
     <w:p>
       <w:pPr>
         <w:pStyle w:val="Odstavecseseznamem"/>
         <w:numPr>
-          <w:ilvl w:val="2"/>
+          <w:ilvl w:val="3"/>
           <w:numId w:val="11"/>
         </w:numPr>
         <w:tabs>
@@ -3811,24 +3787,20 @@
           <w:lang w:eastAsia="cs-CZ"/>
         </w:rPr>
       </w:pPr>
-      <w:proofErr w:type="spellStart"/>
-      <w:proofErr w:type="gramStart"/>
-      <w:r>
-        <w:rPr>
-          <w:rFonts w:eastAsia="Times New Roman" w:cs="Times New Roman"/>
-          <w:szCs w:val="24"/>
-          <w:lang w:eastAsia="cs-CZ"/>
-        </w:rPr>
-        <w:t>articles.twig</w:t>
-      </w:r>
-      <w:proofErr w:type="spellEnd"/>
-      <w:proofErr w:type="gramEnd"/>
+      <w:r>
+        <w:rPr>
+          <w:rFonts w:eastAsia="Times New Roman" w:cs="Times New Roman"/>
+          <w:szCs w:val="24"/>
+          <w:lang w:eastAsia="cs-CZ"/>
+        </w:rPr>
+        <w:t>vlastní styly</w:t>
+      </w:r>
     </w:p>
     <w:p>
       <w:pPr>
         <w:pStyle w:val="Odstavecseseznamem"/>
         <w:numPr>
-          <w:ilvl w:val="2"/>
+          <w:ilvl w:val="1"/>
           <w:numId w:val="11"/>
         </w:numPr>
         <w:tabs>
@@ -3857,17 +3829,41 @@
         </w:rPr>
       </w:pPr>
       <w:proofErr w:type="spellStart"/>
-      <w:proofErr w:type="gramStart"/>
-      <w:r>
-        <w:rPr>
-          <w:rFonts w:eastAsia="Times New Roman" w:cs="Times New Roman"/>
-          <w:szCs w:val="24"/>
-          <w:lang w:eastAsia="cs-CZ"/>
-        </w:rPr>
-        <w:t>base.twig</w:t>
+      <w:r>
+        <w:rPr>
+          <w:rFonts w:eastAsia="Times New Roman" w:cs="Times New Roman"/>
+          <w:szCs w:val="24"/>
+          <w:lang w:eastAsia="cs-CZ"/>
+        </w:rPr>
+        <w:t>views</w:t>
       </w:r>
       <w:proofErr w:type="spellEnd"/>
-      <w:proofErr w:type="gramEnd"/>
+      <w:r>
+        <w:rPr>
+          <w:rFonts w:eastAsia="Times New Roman" w:cs="Times New Roman"/>
+          <w:szCs w:val="24"/>
+          <w:lang w:eastAsia="cs-CZ"/>
+        </w:rPr>
+        <w:t>/</w:t>
+      </w:r>
+      <w:proofErr w:type="spellStart"/>
+      <w:r>
+        <w:rPr>
+          <w:rFonts w:eastAsia="Times New Roman" w:cs="Times New Roman"/>
+          <w:szCs w:val="24"/>
+          <w:lang w:eastAsia="cs-CZ"/>
+        </w:rPr>
+        <w:t>twig</w:t>
+      </w:r>
+      <w:proofErr w:type="spellEnd"/>
+      <w:r>
+        <w:rPr>
+          <w:rFonts w:eastAsia="Times New Roman" w:cs="Times New Roman"/>
+          <w:szCs w:val="24"/>
+          <w:lang w:eastAsia="cs-CZ"/>
+        </w:rPr>
+        <w:t>/</w:t>
+      </w:r>
     </w:p>
     <w:p>
       <w:pPr>
@@ -3909,7 +3905,7 @@
           <w:szCs w:val="24"/>
           <w:lang w:eastAsia="cs-CZ"/>
         </w:rPr>
-        <w:t>home.twig</w:t>
+        <w:t>articles.twig</w:t>
       </w:r>
       <w:proofErr w:type="spellEnd"/>
       <w:proofErr w:type="gramEnd"/>
@@ -3947,15 +3943,17 @@
         </w:rPr>
       </w:pPr>
       <w:proofErr w:type="spellStart"/>
-      <w:r>
-        <w:rPr>
-          <w:rFonts w:eastAsia="Times New Roman" w:cs="Times New Roman"/>
-          <w:szCs w:val="24"/>
-          <w:lang w:eastAsia="cs-CZ"/>
-        </w:rPr>
-        <w:t>loginError.twig</w:t>
+      <w:proofErr w:type="gramStart"/>
+      <w:r>
+        <w:rPr>
+          <w:rFonts w:eastAsia="Times New Roman" w:cs="Times New Roman"/>
+          <w:szCs w:val="24"/>
+          <w:lang w:eastAsia="cs-CZ"/>
+        </w:rPr>
+        <w:t>base.twig</w:t>
       </w:r>
       <w:proofErr w:type="spellEnd"/>
+      <w:proofErr w:type="gramEnd"/>
     </w:p>
     <w:p>
       <w:pPr>
@@ -3996,7 +3994,7 @@
           <w:szCs w:val="24"/>
           <w:lang w:eastAsia="cs-CZ"/>
         </w:rPr>
-        <w:t>managePosts.twig</w:t>
+        <w:t>editPost.twig</w:t>
       </w:r>
       <w:proofErr w:type="spellEnd"/>
     </w:p>
@@ -4033,15 +4031,17 @@
         </w:rPr>
       </w:pPr>
       <w:proofErr w:type="spellStart"/>
-      <w:r>
-        <w:rPr>
-          <w:rFonts w:eastAsia="Times New Roman" w:cs="Times New Roman"/>
-          <w:szCs w:val="24"/>
-          <w:lang w:eastAsia="cs-CZ"/>
-        </w:rPr>
-        <w:t>manageReviews.twig</w:t>
+      <w:proofErr w:type="gramStart"/>
+      <w:r>
+        <w:rPr>
+          <w:rFonts w:eastAsia="Times New Roman" w:cs="Times New Roman"/>
+          <w:szCs w:val="24"/>
+          <w:lang w:eastAsia="cs-CZ"/>
+        </w:rPr>
+        <w:t>home.twig</w:t>
       </w:r>
       <w:proofErr w:type="spellEnd"/>
+      <w:proofErr w:type="gramEnd"/>
     </w:p>
     <w:p>
       <w:pPr>
@@ -4076,17 +4076,15 @@
         </w:rPr>
       </w:pPr>
       <w:proofErr w:type="spellStart"/>
-      <w:proofErr w:type="gramStart"/>
-      <w:r>
-        <w:rPr>
-          <w:rFonts w:eastAsia="Times New Roman" w:cs="Times New Roman"/>
-          <w:szCs w:val="24"/>
-          <w:lang w:eastAsia="cs-CZ"/>
-        </w:rPr>
-        <w:t>program.twig</w:t>
+      <w:r>
+        <w:rPr>
+          <w:rFonts w:eastAsia="Times New Roman" w:cs="Times New Roman"/>
+          <w:szCs w:val="24"/>
+          <w:lang w:eastAsia="cs-CZ"/>
+        </w:rPr>
+        <w:t>loginError.twig</w:t>
       </w:r>
       <w:proofErr w:type="spellEnd"/>
-      <w:proofErr w:type="gramEnd"/>
     </w:p>
     <w:p>
       <w:pPr>
@@ -4121,17 +4119,15 @@
         </w:rPr>
       </w:pPr>
       <w:proofErr w:type="spellStart"/>
-      <w:proofErr w:type="gramStart"/>
-      <w:r>
-        <w:rPr>
-          <w:rFonts w:eastAsia="Times New Roman" w:cs="Times New Roman"/>
-          <w:szCs w:val="24"/>
-          <w:lang w:eastAsia="cs-CZ"/>
-        </w:rPr>
-        <w:t>registration.twig</w:t>
+      <w:r>
+        <w:rPr>
+          <w:rFonts w:eastAsia="Times New Roman" w:cs="Times New Roman"/>
+          <w:szCs w:val="24"/>
+          <w:lang w:eastAsia="cs-CZ"/>
+        </w:rPr>
+        <w:t>managePosts.twig</w:t>
       </w:r>
       <w:proofErr w:type="spellEnd"/>
-      <w:proofErr w:type="gramEnd"/>
     </w:p>
     <w:p>
       <w:pPr>
@@ -4166,17 +4162,15 @@
         </w:rPr>
       </w:pPr>
       <w:proofErr w:type="spellStart"/>
-      <w:proofErr w:type="gramStart"/>
-      <w:r>
-        <w:rPr>
-          <w:rFonts w:eastAsia="Times New Roman" w:cs="Times New Roman"/>
-          <w:szCs w:val="24"/>
-          <w:lang w:eastAsia="cs-CZ"/>
-        </w:rPr>
-        <w:t>review.twig</w:t>
+      <w:r>
+        <w:rPr>
+          <w:rFonts w:eastAsia="Times New Roman" w:cs="Times New Roman"/>
+          <w:szCs w:val="24"/>
+          <w:lang w:eastAsia="cs-CZ"/>
+        </w:rPr>
+        <w:t>manageReviews.twig</w:t>
       </w:r>
       <w:proofErr w:type="spellEnd"/>
-      <w:proofErr w:type="gramEnd"/>
     </w:p>
     <w:p>
       <w:pPr>
@@ -4211,15 +4205,17 @@
         </w:rPr>
       </w:pPr>
       <w:proofErr w:type="spellStart"/>
-      <w:r>
-        <w:rPr>
-          <w:rFonts w:eastAsia="Times New Roman" w:cs="Times New Roman"/>
-          <w:szCs w:val="24"/>
-          <w:lang w:eastAsia="cs-CZ"/>
-        </w:rPr>
-        <w:t>reviewList.twig</w:t>
+      <w:proofErr w:type="gramStart"/>
+      <w:r>
+        <w:rPr>
+          <w:rFonts w:eastAsia="Times New Roman" w:cs="Times New Roman"/>
+          <w:szCs w:val="24"/>
+          <w:lang w:eastAsia="cs-CZ"/>
+        </w:rPr>
+        <w:t>program.twig</w:t>
       </w:r>
       <w:proofErr w:type="spellEnd"/>
+      <w:proofErr w:type="gramEnd"/>
     </w:p>
     <w:p>
       <w:pPr>
@@ -4261,7 +4257,7 @@
           <w:szCs w:val="24"/>
           <w:lang w:eastAsia="cs-CZ"/>
         </w:rPr>
-        <w:t>upload.twig</w:t>
+        <w:t>registration.twig</w:t>
       </w:r>
       <w:proofErr w:type="spellEnd"/>
       <w:proofErr w:type="gramEnd"/>
@@ -4299,21 +4295,23 @@
         </w:rPr>
       </w:pPr>
       <w:proofErr w:type="spellStart"/>
-      <w:r>
-        <w:rPr>
-          <w:rFonts w:eastAsia="Times New Roman" w:cs="Times New Roman"/>
-          <w:szCs w:val="24"/>
-          <w:lang w:eastAsia="cs-CZ"/>
-        </w:rPr>
-        <w:t>userSettings.twig</w:t>
+      <w:proofErr w:type="gramStart"/>
+      <w:r>
+        <w:rPr>
+          <w:rFonts w:eastAsia="Times New Roman" w:cs="Times New Roman"/>
+          <w:szCs w:val="24"/>
+          <w:lang w:eastAsia="cs-CZ"/>
+        </w:rPr>
+        <w:t>review.twig</w:t>
       </w:r>
       <w:proofErr w:type="spellEnd"/>
+      <w:proofErr w:type="gramEnd"/>
     </w:p>
     <w:p>
       <w:pPr>
         <w:pStyle w:val="Odstavecseseznamem"/>
         <w:numPr>
-          <w:ilvl w:val="1"/>
+          <w:ilvl w:val="2"/>
           <w:numId w:val="11"/>
         </w:numPr>
         <w:tabs>
@@ -4348,7 +4346,7 @@
           <w:szCs w:val="24"/>
           <w:lang w:eastAsia="cs-CZ"/>
         </w:rPr>
-        <w:t>MyApplication.php</w:t>
+        <w:t>reviewList.twig</w:t>
       </w:r>
       <w:proofErr w:type="spellEnd"/>
     </w:p>
@@ -4384,40 +4382,18 @@
           <w:lang w:eastAsia="cs-CZ"/>
         </w:rPr>
       </w:pPr>
-      <w:r>
-        <w:rPr>
-          <w:rFonts w:eastAsia="Times New Roman" w:cs="Times New Roman"/>
-          <w:szCs w:val="24"/>
-          <w:lang w:eastAsia="cs-CZ"/>
-        </w:rPr>
-        <w:t>R</w:t>
-      </w:r>
-      <w:r>
-        <w:rPr>
-          <w:rFonts w:eastAsia="Times New Roman" w:cs="Times New Roman"/>
-          <w:szCs w:val="24"/>
-          <w:lang w:eastAsia="cs-CZ"/>
-        </w:rPr>
-        <w:t xml:space="preserve">ozhoduje, který </w:t>
-      </w:r>
       <w:proofErr w:type="spellStart"/>
-      <w:r>
-        <w:rPr>
-          <w:rFonts w:eastAsia="Times New Roman" w:cs="Times New Roman"/>
-          <w:szCs w:val="24"/>
-          <w:lang w:eastAsia="cs-CZ"/>
-        </w:rPr>
-        <w:t>controller</w:t>
+      <w:proofErr w:type="gramStart"/>
+      <w:r>
+        <w:rPr>
+          <w:rFonts w:eastAsia="Times New Roman" w:cs="Times New Roman"/>
+          <w:szCs w:val="24"/>
+          <w:lang w:eastAsia="cs-CZ"/>
+        </w:rPr>
+        <w:t>upload.twig</w:t>
       </w:r>
       <w:proofErr w:type="spellEnd"/>
-      <w:r>
-        <w:rPr>
-          <w:rFonts w:eastAsia="Times New Roman" w:cs="Times New Roman"/>
-          <w:szCs w:val="24"/>
-          <w:lang w:eastAsia="cs-CZ"/>
-        </w:rPr>
-        <w:t xml:space="preserve"> se má spustit</w:t>
-      </w:r>
+      <w:proofErr w:type="gramEnd"/>
     </w:p>
     <w:p>
       <w:pPr>
@@ -4451,14 +4427,6 @@
           <w:lang w:eastAsia="cs-CZ"/>
         </w:rPr>
       </w:pPr>
-      <w:r>
-        <w:rPr>
-          <w:rFonts w:eastAsia="Times New Roman" w:cs="Times New Roman"/>
-          <w:szCs w:val="24"/>
-          <w:lang w:eastAsia="cs-CZ"/>
-        </w:rPr>
-        <w:t xml:space="preserve">Správce </w:t>
-      </w:r>
       <w:proofErr w:type="spellStart"/>
       <w:r>
         <w:rPr>
@@ -4466,23 +4434,15 @@
           <w:szCs w:val="24"/>
           <w:lang w:eastAsia="cs-CZ"/>
         </w:rPr>
-        <w:t>Twig</w:t>
+        <w:t>userSettings.twig</w:t>
       </w:r>
       <w:proofErr w:type="spellEnd"/>
-      <w:r>
-        <w:rPr>
-          <w:rFonts w:eastAsia="Times New Roman" w:cs="Times New Roman"/>
-          <w:szCs w:val="24"/>
-          <w:lang w:eastAsia="cs-CZ"/>
-        </w:rPr>
-        <w:t xml:space="preserve"> šablon</w:t>
-      </w:r>
     </w:p>
     <w:p>
       <w:pPr>
         <w:pStyle w:val="Odstavecseseznamem"/>
         <w:numPr>
-          <w:ilvl w:val="2"/>
+          <w:ilvl w:val="1"/>
           <w:numId w:val="11"/>
         </w:numPr>
         <w:tabs>
@@ -4510,30 +4470,22 @@
           <w:lang w:eastAsia="cs-CZ"/>
         </w:rPr>
       </w:pPr>
-      <w:proofErr w:type="gramStart"/>
-      <w:r>
-        <w:rPr>
-          <w:rFonts w:eastAsia="Times New Roman" w:cs="Times New Roman"/>
-          <w:szCs w:val="24"/>
-          <w:lang w:eastAsia="cs-CZ"/>
-        </w:rPr>
-        <w:t>Zajišťuje</w:t>
-      </w:r>
-      <w:proofErr w:type="gramEnd"/>
-      <w:r>
-        <w:rPr>
-          <w:rFonts w:eastAsia="Times New Roman" w:cs="Times New Roman"/>
-          <w:szCs w:val="24"/>
-          <w:lang w:eastAsia="cs-CZ"/>
-        </w:rPr>
-        <w:t xml:space="preserve"> že se spustí jen povolené stránky</w:t>
-      </w:r>
+      <w:proofErr w:type="spellStart"/>
+      <w:r>
+        <w:rPr>
+          <w:rFonts w:eastAsia="Times New Roman" w:cs="Times New Roman"/>
+          <w:szCs w:val="24"/>
+          <w:lang w:eastAsia="cs-CZ"/>
+        </w:rPr>
+        <w:t>MyApplication.php</w:t>
+      </w:r>
+      <w:proofErr w:type="spellEnd"/>
     </w:p>
     <w:p>
       <w:pPr>
         <w:pStyle w:val="Odstavecseseznamem"/>
         <w:numPr>
-          <w:ilvl w:val="0"/>
+          <w:ilvl w:val="2"/>
           <w:numId w:val="11"/>
         </w:numPr>
         <w:tabs>
@@ -4561,6 +4513,22 @@
           <w:lang w:eastAsia="cs-CZ"/>
         </w:rPr>
       </w:pPr>
+      <w:r>
+        <w:rPr>
+          <w:rFonts w:eastAsia="Times New Roman" w:cs="Times New Roman"/>
+          <w:szCs w:val="24"/>
+          <w:lang w:eastAsia="cs-CZ"/>
+        </w:rPr>
+        <w:t>R</w:t>
+      </w:r>
+      <w:r>
+        <w:rPr>
+          <w:rFonts w:eastAsia="Times New Roman" w:cs="Times New Roman"/>
+          <w:szCs w:val="24"/>
+          <w:lang w:eastAsia="cs-CZ"/>
+        </w:rPr>
+        <w:t xml:space="preserve">ozhoduje, který </w:t>
+      </w:r>
       <w:proofErr w:type="spellStart"/>
       <w:r>
         <w:rPr>
@@ -4568,7 +4536,7 @@
           <w:szCs w:val="24"/>
           <w:lang w:eastAsia="cs-CZ"/>
         </w:rPr>
-        <w:t>uploads</w:t>
+        <w:t>controller</w:t>
       </w:r>
       <w:proofErr w:type="spellEnd"/>
       <w:r>
@@ -4577,14 +4545,14 @@
           <w:szCs w:val="24"/>
           <w:lang w:eastAsia="cs-CZ"/>
         </w:rPr>
-        <w:t>/</w:t>
+        <w:t xml:space="preserve"> se má spustit</w:t>
       </w:r>
     </w:p>
     <w:p>
       <w:pPr>
         <w:pStyle w:val="Odstavecseseznamem"/>
         <w:numPr>
-          <w:ilvl w:val="1"/>
+          <w:ilvl w:val="2"/>
           <w:numId w:val="11"/>
         </w:numPr>
         <w:tabs>
@@ -4618,14 +4586,32 @@
           <w:szCs w:val="24"/>
           <w:lang w:eastAsia="cs-CZ"/>
         </w:rPr>
-        <w:t>nahrané články</w:t>
+        <w:t xml:space="preserve">Správce </w:t>
+      </w:r>
+      <w:proofErr w:type="spellStart"/>
+      <w:r>
+        <w:rPr>
+          <w:rFonts w:eastAsia="Times New Roman" w:cs="Times New Roman"/>
+          <w:szCs w:val="24"/>
+          <w:lang w:eastAsia="cs-CZ"/>
+        </w:rPr>
+        <w:t>Twig</w:t>
+      </w:r>
+      <w:proofErr w:type="spellEnd"/>
+      <w:r>
+        <w:rPr>
+          <w:rFonts w:eastAsia="Times New Roman" w:cs="Times New Roman"/>
+          <w:szCs w:val="24"/>
+          <w:lang w:eastAsia="cs-CZ"/>
+        </w:rPr>
+        <w:t xml:space="preserve"> šablon</w:t>
       </w:r>
     </w:p>
     <w:p>
       <w:pPr>
         <w:pStyle w:val="Odstavecseseznamem"/>
         <w:numPr>
-          <w:ilvl w:val="0"/>
+          <w:ilvl w:val="2"/>
           <w:numId w:val="11"/>
         </w:numPr>
         <w:tabs>
@@ -4653,30 +4639,28 @@
           <w:lang w:eastAsia="cs-CZ"/>
         </w:rPr>
       </w:pPr>
-      <w:proofErr w:type="spellStart"/>
-      <w:r>
-        <w:rPr>
-          <w:rFonts w:eastAsia="Times New Roman" w:cs="Times New Roman"/>
-          <w:szCs w:val="24"/>
-          <w:lang w:eastAsia="cs-CZ"/>
-        </w:rPr>
-        <w:t>img</w:t>
-      </w:r>
-      <w:proofErr w:type="spellEnd"/>
-      <w:r>
-        <w:rPr>
-          <w:rFonts w:eastAsia="Times New Roman" w:cs="Times New Roman"/>
-          <w:szCs w:val="24"/>
-          <w:lang w:eastAsia="cs-CZ"/>
-        </w:rPr>
-        <w:t xml:space="preserve">/                    </w:t>
+      <w:r>
+        <w:rPr>
+          <w:rFonts w:eastAsia="Times New Roman" w:cs="Times New Roman"/>
+          <w:szCs w:val="24"/>
+          <w:lang w:eastAsia="cs-CZ"/>
+        </w:rPr>
+        <w:t>Zajišťuje,</w:t>
+      </w:r>
+      <w:r>
+        <w:rPr>
+          <w:rFonts w:eastAsia="Times New Roman" w:cs="Times New Roman"/>
+          <w:szCs w:val="24"/>
+          <w:lang w:eastAsia="cs-CZ"/>
+        </w:rPr>
+        <w:t xml:space="preserve"> že se spustí jen povolené stránky</w:t>
       </w:r>
     </w:p>
     <w:p>
       <w:pPr>
         <w:pStyle w:val="Odstavecseseznamem"/>
         <w:numPr>
-          <w:ilvl w:val="1"/>
+          <w:ilvl w:val="0"/>
           <w:numId w:val="11"/>
         </w:numPr>
         <w:tabs>
@@ -4704,6 +4688,149 @@
           <w:lang w:eastAsia="cs-CZ"/>
         </w:rPr>
       </w:pPr>
+      <w:proofErr w:type="spellStart"/>
+      <w:r>
+        <w:rPr>
+          <w:rFonts w:eastAsia="Times New Roman" w:cs="Times New Roman"/>
+          <w:szCs w:val="24"/>
+          <w:lang w:eastAsia="cs-CZ"/>
+        </w:rPr>
+        <w:t>uploads</w:t>
+      </w:r>
+      <w:proofErr w:type="spellEnd"/>
+      <w:r>
+        <w:rPr>
+          <w:rFonts w:eastAsia="Times New Roman" w:cs="Times New Roman"/>
+          <w:szCs w:val="24"/>
+          <w:lang w:eastAsia="cs-CZ"/>
+        </w:rPr>
+        <w:t>/</w:t>
+      </w:r>
+    </w:p>
+    <w:p>
+      <w:pPr>
+        <w:pStyle w:val="Odstavecseseznamem"/>
+        <w:numPr>
+          <w:ilvl w:val="1"/>
+          <w:numId w:val="11"/>
+        </w:numPr>
+        <w:tabs>
+          <w:tab w:val="left" w:pos="916"/>
+          <w:tab w:val="left" w:pos="1832"/>
+          <w:tab w:val="left" w:pos="2748"/>
+          <w:tab w:val="left" w:pos="3664"/>
+          <w:tab w:val="left" w:pos="4580"/>
+          <w:tab w:val="left" w:pos="5496"/>
+          <w:tab w:val="left" w:pos="6412"/>
+          <w:tab w:val="left" w:pos="7328"/>
+          <w:tab w:val="left" w:pos="8244"/>
+          <w:tab w:val="left" w:pos="9160"/>
+          <w:tab w:val="left" w:pos="10076"/>
+          <w:tab w:val="left" w:pos="10992"/>
+          <w:tab w:val="left" w:pos="11908"/>
+          <w:tab w:val="left" w:pos="12824"/>
+          <w:tab w:val="left" w:pos="13740"/>
+          <w:tab w:val="left" w:pos="14656"/>
+        </w:tabs>
+        <w:spacing w:after="0" w:line="240" w:lineRule="auto"/>
+        <w:rPr>
+          <w:rFonts w:eastAsia="Times New Roman" w:cs="Times New Roman"/>
+          <w:szCs w:val="24"/>
+          <w:lang w:eastAsia="cs-CZ"/>
+        </w:rPr>
+      </w:pPr>
+      <w:r>
+        <w:rPr>
+          <w:rFonts w:eastAsia="Times New Roman" w:cs="Times New Roman"/>
+          <w:szCs w:val="24"/>
+          <w:lang w:eastAsia="cs-CZ"/>
+        </w:rPr>
+        <w:t>nahrané články</w:t>
+      </w:r>
+    </w:p>
+    <w:p>
+      <w:pPr>
+        <w:pStyle w:val="Odstavecseseznamem"/>
+        <w:numPr>
+          <w:ilvl w:val="0"/>
+          <w:numId w:val="11"/>
+        </w:numPr>
+        <w:tabs>
+          <w:tab w:val="left" w:pos="916"/>
+          <w:tab w:val="left" w:pos="1832"/>
+          <w:tab w:val="left" w:pos="2748"/>
+          <w:tab w:val="left" w:pos="3664"/>
+          <w:tab w:val="left" w:pos="4580"/>
+          <w:tab w:val="left" w:pos="5496"/>
+          <w:tab w:val="left" w:pos="6412"/>
+          <w:tab w:val="left" w:pos="7328"/>
+          <w:tab w:val="left" w:pos="8244"/>
+          <w:tab w:val="left" w:pos="9160"/>
+          <w:tab w:val="left" w:pos="10076"/>
+          <w:tab w:val="left" w:pos="10992"/>
+          <w:tab w:val="left" w:pos="11908"/>
+          <w:tab w:val="left" w:pos="12824"/>
+          <w:tab w:val="left" w:pos="13740"/>
+          <w:tab w:val="left" w:pos="14656"/>
+        </w:tabs>
+        <w:spacing w:after="0" w:line="240" w:lineRule="auto"/>
+        <w:rPr>
+          <w:rFonts w:eastAsia="Times New Roman" w:cs="Times New Roman"/>
+          <w:szCs w:val="24"/>
+          <w:lang w:eastAsia="cs-CZ"/>
+        </w:rPr>
+      </w:pPr>
+      <w:proofErr w:type="spellStart"/>
+      <w:r>
+        <w:rPr>
+          <w:rFonts w:eastAsia="Times New Roman" w:cs="Times New Roman"/>
+          <w:szCs w:val="24"/>
+          <w:lang w:eastAsia="cs-CZ"/>
+        </w:rPr>
+        <w:t>img</w:t>
+      </w:r>
+      <w:proofErr w:type="spellEnd"/>
+      <w:r>
+        <w:rPr>
+          <w:rFonts w:eastAsia="Times New Roman" w:cs="Times New Roman"/>
+          <w:szCs w:val="24"/>
+          <w:lang w:eastAsia="cs-CZ"/>
+        </w:rPr>
+        <w:t xml:space="preserve">/                    </w:t>
+      </w:r>
+    </w:p>
+    <w:p>
+      <w:pPr>
+        <w:pStyle w:val="Odstavecseseznamem"/>
+        <w:numPr>
+          <w:ilvl w:val="1"/>
+          <w:numId w:val="11"/>
+        </w:numPr>
+        <w:tabs>
+          <w:tab w:val="left" w:pos="916"/>
+          <w:tab w:val="left" w:pos="1832"/>
+          <w:tab w:val="left" w:pos="2748"/>
+          <w:tab w:val="left" w:pos="3664"/>
+          <w:tab w:val="left" w:pos="4580"/>
+          <w:tab w:val="left" w:pos="5496"/>
+          <w:tab w:val="left" w:pos="6412"/>
+          <w:tab w:val="left" w:pos="7328"/>
+          <w:tab w:val="left" w:pos="8244"/>
+          <w:tab w:val="left" w:pos="9160"/>
+          <w:tab w:val="left" w:pos="10076"/>
+          <w:tab w:val="left" w:pos="10992"/>
+          <w:tab w:val="left" w:pos="11908"/>
+          <w:tab w:val="left" w:pos="12824"/>
+          <w:tab w:val="left" w:pos="13740"/>
+          <w:tab w:val="left" w:pos="14656"/>
+        </w:tabs>
+        <w:spacing w:after="0" w:line="240" w:lineRule="auto"/>
+        <w:rPr>
+          <w:rFonts w:eastAsia="Times New Roman" w:cs="Times New Roman"/>
+          <w:szCs w:val="24"/>
+          <w:lang w:eastAsia="cs-CZ"/>
+        </w:rPr>
+      </w:pPr>
       <w:r>
         <w:rPr>
           <w:rFonts w:eastAsia="Times New Roman" w:cs="Times New Roman"/>
@@ -4804,6 +4931,7 @@
           <w:szCs w:val="24"/>
           <w:lang w:eastAsia="cs-CZ"/>
         </w:rPr>
+        <w:lastRenderedPageBreak/>
         <w:t>R</w:t>
       </w:r>
       <w:r>
@@ -4864,7 +4992,6 @@
           <w:szCs w:val="24"/>
           <w:lang w:eastAsia="cs-CZ"/>
         </w:rPr>
-        <w:lastRenderedPageBreak/>
         <w:t>U</w:t>
       </w:r>
       <w:r>
@@ -6418,38 +6545,6 @@
     </w:tbl>
     <w:p>
       <w:pPr>
-        <w:rPr>
-          <w:rFonts w:eastAsia="Times New Roman" w:cs="Times New Roman"/>
-          <w:i/>
-          <w:iCs/>
-          <w:szCs w:val="24"/>
-          <w:lang w:eastAsia="cs-CZ"/>
-        </w:rPr>
-      </w:pPr>
-    </w:p>
-    <w:p>
-      <w:pPr>
-        <w:rPr>
-          <w:rFonts w:eastAsia="Times New Roman" w:cs="Times New Roman"/>
-          <w:i/>
-          <w:iCs/>
-          <w:szCs w:val="24"/>
-          <w:lang w:eastAsia="cs-CZ"/>
-        </w:rPr>
-      </w:pPr>
-      <w:r>
-        <w:rPr>
-          <w:rFonts w:eastAsia="Times New Roman" w:cs="Times New Roman"/>
-          <w:i/>
-          <w:iCs/>
-          <w:szCs w:val="24"/>
-          <w:lang w:eastAsia="cs-CZ"/>
-        </w:rPr>
-        <w:br w:type="page"/>
-      </w:r>
-    </w:p>
-    <w:p>
-      <w:pPr>
         <w:spacing w:before="100" w:beforeAutospacing="1" w:after="100" w:afterAutospacing="1" w:line="240" w:lineRule="auto"/>
         <w:outlineLvl w:val="0"/>
         <w:rPr>
@@ -6994,7 +7089,15 @@
                 <w:szCs w:val="24"/>
                 <w:lang w:eastAsia="cs-CZ"/>
               </w:rPr>
-              <w:t>Může psát i upravovat recenze, v případě upravení podléhá znovu schválení</w:t>
+              <w:t xml:space="preserve">Může psát i upravovat </w:t>
+            </w:r>
+            <w:r>
+              <w:rPr>
+                <w:rFonts w:eastAsia="Times New Roman" w:cs="Times New Roman"/>
+                <w:szCs w:val="24"/>
+                <w:lang w:eastAsia="cs-CZ"/>
+              </w:rPr>
+              <w:t>recenze, dokud nebyly schválené či zamítnuté</w:t>
             </w:r>
           </w:p>
         </w:tc>
@@ -7072,6 +7175,14 @@
               </w:rPr>
               <w:t xml:space="preserve">Může nahrávat </w:t>
             </w:r>
+            <w:r>
+              <w:rPr>
+                <w:rFonts w:eastAsia="Times New Roman" w:cs="Times New Roman"/>
+                <w:szCs w:val="24"/>
+                <w:lang w:eastAsia="cs-CZ"/>
+              </w:rPr>
+              <w:t>články s </w:t>
+            </w:r>
             <w:proofErr w:type="spellStart"/>
             <w:r>
               <w:rPr>
@@ -7082,6 +7193,14 @@
               <w:t>pdf</w:t>
             </w:r>
             <w:proofErr w:type="spellEnd"/>
+            <w:r>
+              <w:rPr>
+                <w:rFonts w:eastAsia="Times New Roman" w:cs="Times New Roman"/>
+                <w:szCs w:val="24"/>
+                <w:lang w:eastAsia="cs-CZ"/>
+              </w:rPr>
+              <w:t xml:space="preserve"> a upravovat je do schválení či zamítnutí</w:t>
+            </w:r>
           </w:p>
         </w:tc>
       </w:tr>
@@ -7302,7 +7421,6 @@
         <w:t>Logika databáze</w:t>
       </w:r>
     </w:p>
-    <w:p/>
     <w:sectPr>
       <w:pgSz w:w="11906" w:h="16838"/>
       <w:pgMar w:top="1417" w:right="1417" w:bottom="1417" w:left="1417" w:header="708" w:footer="708" w:gutter="0"/>

</xml_diff>

<commit_message>
Jde i mazání recenzí
</commit_message>
<xml_diff>
--- a/doc/dokumentace.DOCX
+++ b/doc/dokumentace.DOCX
@@ -63,7 +63,24 @@
           <w:lang w:eastAsia="cs-CZ"/>
         </w:rPr>
         <w:br/>
-        <w:t xml:space="preserve">Email: </w:t>
+      </w:r>
+      <w:r>
+        <w:rPr>
+          <w:rFonts w:eastAsia="Times New Roman" w:cs="Times New Roman"/>
+          <w:b/>
+          <w:bCs/>
+          <w:szCs w:val="24"/>
+          <w:lang w:eastAsia="cs-CZ"/>
+        </w:rPr>
+        <w:t>Email:</w:t>
+      </w:r>
+      <w:r>
+        <w:rPr>
+          <w:rFonts w:eastAsia="Times New Roman" w:cs="Times New Roman"/>
+          <w:szCs w:val="24"/>
+          <w:lang w:eastAsia="cs-CZ"/>
+        </w:rPr>
+        <w:t xml:space="preserve"> </w:t>
       </w:r>
       <w:r>
         <w:rPr>
@@ -2685,7 +2702,47 @@
           <w:szCs w:val="24"/>
           <w:lang w:eastAsia="cs-CZ"/>
         </w:rPr>
-        <w:t>EditPostController.php</w:t>
+        <w:t>DeletePostController.php</w:t>
+      </w:r>
+      <w:proofErr w:type="spellEnd"/>
+    </w:p>
+    <w:p>
+      <w:pPr>
+        <w:pStyle w:val="Odstavecseseznamem"/>
+        <w:numPr>
+          <w:ilvl w:val="2"/>
+          <w:numId w:val="11"/>
+        </w:numPr>
+        <w:rPr>
+          <w:rFonts w:eastAsia="Times New Roman" w:cs="Times New Roman"/>
+          <w:szCs w:val="24"/>
+          <w:lang w:eastAsia="cs-CZ"/>
+        </w:rPr>
+      </w:pPr>
+      <w:proofErr w:type="spellStart"/>
+      <w:r>
+        <w:rPr>
+          <w:rFonts w:eastAsia="Times New Roman" w:cs="Times New Roman"/>
+          <w:szCs w:val="24"/>
+          <w:lang w:eastAsia="cs-CZ"/>
+        </w:rPr>
+        <w:t>Delete</w:t>
+      </w:r>
+      <w:r>
+        <w:rPr>
+          <w:rFonts w:eastAsia="Times New Roman" w:cs="Times New Roman"/>
+          <w:szCs w:val="24"/>
+          <w:lang w:eastAsia="cs-CZ"/>
+        </w:rPr>
+        <w:t>Review</w:t>
+      </w:r>
+      <w:r>
+        <w:rPr>
+          <w:rFonts w:eastAsia="Times New Roman" w:cs="Times New Roman"/>
+          <w:szCs w:val="24"/>
+          <w:lang w:eastAsia="cs-CZ"/>
+        </w:rPr>
+        <w:t>Controller.php</w:t>
       </w:r>
       <w:proofErr w:type="spellEnd"/>
     </w:p>
@@ -2728,7 +2785,7 @@
           <w:szCs w:val="24"/>
           <w:lang w:eastAsia="cs-CZ"/>
         </w:rPr>
-        <w:t>HomeController.php</w:t>
+        <w:t>EditPostController.php</w:t>
       </w:r>
       <w:proofErr w:type="spellEnd"/>
     </w:p>
@@ -2771,7 +2828,7 @@
           <w:szCs w:val="24"/>
           <w:lang w:eastAsia="cs-CZ"/>
         </w:rPr>
-        <w:t>LoginErrorController.php</w:t>
+        <w:t>HomeController.php</w:t>
       </w:r>
       <w:proofErr w:type="spellEnd"/>
     </w:p>
@@ -2814,7 +2871,7 @@
           <w:szCs w:val="24"/>
           <w:lang w:eastAsia="cs-CZ"/>
         </w:rPr>
-        <w:t>LogoutController.php</w:t>
+        <w:t>LoginErrorController.php</w:t>
       </w:r>
       <w:proofErr w:type="spellEnd"/>
     </w:p>
@@ -2857,7 +2914,8 @@
           <w:szCs w:val="24"/>
           <w:lang w:eastAsia="cs-CZ"/>
         </w:rPr>
-        <w:t>ManagePostsController.php</w:t>
+        <w:lastRenderedPageBreak/>
+        <w:t>LogoutController.php</w:t>
       </w:r>
       <w:proofErr w:type="spellEnd"/>
     </w:p>
@@ -2900,8 +2958,7 @@
           <w:szCs w:val="24"/>
           <w:lang w:eastAsia="cs-CZ"/>
         </w:rPr>
-        <w:lastRenderedPageBreak/>
-        <w:t>ManageReviewsController.php</w:t>
+        <w:t>ManagePostsController.php</w:t>
       </w:r>
       <w:proofErr w:type="spellEnd"/>
     </w:p>
@@ -2944,7 +3001,7 @@
           <w:szCs w:val="24"/>
           <w:lang w:eastAsia="cs-CZ"/>
         </w:rPr>
-        <w:t>MyPostController.php</w:t>
+        <w:t>ManageReviewsController.php</w:t>
       </w:r>
       <w:proofErr w:type="spellEnd"/>
     </w:p>
@@ -2987,7 +3044,7 @@
           <w:szCs w:val="24"/>
           <w:lang w:eastAsia="cs-CZ"/>
         </w:rPr>
-        <w:t>ProgramController.php</w:t>
+        <w:t>MyPostController.php</w:t>
       </w:r>
       <w:proofErr w:type="spellEnd"/>
     </w:p>
@@ -3030,7 +3087,7 @@
           <w:szCs w:val="24"/>
           <w:lang w:eastAsia="cs-CZ"/>
         </w:rPr>
-        <w:t>RegistrationController.php</w:t>
+        <w:t>ProgramController.php</w:t>
       </w:r>
       <w:proofErr w:type="spellEnd"/>
     </w:p>
@@ -3073,7 +3130,7 @@
           <w:szCs w:val="24"/>
           <w:lang w:eastAsia="cs-CZ"/>
         </w:rPr>
-        <w:t>ReviewController.php</w:t>
+        <w:t>RegistrationController.php</w:t>
       </w:r>
       <w:proofErr w:type="spellEnd"/>
     </w:p>
@@ -3116,7 +3173,7 @@
           <w:szCs w:val="24"/>
           <w:lang w:eastAsia="cs-CZ"/>
         </w:rPr>
-        <w:t>UploadController.php</w:t>
+        <w:t>ReviewController.php</w:t>
       </w:r>
       <w:proofErr w:type="spellEnd"/>
     </w:p>
@@ -3159,7 +3216,7 @@
           <w:szCs w:val="24"/>
           <w:lang w:eastAsia="cs-CZ"/>
         </w:rPr>
-        <w:t>UserSettingsController.php</w:t>
+        <w:t>UploadController.php</w:t>
       </w:r>
       <w:proofErr w:type="spellEnd"/>
     </w:p>
@@ -3167,7 +3224,7 @@
       <w:pPr>
         <w:pStyle w:val="Odstavecseseznamem"/>
         <w:numPr>
-          <w:ilvl w:val="1"/>
+          <w:ilvl w:val="2"/>
           <w:numId w:val="11"/>
         </w:numPr>
         <w:tabs>
@@ -3202,23 +3259,15 @@
           <w:szCs w:val="24"/>
           <w:lang w:eastAsia="cs-CZ"/>
         </w:rPr>
-        <w:t>models</w:t>
+        <w:t>UserSettingsController.php</w:t>
       </w:r>
       <w:proofErr w:type="spellEnd"/>
-      <w:r>
-        <w:rPr>
-          <w:rFonts w:eastAsia="Times New Roman" w:cs="Times New Roman"/>
-          <w:szCs w:val="24"/>
-          <w:lang w:eastAsia="cs-CZ"/>
-        </w:rPr>
-        <w:t>/</w:t>
-      </w:r>
     </w:p>
     <w:p>
       <w:pPr>
         <w:pStyle w:val="Odstavecseseznamem"/>
         <w:numPr>
-          <w:ilvl w:val="2"/>
+          <w:ilvl w:val="1"/>
           <w:numId w:val="11"/>
         </w:numPr>
         <w:tabs>
@@ -3253,15 +3302,23 @@
           <w:szCs w:val="24"/>
           <w:lang w:eastAsia="cs-CZ"/>
         </w:rPr>
-        <w:t>Database.php</w:t>
+        <w:t>models</w:t>
       </w:r>
       <w:proofErr w:type="spellEnd"/>
+      <w:r>
+        <w:rPr>
+          <w:rFonts w:eastAsia="Times New Roman" w:cs="Times New Roman"/>
+          <w:szCs w:val="24"/>
+          <w:lang w:eastAsia="cs-CZ"/>
+        </w:rPr>
+        <w:t>/</w:t>
+      </w:r>
     </w:p>
     <w:p>
       <w:pPr>
         <w:pStyle w:val="Odstavecseseznamem"/>
         <w:numPr>
-          <w:ilvl w:val="3"/>
+          <w:ilvl w:val="2"/>
           <w:numId w:val="11"/>
         </w:numPr>
         <w:tabs>
@@ -3289,20 +3346,22 @@
           <w:lang w:eastAsia="cs-CZ"/>
         </w:rPr>
       </w:pPr>
-      <w:r>
-        <w:rPr>
-          <w:rFonts w:eastAsia="Times New Roman" w:cs="Times New Roman"/>
-          <w:szCs w:val="24"/>
-          <w:lang w:eastAsia="cs-CZ"/>
-        </w:rPr>
-        <w:t>Zajišťuje připojení k databázi</w:t>
-      </w:r>
+      <w:proofErr w:type="spellStart"/>
+      <w:r>
+        <w:rPr>
+          <w:rFonts w:eastAsia="Times New Roman" w:cs="Times New Roman"/>
+          <w:szCs w:val="24"/>
+          <w:lang w:eastAsia="cs-CZ"/>
+        </w:rPr>
+        <w:t>Database.php</w:t>
+      </w:r>
+      <w:proofErr w:type="spellEnd"/>
     </w:p>
     <w:p>
       <w:pPr>
         <w:pStyle w:val="Odstavecseseznamem"/>
         <w:numPr>
-          <w:ilvl w:val="2"/>
+          <w:ilvl w:val="3"/>
           <w:numId w:val="11"/>
         </w:numPr>
         <w:tabs>
@@ -3330,22 +3389,20 @@
           <w:lang w:eastAsia="cs-CZ"/>
         </w:rPr>
       </w:pPr>
-      <w:proofErr w:type="spellStart"/>
-      <w:r>
-        <w:rPr>
-          <w:rFonts w:eastAsia="Times New Roman" w:cs="Times New Roman"/>
-          <w:szCs w:val="24"/>
-          <w:lang w:eastAsia="cs-CZ"/>
-        </w:rPr>
-        <w:t>PostModel.php</w:t>
-      </w:r>
-      <w:proofErr w:type="spellEnd"/>
+      <w:r>
+        <w:rPr>
+          <w:rFonts w:eastAsia="Times New Roman" w:cs="Times New Roman"/>
+          <w:szCs w:val="24"/>
+          <w:lang w:eastAsia="cs-CZ"/>
+        </w:rPr>
+        <w:t>Zajišťuje připojení k databázi</w:t>
+      </w:r>
     </w:p>
     <w:p>
       <w:pPr>
         <w:pStyle w:val="Odstavecseseznamem"/>
         <w:numPr>
-          <w:ilvl w:val="3"/>
+          <w:ilvl w:val="2"/>
           <w:numId w:val="11"/>
         </w:numPr>
         <w:tabs>
@@ -3373,20 +3430,22 @@
           <w:lang w:eastAsia="cs-CZ"/>
         </w:rPr>
       </w:pPr>
-      <w:r>
-        <w:rPr>
-          <w:rFonts w:eastAsia="Times New Roman" w:cs="Times New Roman"/>
-          <w:szCs w:val="24"/>
-          <w:lang w:eastAsia="cs-CZ"/>
-        </w:rPr>
-        <w:t>Stará se o články</w:t>
-      </w:r>
+      <w:proofErr w:type="spellStart"/>
+      <w:r>
+        <w:rPr>
+          <w:rFonts w:eastAsia="Times New Roman" w:cs="Times New Roman"/>
+          <w:szCs w:val="24"/>
+          <w:lang w:eastAsia="cs-CZ"/>
+        </w:rPr>
+        <w:t>PostModel.php</w:t>
+      </w:r>
+      <w:proofErr w:type="spellEnd"/>
     </w:p>
     <w:p>
       <w:pPr>
         <w:pStyle w:val="Odstavecseseznamem"/>
         <w:numPr>
-          <w:ilvl w:val="2"/>
+          <w:ilvl w:val="3"/>
           <w:numId w:val="11"/>
         </w:numPr>
         <w:tabs>
@@ -3414,22 +3473,20 @@
           <w:lang w:eastAsia="cs-CZ"/>
         </w:rPr>
       </w:pPr>
-      <w:proofErr w:type="spellStart"/>
-      <w:r>
-        <w:rPr>
-          <w:rFonts w:eastAsia="Times New Roman" w:cs="Times New Roman"/>
-          <w:szCs w:val="24"/>
-          <w:lang w:eastAsia="cs-CZ"/>
-        </w:rPr>
-        <w:t>ReviewModel.php</w:t>
-      </w:r>
-      <w:proofErr w:type="spellEnd"/>
+      <w:r>
+        <w:rPr>
+          <w:rFonts w:eastAsia="Times New Roman" w:cs="Times New Roman"/>
+          <w:szCs w:val="24"/>
+          <w:lang w:eastAsia="cs-CZ"/>
+        </w:rPr>
+        <w:t>Stará se o články</w:t>
+      </w:r>
     </w:p>
     <w:p>
       <w:pPr>
         <w:pStyle w:val="Odstavecseseznamem"/>
         <w:numPr>
-          <w:ilvl w:val="3"/>
+          <w:ilvl w:val="2"/>
           <w:numId w:val="11"/>
         </w:numPr>
         <w:tabs>
@@ -3457,20 +3514,22 @@
           <w:lang w:eastAsia="cs-CZ"/>
         </w:rPr>
       </w:pPr>
-      <w:r>
-        <w:rPr>
-          <w:rFonts w:eastAsia="Times New Roman" w:cs="Times New Roman"/>
-          <w:szCs w:val="24"/>
-          <w:lang w:eastAsia="cs-CZ"/>
-        </w:rPr>
-        <w:t>Stará se o recenze</w:t>
-      </w:r>
+      <w:proofErr w:type="spellStart"/>
+      <w:r>
+        <w:rPr>
+          <w:rFonts w:eastAsia="Times New Roman" w:cs="Times New Roman"/>
+          <w:szCs w:val="24"/>
+          <w:lang w:eastAsia="cs-CZ"/>
+        </w:rPr>
+        <w:t>ReviewModel.php</w:t>
+      </w:r>
+      <w:proofErr w:type="spellEnd"/>
     </w:p>
     <w:p>
       <w:pPr>
         <w:pStyle w:val="Odstavecseseznamem"/>
         <w:numPr>
-          <w:ilvl w:val="2"/>
+          <w:ilvl w:val="3"/>
           <w:numId w:val="11"/>
         </w:numPr>
         <w:tabs>
@@ -3498,22 +3557,20 @@
           <w:lang w:eastAsia="cs-CZ"/>
         </w:rPr>
       </w:pPr>
-      <w:proofErr w:type="spellStart"/>
-      <w:r>
-        <w:rPr>
-          <w:rFonts w:eastAsia="Times New Roman" w:cs="Times New Roman"/>
-          <w:szCs w:val="24"/>
-          <w:lang w:eastAsia="cs-CZ"/>
-        </w:rPr>
-        <w:t>UserModel.php</w:t>
-      </w:r>
-      <w:proofErr w:type="spellEnd"/>
+      <w:r>
+        <w:rPr>
+          <w:rFonts w:eastAsia="Times New Roman" w:cs="Times New Roman"/>
+          <w:szCs w:val="24"/>
+          <w:lang w:eastAsia="cs-CZ"/>
+        </w:rPr>
+        <w:t>Stará se o recenze</w:t>
+      </w:r>
     </w:p>
     <w:p>
       <w:pPr>
         <w:pStyle w:val="Odstavecseseznamem"/>
         <w:numPr>
-          <w:ilvl w:val="3"/>
+          <w:ilvl w:val="2"/>
           <w:numId w:val="11"/>
         </w:numPr>
         <w:tabs>
@@ -3541,20 +3598,22 @@
           <w:lang w:eastAsia="cs-CZ"/>
         </w:rPr>
       </w:pPr>
-      <w:r>
-        <w:rPr>
-          <w:rFonts w:eastAsia="Times New Roman" w:cs="Times New Roman"/>
-          <w:szCs w:val="24"/>
-          <w:lang w:eastAsia="cs-CZ"/>
-        </w:rPr>
-        <w:t>Stará se o uživatele</w:t>
-      </w:r>
+      <w:proofErr w:type="spellStart"/>
+      <w:r>
+        <w:rPr>
+          <w:rFonts w:eastAsia="Times New Roman" w:cs="Times New Roman"/>
+          <w:szCs w:val="24"/>
+          <w:lang w:eastAsia="cs-CZ"/>
+        </w:rPr>
+        <w:t>UserModel.php</w:t>
+      </w:r>
+      <w:proofErr w:type="spellEnd"/>
     </w:p>
     <w:p>
       <w:pPr>
         <w:pStyle w:val="Odstavecseseznamem"/>
         <w:numPr>
-          <w:ilvl w:val="1"/>
+          <w:ilvl w:val="3"/>
           <w:numId w:val="11"/>
         </w:numPr>
         <w:tabs>
@@ -3588,14 +3647,14 @@
           <w:szCs w:val="24"/>
           <w:lang w:eastAsia="cs-CZ"/>
         </w:rPr>
-        <w:t>script/</w:t>
+        <w:t>Stará se o uživatele</w:t>
       </w:r>
     </w:p>
     <w:p>
       <w:pPr>
         <w:pStyle w:val="Odstavecseseznamem"/>
         <w:numPr>
-          <w:ilvl w:val="2"/>
+          <w:ilvl w:val="1"/>
           <w:numId w:val="11"/>
         </w:numPr>
         <w:tabs>
@@ -3629,14 +3688,14 @@
           <w:szCs w:val="24"/>
           <w:lang w:eastAsia="cs-CZ"/>
         </w:rPr>
-        <w:t>script.js</w:t>
+        <w:t>script/</w:t>
       </w:r>
     </w:p>
     <w:p>
       <w:pPr>
         <w:pStyle w:val="Odstavecseseznamem"/>
         <w:numPr>
-          <w:ilvl w:val="3"/>
+          <w:ilvl w:val="2"/>
           <w:numId w:val="11"/>
         </w:numPr>
         <w:tabs>
@@ -3670,14 +3729,14 @@
           <w:szCs w:val="24"/>
           <w:lang w:eastAsia="cs-CZ"/>
         </w:rPr>
-        <w:t>zajišťuje správu uživatelů a animace</w:t>
+        <w:t>script.js</w:t>
       </w:r>
     </w:p>
     <w:p>
       <w:pPr>
         <w:pStyle w:val="Odstavecseseznamem"/>
         <w:numPr>
-          <w:ilvl w:val="1"/>
+          <w:ilvl w:val="3"/>
           <w:numId w:val="11"/>
         </w:numPr>
         <w:tabs>
@@ -3711,14 +3770,14 @@
           <w:szCs w:val="24"/>
           <w:lang w:eastAsia="cs-CZ"/>
         </w:rPr>
-        <w:t>style/</w:t>
+        <w:t>zajišťuje správu uživatelů a animace</w:t>
       </w:r>
     </w:p>
     <w:p>
       <w:pPr>
         <w:pStyle w:val="Odstavecseseznamem"/>
         <w:numPr>
-          <w:ilvl w:val="2"/>
+          <w:ilvl w:val="1"/>
           <w:numId w:val="11"/>
         </w:numPr>
         <w:tabs>
@@ -3752,14 +3811,14 @@
           <w:szCs w:val="24"/>
           <w:lang w:eastAsia="cs-CZ"/>
         </w:rPr>
-        <w:t>style.css</w:t>
+        <w:t>style/</w:t>
       </w:r>
     </w:p>
     <w:p>
       <w:pPr>
         <w:pStyle w:val="Odstavecseseznamem"/>
         <w:numPr>
-          <w:ilvl w:val="3"/>
+          <w:ilvl w:val="2"/>
           <w:numId w:val="11"/>
         </w:numPr>
         <w:tabs>
@@ -3793,14 +3852,14 @@
           <w:szCs w:val="24"/>
           <w:lang w:eastAsia="cs-CZ"/>
         </w:rPr>
-        <w:t>vlastní styly</w:t>
+        <w:t>style.css</w:t>
       </w:r>
     </w:p>
     <w:p>
       <w:pPr>
         <w:pStyle w:val="Odstavecseseznamem"/>
         <w:numPr>
-          <w:ilvl w:val="1"/>
+          <w:ilvl w:val="3"/>
           <w:numId w:val="11"/>
         </w:numPr>
         <w:tabs>
@@ -3828,48 +3887,20 @@
           <w:lang w:eastAsia="cs-CZ"/>
         </w:rPr>
       </w:pPr>
-      <w:proofErr w:type="spellStart"/>
-      <w:r>
-        <w:rPr>
-          <w:rFonts w:eastAsia="Times New Roman" w:cs="Times New Roman"/>
-          <w:szCs w:val="24"/>
-          <w:lang w:eastAsia="cs-CZ"/>
-        </w:rPr>
-        <w:t>views</w:t>
-      </w:r>
-      <w:proofErr w:type="spellEnd"/>
-      <w:r>
-        <w:rPr>
-          <w:rFonts w:eastAsia="Times New Roman" w:cs="Times New Roman"/>
-          <w:szCs w:val="24"/>
-          <w:lang w:eastAsia="cs-CZ"/>
-        </w:rPr>
-        <w:t>/</w:t>
-      </w:r>
-      <w:proofErr w:type="spellStart"/>
-      <w:r>
-        <w:rPr>
-          <w:rFonts w:eastAsia="Times New Roman" w:cs="Times New Roman"/>
-          <w:szCs w:val="24"/>
-          <w:lang w:eastAsia="cs-CZ"/>
-        </w:rPr>
-        <w:t>twig</w:t>
-      </w:r>
-      <w:proofErr w:type="spellEnd"/>
-      <w:r>
-        <w:rPr>
-          <w:rFonts w:eastAsia="Times New Roman" w:cs="Times New Roman"/>
-          <w:szCs w:val="24"/>
-          <w:lang w:eastAsia="cs-CZ"/>
-        </w:rPr>
-        <w:t>/</w:t>
+      <w:r>
+        <w:rPr>
+          <w:rFonts w:eastAsia="Times New Roman" w:cs="Times New Roman"/>
+          <w:szCs w:val="24"/>
+          <w:lang w:eastAsia="cs-CZ"/>
+        </w:rPr>
+        <w:t>vlastní styly</w:t>
       </w:r>
     </w:p>
     <w:p>
       <w:pPr>
         <w:pStyle w:val="Odstavecseseznamem"/>
         <w:numPr>
-          <w:ilvl w:val="2"/>
+          <w:ilvl w:val="1"/>
           <w:numId w:val="11"/>
         </w:numPr>
         <w:tabs>
@@ -3898,17 +3929,41 @@
         </w:rPr>
       </w:pPr>
       <w:proofErr w:type="spellStart"/>
-      <w:proofErr w:type="gramStart"/>
-      <w:r>
-        <w:rPr>
-          <w:rFonts w:eastAsia="Times New Roman" w:cs="Times New Roman"/>
-          <w:szCs w:val="24"/>
-          <w:lang w:eastAsia="cs-CZ"/>
-        </w:rPr>
-        <w:t>articles.twig</w:t>
+      <w:r>
+        <w:rPr>
+          <w:rFonts w:eastAsia="Times New Roman" w:cs="Times New Roman"/>
+          <w:szCs w:val="24"/>
+          <w:lang w:eastAsia="cs-CZ"/>
+        </w:rPr>
+        <w:t>views</w:t>
       </w:r>
       <w:proofErr w:type="spellEnd"/>
-      <w:proofErr w:type="gramEnd"/>
+      <w:r>
+        <w:rPr>
+          <w:rFonts w:eastAsia="Times New Roman" w:cs="Times New Roman"/>
+          <w:szCs w:val="24"/>
+          <w:lang w:eastAsia="cs-CZ"/>
+        </w:rPr>
+        <w:t>/</w:t>
+      </w:r>
+      <w:proofErr w:type="spellStart"/>
+      <w:r>
+        <w:rPr>
+          <w:rFonts w:eastAsia="Times New Roman" w:cs="Times New Roman"/>
+          <w:szCs w:val="24"/>
+          <w:lang w:eastAsia="cs-CZ"/>
+        </w:rPr>
+        <w:t>twig</w:t>
+      </w:r>
+      <w:proofErr w:type="spellEnd"/>
+      <w:r>
+        <w:rPr>
+          <w:rFonts w:eastAsia="Times New Roman" w:cs="Times New Roman"/>
+          <w:szCs w:val="24"/>
+          <w:lang w:eastAsia="cs-CZ"/>
+        </w:rPr>
+        <w:t>/</w:t>
+      </w:r>
     </w:p>
     <w:p>
       <w:pPr>
@@ -3950,7 +4005,7 @@
           <w:szCs w:val="24"/>
           <w:lang w:eastAsia="cs-CZ"/>
         </w:rPr>
-        <w:t>base.twig</w:t>
+        <w:t>articles.twig</w:t>
       </w:r>
       <w:proofErr w:type="spellEnd"/>
       <w:proofErr w:type="gramEnd"/>
@@ -3988,15 +4043,17 @@
         </w:rPr>
       </w:pPr>
       <w:proofErr w:type="spellStart"/>
-      <w:r>
-        <w:rPr>
-          <w:rFonts w:eastAsia="Times New Roman" w:cs="Times New Roman"/>
-          <w:szCs w:val="24"/>
-          <w:lang w:eastAsia="cs-CZ"/>
-        </w:rPr>
-        <w:t>editPost.twig</w:t>
+      <w:proofErr w:type="gramStart"/>
+      <w:r>
+        <w:rPr>
+          <w:rFonts w:eastAsia="Times New Roman" w:cs="Times New Roman"/>
+          <w:szCs w:val="24"/>
+          <w:lang w:eastAsia="cs-CZ"/>
+        </w:rPr>
+        <w:t>base.twig</w:t>
       </w:r>
       <w:proofErr w:type="spellEnd"/>
+      <w:proofErr w:type="gramEnd"/>
     </w:p>
     <w:p>
       <w:pPr>
@@ -4031,17 +4088,15 @@
         </w:rPr>
       </w:pPr>
       <w:proofErr w:type="spellStart"/>
-      <w:proofErr w:type="gramStart"/>
-      <w:r>
-        <w:rPr>
-          <w:rFonts w:eastAsia="Times New Roman" w:cs="Times New Roman"/>
-          <w:szCs w:val="24"/>
-          <w:lang w:eastAsia="cs-CZ"/>
-        </w:rPr>
-        <w:t>home.twig</w:t>
+      <w:r>
+        <w:rPr>
+          <w:rFonts w:eastAsia="Times New Roman" w:cs="Times New Roman"/>
+          <w:szCs w:val="24"/>
+          <w:lang w:eastAsia="cs-CZ"/>
+        </w:rPr>
+        <w:t>editPost.twig</w:t>
       </w:r>
       <w:proofErr w:type="spellEnd"/>
-      <w:proofErr w:type="gramEnd"/>
     </w:p>
     <w:p>
       <w:pPr>
@@ -4076,15 +4131,17 @@
         </w:rPr>
       </w:pPr>
       <w:proofErr w:type="spellStart"/>
-      <w:r>
-        <w:rPr>
-          <w:rFonts w:eastAsia="Times New Roman" w:cs="Times New Roman"/>
-          <w:szCs w:val="24"/>
-          <w:lang w:eastAsia="cs-CZ"/>
-        </w:rPr>
-        <w:t>loginError.twig</w:t>
+      <w:proofErr w:type="gramStart"/>
+      <w:r>
+        <w:rPr>
+          <w:rFonts w:eastAsia="Times New Roman" w:cs="Times New Roman"/>
+          <w:szCs w:val="24"/>
+          <w:lang w:eastAsia="cs-CZ"/>
+        </w:rPr>
+        <w:t>home.twig</w:t>
       </w:r>
       <w:proofErr w:type="spellEnd"/>
+      <w:proofErr w:type="gramEnd"/>
     </w:p>
     <w:p>
       <w:pPr>
@@ -4125,7 +4182,7 @@
           <w:szCs w:val="24"/>
           <w:lang w:eastAsia="cs-CZ"/>
         </w:rPr>
-        <w:t>managePosts.twig</w:t>
+        <w:t>loginError.twig</w:t>
       </w:r>
       <w:proofErr w:type="spellEnd"/>
     </w:p>
@@ -4168,7 +4225,7 @@
           <w:szCs w:val="24"/>
           <w:lang w:eastAsia="cs-CZ"/>
         </w:rPr>
-        <w:t>manageReviews.twig</w:t>
+        <w:t>managePosts.twig</w:t>
       </w:r>
       <w:proofErr w:type="spellEnd"/>
     </w:p>
@@ -4205,17 +4262,15 @@
         </w:rPr>
       </w:pPr>
       <w:proofErr w:type="spellStart"/>
-      <w:proofErr w:type="gramStart"/>
-      <w:r>
-        <w:rPr>
-          <w:rFonts w:eastAsia="Times New Roman" w:cs="Times New Roman"/>
-          <w:szCs w:val="24"/>
-          <w:lang w:eastAsia="cs-CZ"/>
-        </w:rPr>
-        <w:t>program.twig</w:t>
+      <w:r>
+        <w:rPr>
+          <w:rFonts w:eastAsia="Times New Roman" w:cs="Times New Roman"/>
+          <w:szCs w:val="24"/>
+          <w:lang w:eastAsia="cs-CZ"/>
+        </w:rPr>
+        <w:t>manageReviews.twig</w:t>
       </w:r>
       <w:proofErr w:type="spellEnd"/>
-      <w:proofErr w:type="gramEnd"/>
     </w:p>
     <w:p>
       <w:pPr>
@@ -4257,7 +4312,7 @@
           <w:szCs w:val="24"/>
           <w:lang w:eastAsia="cs-CZ"/>
         </w:rPr>
-        <w:t>registration.twig</w:t>
+        <w:t>program.twig</w:t>
       </w:r>
       <w:proofErr w:type="spellEnd"/>
       <w:proofErr w:type="gramEnd"/>
@@ -4302,7 +4357,7 @@
           <w:szCs w:val="24"/>
           <w:lang w:eastAsia="cs-CZ"/>
         </w:rPr>
-        <w:t>review.twig</w:t>
+        <w:t>registration.twig</w:t>
       </w:r>
       <w:proofErr w:type="spellEnd"/>
       <w:proofErr w:type="gramEnd"/>
@@ -4340,15 +4395,17 @@
         </w:rPr>
       </w:pPr>
       <w:proofErr w:type="spellStart"/>
-      <w:r>
-        <w:rPr>
-          <w:rFonts w:eastAsia="Times New Roman" w:cs="Times New Roman"/>
-          <w:szCs w:val="24"/>
-          <w:lang w:eastAsia="cs-CZ"/>
-        </w:rPr>
-        <w:t>reviewList.twig</w:t>
+      <w:proofErr w:type="gramStart"/>
+      <w:r>
+        <w:rPr>
+          <w:rFonts w:eastAsia="Times New Roman" w:cs="Times New Roman"/>
+          <w:szCs w:val="24"/>
+          <w:lang w:eastAsia="cs-CZ"/>
+        </w:rPr>
+        <w:t>review.twig</w:t>
       </w:r>
       <w:proofErr w:type="spellEnd"/>
+      <w:proofErr w:type="gramEnd"/>
     </w:p>
     <w:p>
       <w:pPr>
@@ -4383,17 +4440,15 @@
         </w:rPr>
       </w:pPr>
       <w:proofErr w:type="spellStart"/>
-      <w:proofErr w:type="gramStart"/>
-      <w:r>
-        <w:rPr>
-          <w:rFonts w:eastAsia="Times New Roman" w:cs="Times New Roman"/>
-          <w:szCs w:val="24"/>
-          <w:lang w:eastAsia="cs-CZ"/>
-        </w:rPr>
-        <w:t>upload.twig</w:t>
+      <w:r>
+        <w:rPr>
+          <w:rFonts w:eastAsia="Times New Roman" w:cs="Times New Roman"/>
+          <w:szCs w:val="24"/>
+          <w:lang w:eastAsia="cs-CZ"/>
+        </w:rPr>
+        <w:t>reviewList.twig</w:t>
       </w:r>
       <w:proofErr w:type="spellEnd"/>
-      <w:proofErr w:type="gramEnd"/>
     </w:p>
     <w:p>
       <w:pPr>
@@ -4428,21 +4483,23 @@
         </w:rPr>
       </w:pPr>
       <w:proofErr w:type="spellStart"/>
-      <w:r>
-        <w:rPr>
-          <w:rFonts w:eastAsia="Times New Roman" w:cs="Times New Roman"/>
-          <w:szCs w:val="24"/>
-          <w:lang w:eastAsia="cs-CZ"/>
-        </w:rPr>
-        <w:t>userSettings.twig</w:t>
+      <w:proofErr w:type="gramStart"/>
+      <w:r>
+        <w:rPr>
+          <w:rFonts w:eastAsia="Times New Roman" w:cs="Times New Roman"/>
+          <w:szCs w:val="24"/>
+          <w:lang w:eastAsia="cs-CZ"/>
+        </w:rPr>
+        <w:t>upload.twig</w:t>
       </w:r>
       <w:proofErr w:type="spellEnd"/>
+      <w:proofErr w:type="gramEnd"/>
     </w:p>
     <w:p>
       <w:pPr>
         <w:pStyle w:val="Odstavecseseznamem"/>
         <w:numPr>
-          <w:ilvl w:val="1"/>
+          <w:ilvl w:val="2"/>
           <w:numId w:val="11"/>
         </w:numPr>
         <w:tabs>
@@ -4477,7 +4534,7 @@
           <w:szCs w:val="24"/>
           <w:lang w:eastAsia="cs-CZ"/>
         </w:rPr>
-        <w:t>MyApplication.php</w:t>
+        <w:t>userSettings.twig</w:t>
       </w:r>
       <w:proofErr w:type="spellEnd"/>
     </w:p>
@@ -4485,7 +4542,7 @@
       <w:pPr>
         <w:pStyle w:val="Odstavecseseznamem"/>
         <w:numPr>
-          <w:ilvl w:val="2"/>
+          <w:ilvl w:val="1"/>
           <w:numId w:val="11"/>
         </w:numPr>
         <w:tabs>
@@ -4513,22 +4570,6 @@
           <w:lang w:eastAsia="cs-CZ"/>
         </w:rPr>
       </w:pPr>
-      <w:r>
-        <w:rPr>
-          <w:rFonts w:eastAsia="Times New Roman" w:cs="Times New Roman"/>
-          <w:szCs w:val="24"/>
-          <w:lang w:eastAsia="cs-CZ"/>
-        </w:rPr>
-        <w:t>R</w:t>
-      </w:r>
-      <w:r>
-        <w:rPr>
-          <w:rFonts w:eastAsia="Times New Roman" w:cs="Times New Roman"/>
-          <w:szCs w:val="24"/>
-          <w:lang w:eastAsia="cs-CZ"/>
-        </w:rPr>
-        <w:t xml:space="preserve">ozhoduje, který </w:t>
-      </w:r>
       <w:proofErr w:type="spellStart"/>
       <w:r>
         <w:rPr>
@@ -4536,17 +4577,9 @@
           <w:szCs w:val="24"/>
           <w:lang w:eastAsia="cs-CZ"/>
         </w:rPr>
-        <w:t>controller</w:t>
+        <w:t>MyApplication.php</w:t>
       </w:r>
       <w:proofErr w:type="spellEnd"/>
-      <w:r>
-        <w:rPr>
-          <w:rFonts w:eastAsia="Times New Roman" w:cs="Times New Roman"/>
-          <w:szCs w:val="24"/>
-          <w:lang w:eastAsia="cs-CZ"/>
-        </w:rPr>
-        <w:t xml:space="preserve"> se má spustit</w:t>
-      </w:r>
     </w:p>
     <w:p>
       <w:pPr>
@@ -4586,7 +4619,15 @@
           <w:szCs w:val="24"/>
           <w:lang w:eastAsia="cs-CZ"/>
         </w:rPr>
-        <w:t xml:space="preserve">Správce </w:t>
+        <w:t>R</w:t>
+      </w:r>
+      <w:r>
+        <w:rPr>
+          <w:rFonts w:eastAsia="Times New Roman" w:cs="Times New Roman"/>
+          <w:szCs w:val="24"/>
+          <w:lang w:eastAsia="cs-CZ"/>
+        </w:rPr>
+        <w:t xml:space="preserve">ozhoduje, který </w:t>
       </w:r>
       <w:proofErr w:type="spellStart"/>
       <w:r>
@@ -4595,7 +4636,7 @@
           <w:szCs w:val="24"/>
           <w:lang w:eastAsia="cs-CZ"/>
         </w:rPr>
-        <w:t>Twig</w:t>
+        <w:t>controller</w:t>
       </w:r>
       <w:proofErr w:type="spellEnd"/>
       <w:r>
@@ -4604,7 +4645,7 @@
           <w:szCs w:val="24"/>
           <w:lang w:eastAsia="cs-CZ"/>
         </w:rPr>
-        <w:t xml:space="preserve"> šablon</w:t>
+        <w:t xml:space="preserve"> se má spustit</w:t>
       </w:r>
     </w:p>
     <w:p>
@@ -4645,22 +4686,32 @@
           <w:szCs w:val="24"/>
           <w:lang w:eastAsia="cs-CZ"/>
         </w:rPr>
-        <w:t>Zajišťuje,</w:t>
-      </w:r>
-      <w:r>
-        <w:rPr>
-          <w:rFonts w:eastAsia="Times New Roman" w:cs="Times New Roman"/>
-          <w:szCs w:val="24"/>
-          <w:lang w:eastAsia="cs-CZ"/>
-        </w:rPr>
-        <w:t xml:space="preserve"> že se spustí jen povolené stránky</w:t>
+        <w:t xml:space="preserve">Správce </w:t>
+      </w:r>
+      <w:proofErr w:type="spellStart"/>
+      <w:r>
+        <w:rPr>
+          <w:rFonts w:eastAsia="Times New Roman" w:cs="Times New Roman"/>
+          <w:szCs w:val="24"/>
+          <w:lang w:eastAsia="cs-CZ"/>
+        </w:rPr>
+        <w:t>Twig</w:t>
+      </w:r>
+      <w:proofErr w:type="spellEnd"/>
+      <w:r>
+        <w:rPr>
+          <w:rFonts w:eastAsia="Times New Roman" w:cs="Times New Roman"/>
+          <w:szCs w:val="24"/>
+          <w:lang w:eastAsia="cs-CZ"/>
+        </w:rPr>
+        <w:t xml:space="preserve"> šablon</w:t>
       </w:r>
     </w:p>
     <w:p>
       <w:pPr>
         <w:pStyle w:val="Odstavecseseznamem"/>
         <w:numPr>
-          <w:ilvl w:val="0"/>
+          <w:ilvl w:val="2"/>
           <w:numId w:val="11"/>
         </w:numPr>
         <w:tabs>
@@ -4688,30 +4739,28 @@
           <w:lang w:eastAsia="cs-CZ"/>
         </w:rPr>
       </w:pPr>
-      <w:proofErr w:type="spellStart"/>
-      <w:r>
-        <w:rPr>
-          <w:rFonts w:eastAsia="Times New Roman" w:cs="Times New Roman"/>
-          <w:szCs w:val="24"/>
-          <w:lang w:eastAsia="cs-CZ"/>
-        </w:rPr>
-        <w:t>uploads</w:t>
-      </w:r>
-      <w:proofErr w:type="spellEnd"/>
-      <w:r>
-        <w:rPr>
-          <w:rFonts w:eastAsia="Times New Roman" w:cs="Times New Roman"/>
-          <w:szCs w:val="24"/>
-          <w:lang w:eastAsia="cs-CZ"/>
-        </w:rPr>
-        <w:t>/</w:t>
+      <w:r>
+        <w:rPr>
+          <w:rFonts w:eastAsia="Times New Roman" w:cs="Times New Roman"/>
+          <w:szCs w:val="24"/>
+          <w:lang w:eastAsia="cs-CZ"/>
+        </w:rPr>
+        <w:t>Zajišťuje,</w:t>
+      </w:r>
+      <w:r>
+        <w:rPr>
+          <w:rFonts w:eastAsia="Times New Roman" w:cs="Times New Roman"/>
+          <w:szCs w:val="24"/>
+          <w:lang w:eastAsia="cs-CZ"/>
+        </w:rPr>
+        <w:t xml:space="preserve"> že se spustí jen povolené stránky</w:t>
       </w:r>
     </w:p>
     <w:p>
       <w:pPr>
         <w:pStyle w:val="Odstavecseseznamem"/>
         <w:numPr>
-          <w:ilvl w:val="1"/>
+          <w:ilvl w:val="0"/>
           <w:numId w:val="11"/>
         </w:numPr>
         <w:tabs>
@@ -4739,20 +4788,30 @@
           <w:lang w:eastAsia="cs-CZ"/>
         </w:rPr>
       </w:pPr>
-      <w:r>
-        <w:rPr>
-          <w:rFonts w:eastAsia="Times New Roman" w:cs="Times New Roman"/>
-          <w:szCs w:val="24"/>
-          <w:lang w:eastAsia="cs-CZ"/>
-        </w:rPr>
-        <w:t>nahrané články</w:t>
+      <w:proofErr w:type="spellStart"/>
+      <w:r>
+        <w:rPr>
+          <w:rFonts w:eastAsia="Times New Roman" w:cs="Times New Roman"/>
+          <w:szCs w:val="24"/>
+          <w:lang w:eastAsia="cs-CZ"/>
+        </w:rPr>
+        <w:t>uploads</w:t>
+      </w:r>
+      <w:proofErr w:type="spellEnd"/>
+      <w:r>
+        <w:rPr>
+          <w:rFonts w:eastAsia="Times New Roman" w:cs="Times New Roman"/>
+          <w:szCs w:val="24"/>
+          <w:lang w:eastAsia="cs-CZ"/>
+        </w:rPr>
+        <w:t>/</w:t>
       </w:r>
     </w:p>
     <w:p>
       <w:pPr>
         <w:pStyle w:val="Odstavecseseznamem"/>
         <w:numPr>
-          <w:ilvl w:val="0"/>
+          <w:ilvl w:val="1"/>
           <w:numId w:val="11"/>
         </w:numPr>
         <w:tabs>
@@ -4780,30 +4839,20 @@
           <w:lang w:eastAsia="cs-CZ"/>
         </w:rPr>
       </w:pPr>
-      <w:proofErr w:type="spellStart"/>
-      <w:r>
-        <w:rPr>
-          <w:rFonts w:eastAsia="Times New Roman" w:cs="Times New Roman"/>
-          <w:szCs w:val="24"/>
-          <w:lang w:eastAsia="cs-CZ"/>
-        </w:rPr>
-        <w:t>img</w:t>
-      </w:r>
-      <w:proofErr w:type="spellEnd"/>
-      <w:r>
-        <w:rPr>
-          <w:rFonts w:eastAsia="Times New Roman" w:cs="Times New Roman"/>
-          <w:szCs w:val="24"/>
-          <w:lang w:eastAsia="cs-CZ"/>
-        </w:rPr>
-        <w:t xml:space="preserve">/                    </w:t>
+      <w:r>
+        <w:rPr>
+          <w:rFonts w:eastAsia="Times New Roman" w:cs="Times New Roman"/>
+          <w:szCs w:val="24"/>
+          <w:lang w:eastAsia="cs-CZ"/>
+        </w:rPr>
+        <w:t>nahrané články</w:t>
       </w:r>
     </w:p>
     <w:p>
       <w:pPr>
         <w:pStyle w:val="Odstavecseseznamem"/>
         <w:numPr>
-          <w:ilvl w:val="1"/>
+          <w:ilvl w:val="0"/>
           <w:numId w:val="11"/>
         </w:numPr>
         <w:tabs>
@@ -4831,6 +4880,57 @@
           <w:lang w:eastAsia="cs-CZ"/>
         </w:rPr>
       </w:pPr>
+      <w:proofErr w:type="spellStart"/>
+      <w:r>
+        <w:rPr>
+          <w:rFonts w:eastAsia="Times New Roman" w:cs="Times New Roman"/>
+          <w:szCs w:val="24"/>
+          <w:lang w:eastAsia="cs-CZ"/>
+        </w:rPr>
+        <w:t>img</w:t>
+      </w:r>
+      <w:proofErr w:type="spellEnd"/>
+      <w:r>
+        <w:rPr>
+          <w:rFonts w:eastAsia="Times New Roman" w:cs="Times New Roman"/>
+          <w:szCs w:val="24"/>
+          <w:lang w:eastAsia="cs-CZ"/>
+        </w:rPr>
+        <w:t xml:space="preserve">/                    </w:t>
+      </w:r>
+    </w:p>
+    <w:p>
+      <w:pPr>
+        <w:pStyle w:val="Odstavecseseznamem"/>
+        <w:numPr>
+          <w:ilvl w:val="1"/>
+          <w:numId w:val="11"/>
+        </w:numPr>
+        <w:tabs>
+          <w:tab w:val="left" w:pos="916"/>
+          <w:tab w:val="left" w:pos="1832"/>
+          <w:tab w:val="left" w:pos="2748"/>
+          <w:tab w:val="left" w:pos="3664"/>
+          <w:tab w:val="left" w:pos="4580"/>
+          <w:tab w:val="left" w:pos="5496"/>
+          <w:tab w:val="left" w:pos="6412"/>
+          <w:tab w:val="left" w:pos="7328"/>
+          <w:tab w:val="left" w:pos="8244"/>
+          <w:tab w:val="left" w:pos="9160"/>
+          <w:tab w:val="left" w:pos="10076"/>
+          <w:tab w:val="left" w:pos="10992"/>
+          <w:tab w:val="left" w:pos="11908"/>
+          <w:tab w:val="left" w:pos="12824"/>
+          <w:tab w:val="left" w:pos="13740"/>
+          <w:tab w:val="left" w:pos="14656"/>
+        </w:tabs>
+        <w:spacing w:after="0" w:line="240" w:lineRule="auto"/>
+        <w:rPr>
+          <w:rFonts w:eastAsia="Times New Roman" w:cs="Times New Roman"/>
+          <w:szCs w:val="24"/>
+          <w:lang w:eastAsia="cs-CZ"/>
+        </w:rPr>
+      </w:pPr>
       <w:r>
         <w:rPr>
           <w:rFonts w:eastAsia="Times New Roman" w:cs="Times New Roman"/>
@@ -4908,6 +5008,7 @@
           <w:szCs w:val="27"/>
           <w:lang w:eastAsia="cs-CZ"/>
         </w:rPr>
+        <w:lastRenderedPageBreak/>
         <w:t>Models</w:t>
       </w:r>
       <w:proofErr w:type="spellEnd"/>
@@ -4931,7 +5032,6 @@
           <w:szCs w:val="24"/>
           <w:lang w:eastAsia="cs-CZ"/>
         </w:rPr>
-        <w:lastRenderedPageBreak/>
         <w:t>R</w:t>
       </w:r>
       <w:r>

</xml_diff>

<commit_message>
Finální kosmetické úpravy Opravena boty s měněním pdf
</commit_message>
<xml_diff>
--- a/doc/dokumentace.DOCX
+++ b/doc/dokumentace.DOCX
@@ -355,7 +355,6 @@
         </w:rPr>
         <w:t xml:space="preserve">, </w:t>
       </w:r>
-      <w:proofErr w:type="spellStart"/>
       <w:r>
         <w:rPr>
           <w:rFonts w:eastAsia="Times New Roman" w:cs="Times New Roman"/>
@@ -386,7 +385,6 @@
         </w:rPr>
         <w:t>dmin</w:t>
       </w:r>
-      <w:proofErr w:type="spellEnd"/>
     </w:p>
     <w:p>
       <w:pPr>
@@ -467,25 +465,7 @@
           <w:szCs w:val="24"/>
           <w:lang w:eastAsia="cs-CZ"/>
         </w:rPr>
-        <w:t>Tvorbu recenzí pomocí WYSIWYG editoru (</w:t>
-      </w:r>
-      <w:proofErr w:type="spellStart"/>
-      <w:r>
-        <w:rPr>
-          <w:rFonts w:eastAsia="Times New Roman" w:cs="Times New Roman"/>
-          <w:szCs w:val="24"/>
-          <w:lang w:eastAsia="cs-CZ"/>
-        </w:rPr>
-        <w:t>CKEditor</w:t>
-      </w:r>
-      <w:proofErr w:type="spellEnd"/>
-      <w:r>
-        <w:rPr>
-          <w:rFonts w:eastAsia="Times New Roman" w:cs="Times New Roman"/>
-          <w:szCs w:val="24"/>
-          <w:lang w:eastAsia="cs-CZ"/>
-        </w:rPr>
-        <w:t>)</w:t>
+        <w:t>Tvorbu recenzí pomocí WYSIWYG editoru (CKEditor)</w:t>
       </w:r>
     </w:p>
     <w:p>
@@ -589,18 +569,30 @@
           <w:szCs w:val="24"/>
           <w:lang w:eastAsia="cs-CZ"/>
         </w:rPr>
-        <w:t xml:space="preserve">Veřejné zobrazení schválených článků PDF </w:t>
-      </w:r>
-      <w:proofErr w:type="spellStart"/>
-      <w:r>
-        <w:rPr>
-          <w:rFonts w:eastAsia="Times New Roman" w:cs="Times New Roman"/>
-          <w:szCs w:val="24"/>
-          <w:lang w:eastAsia="cs-CZ"/>
-        </w:rPr>
-        <w:t>viewerem</w:t>
-      </w:r>
-      <w:proofErr w:type="spellEnd"/>
+        <w:t>Veřejné zobrazení schválených článků PDF viewerem</w:t>
+      </w:r>
+    </w:p>
+    <w:p>
+      <w:pPr>
+        <w:numPr>
+          <w:ilvl w:val="0"/>
+          <w:numId w:val="2"/>
+        </w:numPr>
+        <w:spacing w:before="100" w:beforeAutospacing="1" w:after="100" w:afterAutospacing="1" w:line="240" w:lineRule="auto"/>
+        <w:rPr>
+          <w:rFonts w:eastAsia="Times New Roman" w:cs="Times New Roman"/>
+          <w:szCs w:val="24"/>
+          <w:lang w:eastAsia="cs-CZ"/>
+        </w:rPr>
+      </w:pPr>
+      <w:r>
+        <w:rPr>
+          <w:rFonts w:eastAsia="Times New Roman" w:cs="Times New Roman"/>
+          <w:szCs w:val="24"/>
+          <w:lang w:eastAsia="cs-CZ"/>
+        </w:rPr>
+        <w:t>Možnost mazat uživatele, články i recenze</w:t>
+      </w:r>
     </w:p>
     <w:p>
       <w:pPr>
@@ -652,7 +644,6 @@
           <w:lang w:eastAsia="cs-CZ"/>
         </w:rPr>
       </w:pPr>
-      <w:proofErr w:type="spellStart"/>
       <w:r>
         <w:rPr>
           <w:rFonts w:eastAsia="Times New Roman" w:cs="Times New Roman"/>
@@ -664,7 +655,6 @@
         </w:rPr>
         <w:t>Frontend</w:t>
       </w:r>
-      <w:proofErr w:type="spellEnd"/>
     </w:p>
     <w:p>
       <w:pPr>
@@ -703,7 +693,6 @@
           <w:lang w:eastAsia="cs-CZ"/>
         </w:rPr>
       </w:pPr>
-      <w:proofErr w:type="spellStart"/>
       <w:r>
         <w:rPr>
           <w:rFonts w:eastAsia="Times New Roman" w:cs="Times New Roman"/>
@@ -712,9 +701,74 @@
           <w:szCs w:val="24"/>
           <w:lang w:eastAsia="cs-CZ"/>
         </w:rPr>
-        <w:t>Bootstrap</w:t>
-      </w:r>
-      <w:proofErr w:type="spellEnd"/>
+        <w:t>Bootstrap 5</w:t>
+      </w:r>
+      <w:r>
+        <w:rPr>
+          <w:rFonts w:eastAsia="Times New Roman" w:cs="Times New Roman"/>
+          <w:szCs w:val="24"/>
+          <w:lang w:eastAsia="cs-CZ"/>
+        </w:rPr>
+        <w:t xml:space="preserve"> </w:t>
+      </w:r>
+    </w:p>
+    <w:p>
+      <w:pPr>
+        <w:numPr>
+          <w:ilvl w:val="1"/>
+          <w:numId w:val="3"/>
+        </w:numPr>
+        <w:spacing w:before="100" w:beforeAutospacing="1" w:after="100" w:afterAutospacing="1" w:line="240" w:lineRule="auto"/>
+        <w:rPr>
+          <w:rFonts w:eastAsia="Times New Roman" w:cs="Times New Roman"/>
+          <w:szCs w:val="24"/>
+          <w:lang w:eastAsia="cs-CZ"/>
+        </w:rPr>
+      </w:pPr>
+      <w:r>
+        <w:rPr>
+          <w:rFonts w:eastAsia="Times New Roman" w:cs="Times New Roman"/>
+          <w:szCs w:val="24"/>
+          <w:lang w:eastAsia="cs-CZ"/>
+        </w:rPr>
+        <w:t>responzivní design</w:t>
+      </w:r>
+    </w:p>
+    <w:p>
+      <w:pPr>
+        <w:numPr>
+          <w:ilvl w:val="1"/>
+          <w:numId w:val="3"/>
+        </w:numPr>
+        <w:spacing w:before="100" w:beforeAutospacing="1" w:after="100" w:afterAutospacing="1" w:line="240" w:lineRule="auto"/>
+        <w:rPr>
+          <w:rFonts w:eastAsia="Times New Roman" w:cs="Times New Roman"/>
+          <w:szCs w:val="24"/>
+          <w:lang w:eastAsia="cs-CZ"/>
+        </w:rPr>
+      </w:pPr>
+      <w:r>
+        <w:rPr>
+          <w:rFonts w:eastAsia="Times New Roman" w:cs="Times New Roman"/>
+          <w:szCs w:val="24"/>
+          <w:lang w:eastAsia="cs-CZ"/>
+        </w:rPr>
+        <w:t>pěkná výchozí šablona</w:t>
+      </w:r>
+    </w:p>
+    <w:p>
+      <w:pPr>
+        <w:numPr>
+          <w:ilvl w:val="0"/>
+          <w:numId w:val="3"/>
+        </w:numPr>
+        <w:spacing w:before="100" w:beforeAutospacing="1" w:after="100" w:afterAutospacing="1" w:line="240" w:lineRule="auto"/>
+        <w:rPr>
+          <w:rFonts w:eastAsia="Times New Roman" w:cs="Times New Roman"/>
+          <w:szCs w:val="24"/>
+          <w:lang w:eastAsia="cs-CZ"/>
+        </w:rPr>
+      </w:pPr>
       <w:r>
         <w:rPr>
           <w:rFonts w:eastAsia="Times New Roman" w:cs="Times New Roman"/>
@@ -723,15 +777,7 @@
           <w:szCs w:val="24"/>
           <w:lang w:eastAsia="cs-CZ"/>
         </w:rPr>
-        <w:t xml:space="preserve"> 5</w:t>
-      </w:r>
-      <w:r>
-        <w:rPr>
-          <w:rFonts w:eastAsia="Times New Roman" w:cs="Times New Roman"/>
-          <w:szCs w:val="24"/>
-          <w:lang w:eastAsia="cs-CZ"/>
-        </w:rPr>
-        <w:t xml:space="preserve"> </w:t>
+        <w:t>JavaScript</w:t>
       </w:r>
     </w:p>
     <w:p>
@@ -753,7 +799,7 @@
           <w:szCs w:val="24"/>
           <w:lang w:eastAsia="cs-CZ"/>
         </w:rPr>
-        <w:t>responzivní design</w:t>
+        <w:t>třídy pro logiku</w:t>
       </w:r>
     </w:p>
     <w:p>
@@ -775,7 +821,103 @@
           <w:szCs w:val="24"/>
           <w:lang w:eastAsia="cs-CZ"/>
         </w:rPr>
-        <w:t>pěkná výchozí šablona</w:t>
+        <w:t>fetch() pro komunikaci s REST API</w:t>
+      </w:r>
+    </w:p>
+    <w:p>
+      <w:pPr>
+        <w:numPr>
+          <w:ilvl w:val="1"/>
+          <w:numId w:val="3"/>
+        </w:numPr>
+        <w:spacing w:before="100" w:beforeAutospacing="1" w:after="100" w:afterAutospacing="1" w:line="240" w:lineRule="auto"/>
+        <w:rPr>
+          <w:rFonts w:eastAsia="Times New Roman" w:cs="Times New Roman"/>
+          <w:szCs w:val="24"/>
+          <w:lang w:eastAsia="cs-CZ"/>
+        </w:rPr>
+      </w:pPr>
+      <w:r>
+        <w:rPr>
+          <w:rFonts w:eastAsia="Times New Roman" w:cs="Times New Roman"/>
+          <w:szCs w:val="24"/>
+          <w:lang w:eastAsia="cs-CZ"/>
+        </w:rPr>
+        <w:t>animace</w:t>
+      </w:r>
+    </w:p>
+    <w:p>
+      <w:pPr>
+        <w:numPr>
+          <w:ilvl w:val="2"/>
+          <w:numId w:val="3"/>
+        </w:numPr>
+        <w:spacing w:before="100" w:beforeAutospacing="1" w:after="100" w:afterAutospacing="1" w:line="240" w:lineRule="auto"/>
+        <w:rPr>
+          <w:rFonts w:eastAsia="Times New Roman" w:cs="Times New Roman"/>
+          <w:szCs w:val="24"/>
+          <w:lang w:eastAsia="cs-CZ"/>
+        </w:rPr>
+      </w:pPr>
+      <w:r>
+        <w:rPr>
+          <w:rFonts w:eastAsia="Times New Roman" w:cs="Times New Roman"/>
+          <w:szCs w:val="24"/>
+          <w:lang w:eastAsia="cs-CZ"/>
+        </w:rPr>
+        <w:t>postupný přechod z průhlednosti 1 do sytosti</w:t>
+      </w:r>
+    </w:p>
+    <w:p>
+      <w:pPr>
+        <w:numPr>
+          <w:ilvl w:val="2"/>
+          <w:numId w:val="3"/>
+        </w:numPr>
+        <w:spacing w:before="100" w:beforeAutospacing="1" w:after="100" w:afterAutospacing="1" w:line="240" w:lineRule="auto"/>
+        <w:rPr>
+          <w:rFonts w:eastAsia="Times New Roman" w:cs="Times New Roman"/>
+          <w:szCs w:val="24"/>
+          <w:lang w:eastAsia="cs-CZ"/>
+        </w:rPr>
+      </w:pPr>
+      <w:r>
+        <w:rPr>
+          <w:rFonts w:eastAsia="Times New Roman" w:cs="Times New Roman"/>
+          <w:szCs w:val="24"/>
+          <w:lang w:eastAsia="cs-CZ"/>
+        </w:rPr>
+        <w:t xml:space="preserve">typing efekt </w:t>
+      </w:r>
+      <w:r>
+        <w:rPr>
+          <w:rFonts w:eastAsia="Times New Roman" w:cs="Times New Roman"/>
+          <w:szCs w:val="24"/>
+          <w:lang w:eastAsia="cs-CZ"/>
+        </w:rPr>
+        <w:t>nadpisů</w:t>
+      </w:r>
+    </w:p>
+    <w:p>
+      <w:pPr>
+        <w:numPr>
+          <w:ilvl w:val="1"/>
+          <w:numId w:val="3"/>
+        </w:numPr>
+        <w:spacing w:before="100" w:beforeAutospacing="1" w:after="100" w:afterAutospacing="1" w:line="240" w:lineRule="auto"/>
+        <w:rPr>
+          <w:rFonts w:eastAsia="Times New Roman" w:cs="Times New Roman"/>
+          <w:szCs w:val="24"/>
+          <w:lang w:eastAsia="cs-CZ"/>
+        </w:rPr>
+      </w:pPr>
+      <w:r>
+        <w:rPr>
+          <w:rFonts w:eastAsia="Times New Roman" w:cs="Times New Roman"/>
+          <w:szCs w:val="24"/>
+          <w:lang w:eastAsia="cs-CZ"/>
+        </w:rPr>
+        <w:t>login nemá vlastní stránku – zajištěn pouze vyjetím JS</w:t>
       </w:r>
     </w:p>
     <w:p>
@@ -799,204 +941,8 @@
           <w:szCs w:val="24"/>
           <w:lang w:eastAsia="cs-CZ"/>
         </w:rPr>
-        <w:t>JavaScript</w:t>
-      </w:r>
-    </w:p>
-    <w:p>
-      <w:pPr>
-        <w:numPr>
-          <w:ilvl w:val="1"/>
-          <w:numId w:val="3"/>
-        </w:numPr>
-        <w:spacing w:before="100" w:beforeAutospacing="1" w:after="100" w:afterAutospacing="1" w:line="240" w:lineRule="auto"/>
-        <w:rPr>
-          <w:rFonts w:eastAsia="Times New Roman" w:cs="Times New Roman"/>
-          <w:szCs w:val="24"/>
-          <w:lang w:eastAsia="cs-CZ"/>
-        </w:rPr>
-      </w:pPr>
-      <w:r>
-        <w:rPr>
-          <w:rFonts w:eastAsia="Times New Roman" w:cs="Times New Roman"/>
-          <w:szCs w:val="24"/>
-          <w:lang w:eastAsia="cs-CZ"/>
-        </w:rPr>
-        <w:t>třídy pro logiku</w:t>
-      </w:r>
-    </w:p>
-    <w:p>
-      <w:pPr>
-        <w:numPr>
-          <w:ilvl w:val="1"/>
-          <w:numId w:val="3"/>
-        </w:numPr>
-        <w:spacing w:before="100" w:beforeAutospacing="1" w:after="100" w:afterAutospacing="1" w:line="240" w:lineRule="auto"/>
-        <w:rPr>
-          <w:rFonts w:eastAsia="Times New Roman" w:cs="Times New Roman"/>
-          <w:szCs w:val="24"/>
-          <w:lang w:eastAsia="cs-CZ"/>
-        </w:rPr>
-      </w:pPr>
-      <w:proofErr w:type="spellStart"/>
-      <w:proofErr w:type="gramStart"/>
-      <w:r>
-        <w:rPr>
-          <w:rFonts w:eastAsia="Times New Roman" w:cs="Times New Roman"/>
-          <w:szCs w:val="24"/>
-          <w:lang w:eastAsia="cs-CZ"/>
-        </w:rPr>
-        <w:t>fetch</w:t>
-      </w:r>
-      <w:proofErr w:type="spellEnd"/>
-      <w:r>
-        <w:rPr>
-          <w:rFonts w:eastAsia="Times New Roman" w:cs="Times New Roman"/>
-          <w:szCs w:val="24"/>
-          <w:lang w:eastAsia="cs-CZ"/>
-        </w:rPr>
-        <w:t>(</w:t>
-      </w:r>
-      <w:proofErr w:type="gramEnd"/>
-      <w:r>
-        <w:rPr>
-          <w:rFonts w:eastAsia="Times New Roman" w:cs="Times New Roman"/>
-          <w:szCs w:val="24"/>
-          <w:lang w:eastAsia="cs-CZ"/>
-        </w:rPr>
-        <w:t>) pro komunikaci s REST API</w:t>
-      </w:r>
-    </w:p>
-    <w:p>
-      <w:pPr>
-        <w:numPr>
-          <w:ilvl w:val="1"/>
-          <w:numId w:val="3"/>
-        </w:numPr>
-        <w:spacing w:before="100" w:beforeAutospacing="1" w:after="100" w:afterAutospacing="1" w:line="240" w:lineRule="auto"/>
-        <w:rPr>
-          <w:rFonts w:eastAsia="Times New Roman" w:cs="Times New Roman"/>
-          <w:szCs w:val="24"/>
-          <w:lang w:eastAsia="cs-CZ"/>
-        </w:rPr>
-      </w:pPr>
-      <w:r>
-        <w:rPr>
-          <w:rFonts w:eastAsia="Times New Roman" w:cs="Times New Roman"/>
-          <w:szCs w:val="24"/>
-          <w:lang w:eastAsia="cs-CZ"/>
-        </w:rPr>
-        <w:t>animace</w:t>
-      </w:r>
-    </w:p>
-    <w:p>
-      <w:pPr>
-        <w:numPr>
-          <w:ilvl w:val="2"/>
-          <w:numId w:val="3"/>
-        </w:numPr>
-        <w:spacing w:before="100" w:beforeAutospacing="1" w:after="100" w:afterAutospacing="1" w:line="240" w:lineRule="auto"/>
-        <w:rPr>
-          <w:rFonts w:eastAsia="Times New Roman" w:cs="Times New Roman"/>
-          <w:szCs w:val="24"/>
-          <w:lang w:eastAsia="cs-CZ"/>
-        </w:rPr>
-      </w:pPr>
-      <w:r>
-        <w:rPr>
-          <w:rFonts w:eastAsia="Times New Roman" w:cs="Times New Roman"/>
-          <w:szCs w:val="24"/>
-          <w:lang w:eastAsia="cs-CZ"/>
-        </w:rPr>
-        <w:t>postupný přechod z průhlednosti 1 do sytosti</w:t>
-      </w:r>
-    </w:p>
-    <w:p>
-      <w:pPr>
-        <w:numPr>
-          <w:ilvl w:val="2"/>
-          <w:numId w:val="3"/>
-        </w:numPr>
-        <w:spacing w:before="100" w:beforeAutospacing="1" w:after="100" w:afterAutospacing="1" w:line="240" w:lineRule="auto"/>
-        <w:rPr>
-          <w:rFonts w:eastAsia="Times New Roman" w:cs="Times New Roman"/>
-          <w:szCs w:val="24"/>
-          <w:lang w:eastAsia="cs-CZ"/>
-        </w:rPr>
-      </w:pPr>
-      <w:proofErr w:type="spellStart"/>
-      <w:r>
-        <w:rPr>
-          <w:rFonts w:eastAsia="Times New Roman" w:cs="Times New Roman"/>
-          <w:szCs w:val="24"/>
-          <w:lang w:eastAsia="cs-CZ"/>
-        </w:rPr>
-        <w:t>typing</w:t>
-      </w:r>
-      <w:proofErr w:type="spellEnd"/>
-      <w:r>
-        <w:rPr>
-          <w:rFonts w:eastAsia="Times New Roman" w:cs="Times New Roman"/>
-          <w:szCs w:val="24"/>
-          <w:lang w:eastAsia="cs-CZ"/>
-        </w:rPr>
-        <w:t xml:space="preserve"> efekt </w:t>
-      </w:r>
-      <w:r>
-        <w:rPr>
-          <w:rFonts w:eastAsia="Times New Roman" w:cs="Times New Roman"/>
-          <w:szCs w:val="24"/>
-          <w:lang w:eastAsia="cs-CZ"/>
-        </w:rPr>
-        <w:t>nadpisů</w:t>
-      </w:r>
-    </w:p>
-    <w:p>
-      <w:pPr>
-        <w:numPr>
-          <w:ilvl w:val="1"/>
-          <w:numId w:val="3"/>
-        </w:numPr>
-        <w:spacing w:before="100" w:beforeAutospacing="1" w:after="100" w:afterAutospacing="1" w:line="240" w:lineRule="auto"/>
-        <w:rPr>
-          <w:rFonts w:eastAsia="Times New Roman" w:cs="Times New Roman"/>
-          <w:szCs w:val="24"/>
-          <w:lang w:eastAsia="cs-CZ"/>
-        </w:rPr>
-      </w:pPr>
-      <w:r>
-        <w:rPr>
-          <w:rFonts w:eastAsia="Times New Roman" w:cs="Times New Roman"/>
-          <w:szCs w:val="24"/>
-          <w:lang w:eastAsia="cs-CZ"/>
-        </w:rPr>
-        <w:t>login nemá vlastní stránku – zajištěn pouze vyjetím JS</w:t>
-      </w:r>
-    </w:p>
-    <w:p>
-      <w:pPr>
-        <w:numPr>
-          <w:ilvl w:val="0"/>
-          <w:numId w:val="3"/>
-        </w:numPr>
-        <w:spacing w:before="100" w:beforeAutospacing="1" w:after="100" w:afterAutospacing="1" w:line="240" w:lineRule="auto"/>
-        <w:rPr>
-          <w:rFonts w:eastAsia="Times New Roman" w:cs="Times New Roman"/>
-          <w:szCs w:val="24"/>
-          <w:lang w:eastAsia="cs-CZ"/>
-        </w:rPr>
-      </w:pPr>
-      <w:proofErr w:type="spellStart"/>
-      <w:r>
-        <w:rPr>
-          <w:rFonts w:eastAsia="Times New Roman" w:cs="Times New Roman"/>
-          <w:b/>
-          <w:bCs/>
-          <w:szCs w:val="24"/>
-          <w:lang w:eastAsia="cs-CZ"/>
-        </w:rPr>
         <w:t>CKEditor</w:t>
       </w:r>
-      <w:proofErr w:type="spellEnd"/>
     </w:p>
     <w:p>
       <w:pPr>
@@ -1033,7 +979,6 @@
           <w:lang w:eastAsia="cs-CZ"/>
         </w:rPr>
       </w:pPr>
-      <w:proofErr w:type="spellStart"/>
       <w:r>
         <w:rPr>
           <w:rFonts w:eastAsia="Times New Roman" w:cs="Times New Roman"/>
@@ -1045,7 +990,6 @@
         </w:rPr>
         <w:t>Backend</w:t>
       </w:r>
-      <w:proofErr w:type="spellEnd"/>
     </w:p>
     <w:p>
       <w:pPr>
@@ -1068,6 +1012,7 @@
           <w:szCs w:val="24"/>
           <w:lang w:eastAsia="cs-CZ"/>
         </w:rPr>
+        <w:lastRenderedPageBreak/>
         <w:t>PHP 8</w:t>
       </w:r>
     </w:p>
@@ -1090,19 +1035,8 @@
           <w:szCs w:val="24"/>
           <w:lang w:eastAsia="cs-CZ"/>
         </w:rPr>
-        <w:lastRenderedPageBreak/>
-        <w:t xml:space="preserve">Vyžadováno </w:t>
-      </w:r>
-      <w:proofErr w:type="spellStart"/>
-      <w:r>
-        <w:rPr>
-          <w:rFonts w:eastAsia="Times New Roman" w:cs="Times New Roman"/>
-          <w:szCs w:val="24"/>
-          <w:lang w:eastAsia="cs-CZ"/>
-        </w:rPr>
-        <w:t>Composerem</w:t>
-      </w:r>
-      <w:proofErr w:type="spellEnd"/>
+        <w:t>Vyžadováno Composerem</w:t>
+      </w:r>
     </w:p>
     <w:p>
       <w:pPr>
@@ -1149,34 +1083,14 @@
           <w:lang w:eastAsia="cs-CZ"/>
         </w:rPr>
       </w:pPr>
-      <w:proofErr w:type="spellStart"/>
-      <w:r>
-        <w:rPr>
-          <w:rFonts w:eastAsia="Times New Roman" w:cs="Times New Roman"/>
-          <w:szCs w:val="24"/>
-          <w:lang w:eastAsia="cs-CZ"/>
-        </w:rPr>
-        <w:t>Controller</w:t>
-      </w:r>
-      <w:proofErr w:type="spellEnd"/>
-      <w:r>
-        <w:rPr>
-          <w:rFonts w:eastAsia="Times New Roman" w:cs="Times New Roman"/>
-          <w:szCs w:val="24"/>
-          <w:lang w:eastAsia="cs-CZ"/>
-        </w:rPr>
-        <w:t xml:space="preserve"> → Model → </w:t>
-      </w:r>
-      <w:proofErr w:type="spellStart"/>
-      <w:r>
-        <w:rPr>
-          <w:rFonts w:eastAsia="Times New Roman" w:cs="Times New Roman"/>
-          <w:szCs w:val="24"/>
-          <w:lang w:eastAsia="cs-CZ"/>
-        </w:rPr>
-        <w:t>View</w:t>
-      </w:r>
-      <w:proofErr w:type="spellEnd"/>
+      <w:r>
+        <w:rPr>
+          <w:rFonts w:eastAsia="Times New Roman" w:cs="Times New Roman"/>
+          <w:szCs w:val="24"/>
+          <w:lang w:eastAsia="cs-CZ"/>
+        </w:rPr>
+        <w:t>Controller → Model → View</w:t>
+      </w:r>
     </w:p>
     <w:p>
       <w:pPr>
@@ -1191,7 +1105,6 @@
           <w:lang w:eastAsia="cs-CZ"/>
         </w:rPr>
       </w:pPr>
-      <w:proofErr w:type="spellStart"/>
       <w:r>
         <w:rPr>
           <w:rFonts w:eastAsia="Times New Roman" w:cs="Times New Roman"/>
@@ -1200,9 +1113,22 @@
           <w:szCs w:val="24"/>
           <w:lang w:eastAsia="cs-CZ"/>
         </w:rPr>
-        <w:t>Twig</w:t>
-      </w:r>
-      <w:proofErr w:type="spellEnd"/>
+        <w:t>Twig šablonovací systém</w:t>
+      </w:r>
+    </w:p>
+    <w:p>
+      <w:pPr>
+        <w:numPr>
+          <w:ilvl w:val="0"/>
+          <w:numId w:val="4"/>
+        </w:numPr>
+        <w:spacing w:before="100" w:beforeAutospacing="1" w:after="100" w:afterAutospacing="1" w:line="240" w:lineRule="auto"/>
+        <w:rPr>
+          <w:rFonts w:eastAsia="Times New Roman" w:cs="Times New Roman"/>
+          <w:szCs w:val="24"/>
+          <w:lang w:eastAsia="cs-CZ"/>
+        </w:rPr>
+      </w:pPr>
       <w:r>
         <w:rPr>
           <w:rFonts w:eastAsia="Times New Roman" w:cs="Times New Roman"/>
@@ -1211,9 +1137,30 @@
           <w:szCs w:val="24"/>
           <w:lang w:eastAsia="cs-CZ"/>
         </w:rPr>
+        <w:t>MySQL</w:t>
+      </w:r>
+      <w:r>
+        <w:rPr>
+          <w:rFonts w:eastAsia="Times New Roman" w:cs="Times New Roman"/>
+          <w:szCs w:val="24"/>
+          <w:lang w:eastAsia="cs-CZ"/>
+        </w:rPr>
         <w:t xml:space="preserve"> </w:t>
       </w:r>
-      <w:proofErr w:type="spellStart"/>
+    </w:p>
+    <w:p>
+      <w:pPr>
+        <w:numPr>
+          <w:ilvl w:val="0"/>
+          <w:numId w:val="4"/>
+        </w:numPr>
+        <w:spacing w:before="100" w:beforeAutospacing="1" w:after="100" w:afterAutospacing="1" w:line="240" w:lineRule="auto"/>
+        <w:rPr>
+          <w:rFonts w:eastAsia="Times New Roman" w:cs="Times New Roman"/>
+          <w:szCs w:val="24"/>
+          <w:lang w:eastAsia="cs-CZ"/>
+        </w:rPr>
+      </w:pPr>
       <w:r>
         <w:rPr>
           <w:rFonts w:eastAsia="Times New Roman" w:cs="Times New Roman"/>
@@ -1222,9 +1169,52 @@
           <w:szCs w:val="24"/>
           <w:lang w:eastAsia="cs-CZ"/>
         </w:rPr>
-        <w:t>šablonovací</w:t>
-      </w:r>
-      <w:proofErr w:type="spellEnd"/>
+        <w:t>Composer + HTMLPurifier</w:t>
+      </w:r>
+      <w:r>
+        <w:rPr>
+          <w:rFonts w:eastAsia="Times New Roman" w:cs="Times New Roman"/>
+          <w:szCs w:val="24"/>
+          <w:lang w:eastAsia="cs-CZ"/>
+        </w:rPr>
+        <w:t xml:space="preserve"> </w:t>
+      </w:r>
+    </w:p>
+    <w:p>
+      <w:pPr>
+        <w:numPr>
+          <w:ilvl w:val="1"/>
+          <w:numId w:val="4"/>
+        </w:numPr>
+        <w:spacing w:before="100" w:beforeAutospacing="1" w:after="100" w:afterAutospacing="1" w:line="240" w:lineRule="auto"/>
+        <w:rPr>
+          <w:rFonts w:eastAsia="Times New Roman" w:cs="Times New Roman"/>
+          <w:szCs w:val="24"/>
+          <w:lang w:eastAsia="cs-CZ"/>
+        </w:rPr>
+      </w:pPr>
+      <w:r>
+        <w:rPr>
+          <w:rFonts w:eastAsia="Times New Roman" w:cs="Times New Roman"/>
+          <w:szCs w:val="24"/>
+          <w:lang w:eastAsia="cs-CZ"/>
+        </w:rPr>
+        <w:t>ochrana proti XSS v recenzích</w:t>
+      </w:r>
+    </w:p>
+    <w:p>
+      <w:pPr>
+        <w:numPr>
+          <w:ilvl w:val="0"/>
+          <w:numId w:val="4"/>
+        </w:numPr>
+        <w:spacing w:before="100" w:beforeAutospacing="1" w:after="100" w:afterAutospacing="1" w:line="240" w:lineRule="auto"/>
+        <w:rPr>
+          <w:rFonts w:eastAsia="Times New Roman" w:cs="Times New Roman"/>
+          <w:szCs w:val="24"/>
+          <w:lang w:eastAsia="cs-CZ"/>
+        </w:rPr>
+      </w:pPr>
       <w:r>
         <w:rPr>
           <w:rFonts w:eastAsia="Times New Roman" w:cs="Times New Roman"/>
@@ -1233,23 +1223,8 @@
           <w:szCs w:val="24"/>
           <w:lang w:eastAsia="cs-CZ"/>
         </w:rPr>
-        <w:t xml:space="preserve"> systém</w:t>
-      </w:r>
-    </w:p>
-    <w:p>
-      <w:pPr>
-        <w:numPr>
-          <w:ilvl w:val="0"/>
-          <w:numId w:val="4"/>
-        </w:numPr>
-        <w:spacing w:before="100" w:beforeAutospacing="1" w:after="100" w:afterAutospacing="1" w:line="240" w:lineRule="auto"/>
-        <w:rPr>
-          <w:rFonts w:eastAsia="Times New Roman" w:cs="Times New Roman"/>
-          <w:szCs w:val="24"/>
-          <w:lang w:eastAsia="cs-CZ"/>
-        </w:rPr>
-      </w:pPr>
-      <w:proofErr w:type="spellStart"/>
+        <w:t xml:space="preserve">password_hash() </w:t>
+      </w:r>
       <w:r>
         <w:rPr>
           <w:rFonts w:eastAsia="Times New Roman" w:cs="Times New Roman"/>
@@ -1258,32 +1233,8 @@
           <w:szCs w:val="24"/>
           <w:lang w:eastAsia="cs-CZ"/>
         </w:rPr>
-        <w:t>MySQL</w:t>
-      </w:r>
-      <w:proofErr w:type="spellEnd"/>
-      <w:r>
-        <w:rPr>
-          <w:rFonts w:eastAsia="Times New Roman" w:cs="Times New Roman"/>
-          <w:szCs w:val="24"/>
-          <w:lang w:eastAsia="cs-CZ"/>
-        </w:rPr>
-        <w:t xml:space="preserve"> </w:t>
-      </w:r>
-    </w:p>
-    <w:p>
-      <w:pPr>
-        <w:numPr>
-          <w:ilvl w:val="0"/>
-          <w:numId w:val="4"/>
-        </w:numPr>
-        <w:spacing w:before="100" w:beforeAutospacing="1" w:after="100" w:afterAutospacing="1" w:line="240" w:lineRule="auto"/>
-        <w:rPr>
-          <w:rFonts w:eastAsia="Times New Roman" w:cs="Times New Roman"/>
-          <w:szCs w:val="24"/>
-          <w:lang w:eastAsia="cs-CZ"/>
-        </w:rPr>
-      </w:pPr>
-      <w:proofErr w:type="spellStart"/>
+        <w:t>a</w:t>
+      </w:r>
       <w:r>
         <w:rPr>
           <w:rFonts w:eastAsia="Times New Roman" w:cs="Times New Roman"/>
@@ -1292,182 +1243,7 @@
           <w:szCs w:val="24"/>
           <w:lang w:eastAsia="cs-CZ"/>
         </w:rPr>
-        <w:t>Composer</w:t>
-      </w:r>
-      <w:proofErr w:type="spellEnd"/>
-      <w:r>
-        <w:rPr>
-          <w:rFonts w:eastAsia="Times New Roman" w:cs="Times New Roman"/>
-          <w:b/>
-          <w:bCs/>
-          <w:szCs w:val="24"/>
-          <w:lang w:eastAsia="cs-CZ"/>
-        </w:rPr>
-        <w:t xml:space="preserve"> + </w:t>
-      </w:r>
-      <w:proofErr w:type="spellStart"/>
-      <w:r>
-        <w:rPr>
-          <w:rFonts w:eastAsia="Times New Roman" w:cs="Times New Roman"/>
-          <w:b/>
-          <w:bCs/>
-          <w:szCs w:val="24"/>
-          <w:lang w:eastAsia="cs-CZ"/>
-        </w:rPr>
-        <w:t>HTMLPurifier</w:t>
-      </w:r>
-      <w:proofErr w:type="spellEnd"/>
-      <w:r>
-        <w:rPr>
-          <w:rFonts w:eastAsia="Times New Roman" w:cs="Times New Roman"/>
-          <w:szCs w:val="24"/>
-          <w:lang w:eastAsia="cs-CZ"/>
-        </w:rPr>
-        <w:t xml:space="preserve"> </w:t>
-      </w:r>
-    </w:p>
-    <w:p>
-      <w:pPr>
-        <w:numPr>
-          <w:ilvl w:val="1"/>
-          <w:numId w:val="4"/>
-        </w:numPr>
-        <w:spacing w:before="100" w:beforeAutospacing="1" w:after="100" w:afterAutospacing="1" w:line="240" w:lineRule="auto"/>
-        <w:rPr>
-          <w:rFonts w:eastAsia="Times New Roman" w:cs="Times New Roman"/>
-          <w:szCs w:val="24"/>
-          <w:lang w:eastAsia="cs-CZ"/>
-        </w:rPr>
-      </w:pPr>
-      <w:r>
-        <w:rPr>
-          <w:rFonts w:eastAsia="Times New Roman" w:cs="Times New Roman"/>
-          <w:szCs w:val="24"/>
-          <w:lang w:eastAsia="cs-CZ"/>
-        </w:rPr>
-        <w:t>ochrana proti XSS v recenzích</w:t>
-      </w:r>
-    </w:p>
-    <w:p>
-      <w:pPr>
-        <w:numPr>
-          <w:ilvl w:val="0"/>
-          <w:numId w:val="4"/>
-        </w:numPr>
-        <w:spacing w:before="100" w:beforeAutospacing="1" w:after="100" w:afterAutospacing="1" w:line="240" w:lineRule="auto"/>
-        <w:rPr>
-          <w:rFonts w:eastAsia="Times New Roman" w:cs="Times New Roman"/>
-          <w:szCs w:val="24"/>
-          <w:lang w:eastAsia="cs-CZ"/>
-        </w:rPr>
-      </w:pPr>
-      <w:proofErr w:type="spellStart"/>
-      <w:r>
-        <w:rPr>
-          <w:rFonts w:eastAsia="Times New Roman" w:cs="Times New Roman"/>
-          <w:b/>
-          <w:bCs/>
-          <w:szCs w:val="24"/>
-          <w:lang w:eastAsia="cs-CZ"/>
-        </w:rPr>
-        <w:t>password_</w:t>
-      </w:r>
-      <w:proofErr w:type="gramStart"/>
-      <w:r>
-        <w:rPr>
-          <w:rFonts w:eastAsia="Times New Roman" w:cs="Times New Roman"/>
-          <w:b/>
-          <w:bCs/>
-          <w:szCs w:val="24"/>
-          <w:lang w:eastAsia="cs-CZ"/>
-        </w:rPr>
-        <w:t>hash</w:t>
-      </w:r>
-      <w:proofErr w:type="spellEnd"/>
-      <w:r>
-        <w:rPr>
-          <w:rFonts w:eastAsia="Times New Roman" w:cs="Times New Roman"/>
-          <w:b/>
-          <w:bCs/>
-          <w:szCs w:val="24"/>
-          <w:lang w:eastAsia="cs-CZ"/>
-        </w:rPr>
-        <w:t>(</w:t>
-      </w:r>
-      <w:proofErr w:type="gramEnd"/>
-      <w:r>
-        <w:rPr>
-          <w:rFonts w:eastAsia="Times New Roman" w:cs="Times New Roman"/>
-          <w:b/>
-          <w:bCs/>
-          <w:szCs w:val="24"/>
-          <w:lang w:eastAsia="cs-CZ"/>
-        </w:rPr>
-        <w:t xml:space="preserve">) </w:t>
-      </w:r>
-      <w:r>
-        <w:rPr>
-          <w:rFonts w:eastAsia="Times New Roman" w:cs="Times New Roman"/>
-          <w:b/>
-          <w:bCs/>
-          <w:szCs w:val="24"/>
-          <w:lang w:eastAsia="cs-CZ"/>
-        </w:rPr>
-        <w:t>a</w:t>
-      </w:r>
-      <w:r>
-        <w:rPr>
-          <w:rFonts w:eastAsia="Times New Roman" w:cs="Times New Roman"/>
-          <w:b/>
-          <w:bCs/>
-          <w:szCs w:val="24"/>
-          <w:lang w:eastAsia="cs-CZ"/>
-        </w:rPr>
-        <w:t xml:space="preserve"> </w:t>
-      </w:r>
-      <w:proofErr w:type="spellStart"/>
-      <w:r>
-        <w:rPr>
-          <w:rFonts w:eastAsia="Times New Roman" w:cs="Times New Roman"/>
-          <w:b/>
-          <w:bCs/>
-          <w:szCs w:val="24"/>
-          <w:lang w:eastAsia="cs-CZ"/>
-        </w:rPr>
-        <w:t>password_</w:t>
-      </w:r>
-      <w:proofErr w:type="gramStart"/>
-      <w:r>
-        <w:rPr>
-          <w:rFonts w:eastAsia="Times New Roman" w:cs="Times New Roman"/>
-          <w:b/>
-          <w:bCs/>
-          <w:szCs w:val="24"/>
-          <w:lang w:eastAsia="cs-CZ"/>
-        </w:rPr>
-        <w:t>verify</w:t>
-      </w:r>
-      <w:proofErr w:type="spellEnd"/>
-      <w:r>
-        <w:rPr>
-          <w:rFonts w:eastAsia="Times New Roman" w:cs="Times New Roman"/>
-          <w:b/>
-          <w:bCs/>
-          <w:szCs w:val="24"/>
-          <w:lang w:eastAsia="cs-CZ"/>
-        </w:rPr>
-        <w:t>(</w:t>
-      </w:r>
-      <w:proofErr w:type="gramEnd"/>
-      <w:r>
-        <w:rPr>
-          <w:rFonts w:eastAsia="Times New Roman" w:cs="Times New Roman"/>
-          <w:b/>
-          <w:bCs/>
-          <w:szCs w:val="24"/>
-          <w:lang w:eastAsia="cs-CZ"/>
-        </w:rPr>
-        <w:t>)</w:t>
+        <w:t xml:space="preserve"> password_verify()</w:t>
       </w:r>
       <w:r>
         <w:rPr>
@@ -1674,9 +1450,60 @@
           <w:szCs w:val="24"/>
           <w:lang w:eastAsia="cs-CZ"/>
         </w:rPr>
-        <w:t xml:space="preserve">SQL </w:t>
-      </w:r>
-      <w:proofErr w:type="spellStart"/>
+        <w:t>SQL injection</w:t>
+      </w:r>
+      <w:r>
+        <w:rPr>
+          <w:rFonts w:eastAsia="Times New Roman" w:cs="Times New Roman"/>
+          <w:szCs w:val="24"/>
+          <w:lang w:eastAsia="cs-CZ"/>
+        </w:rPr>
+        <w:t xml:space="preserve"> </w:t>
+      </w:r>
+    </w:p>
+    <w:p>
+      <w:pPr>
+        <w:numPr>
+          <w:ilvl w:val="1"/>
+          <w:numId w:val="5"/>
+        </w:numPr>
+        <w:spacing w:before="100" w:beforeAutospacing="1" w:after="100" w:afterAutospacing="1" w:line="240" w:lineRule="auto"/>
+        <w:rPr>
+          <w:rFonts w:eastAsia="Times New Roman" w:cs="Times New Roman"/>
+          <w:szCs w:val="24"/>
+          <w:lang w:eastAsia="cs-CZ"/>
+        </w:rPr>
+      </w:pPr>
+      <w:r>
+        <w:rPr>
+          <w:rFonts w:eastAsia="Times New Roman" w:cs="Times New Roman"/>
+          <w:szCs w:val="24"/>
+          <w:lang w:eastAsia="cs-CZ"/>
+        </w:rPr>
+        <w:t>prepared statements</w:t>
+      </w:r>
+    </w:p>
+    <w:p>
+      <w:pPr>
+        <w:numPr>
+          <w:ilvl w:val="0"/>
+          <w:numId w:val="5"/>
+        </w:numPr>
+        <w:spacing w:before="100" w:beforeAutospacing="1" w:after="100" w:afterAutospacing="1" w:line="240" w:lineRule="auto"/>
+        <w:rPr>
+          <w:rFonts w:eastAsia="Times New Roman" w:cs="Times New Roman"/>
+          <w:szCs w:val="24"/>
+          <w:lang w:eastAsia="cs-CZ"/>
+        </w:rPr>
+      </w:pPr>
+      <w:r>
+        <w:rPr>
+          <w:rFonts w:eastAsia="Times New Roman" w:cs="Times New Roman"/>
+          <w:szCs w:val="24"/>
+          <w:lang w:eastAsia="cs-CZ"/>
+        </w:rPr>
+        <w:t xml:space="preserve">Ošetření </w:t>
+      </w:r>
       <w:r>
         <w:rPr>
           <w:rFonts w:eastAsia="Times New Roman" w:cs="Times New Roman"/>
@@ -1685,9 +1512,8 @@
           <w:szCs w:val="24"/>
           <w:lang w:eastAsia="cs-CZ"/>
         </w:rPr>
-        <w:t>injection</w:t>
-      </w:r>
-      <w:proofErr w:type="spellEnd"/>
+        <w:t>XSS</w:t>
+      </w:r>
       <w:r>
         <w:rPr>
           <w:rFonts w:eastAsia="Times New Roman" w:cs="Times New Roman"/>
@@ -1710,73 +1536,13 @@
           <w:lang w:eastAsia="cs-CZ"/>
         </w:rPr>
       </w:pPr>
-      <w:proofErr w:type="spellStart"/>
-      <w:r>
-        <w:rPr>
-          <w:rFonts w:eastAsia="Times New Roman" w:cs="Times New Roman"/>
-          <w:szCs w:val="24"/>
-          <w:lang w:eastAsia="cs-CZ"/>
-        </w:rPr>
-        <w:t>prepared</w:t>
-      </w:r>
-      <w:proofErr w:type="spellEnd"/>
-      <w:r>
-        <w:rPr>
-          <w:rFonts w:eastAsia="Times New Roman" w:cs="Times New Roman"/>
-          <w:szCs w:val="24"/>
-          <w:lang w:eastAsia="cs-CZ"/>
-        </w:rPr>
-        <w:t xml:space="preserve"> </w:t>
-      </w:r>
-      <w:proofErr w:type="spellStart"/>
-      <w:r>
-        <w:rPr>
-          <w:rFonts w:eastAsia="Times New Roman" w:cs="Times New Roman"/>
-          <w:szCs w:val="24"/>
-          <w:lang w:eastAsia="cs-CZ"/>
-        </w:rPr>
-        <w:t>statements</w:t>
-      </w:r>
-      <w:proofErr w:type="spellEnd"/>
-    </w:p>
-    <w:p>
-      <w:pPr>
-        <w:numPr>
-          <w:ilvl w:val="0"/>
-          <w:numId w:val="5"/>
-        </w:numPr>
-        <w:spacing w:before="100" w:beforeAutospacing="1" w:after="100" w:afterAutospacing="1" w:line="240" w:lineRule="auto"/>
-        <w:rPr>
-          <w:rFonts w:eastAsia="Times New Roman" w:cs="Times New Roman"/>
-          <w:szCs w:val="24"/>
-          <w:lang w:eastAsia="cs-CZ"/>
-        </w:rPr>
-      </w:pPr>
-      <w:r>
-        <w:rPr>
-          <w:rFonts w:eastAsia="Times New Roman" w:cs="Times New Roman"/>
-          <w:szCs w:val="24"/>
-          <w:lang w:eastAsia="cs-CZ"/>
-        </w:rPr>
-        <w:t xml:space="preserve">Ošetření </w:t>
-      </w:r>
-      <w:r>
-        <w:rPr>
-          <w:rFonts w:eastAsia="Times New Roman" w:cs="Times New Roman"/>
-          <w:b/>
-          <w:bCs/>
-          <w:szCs w:val="24"/>
-          <w:lang w:eastAsia="cs-CZ"/>
-        </w:rPr>
-        <w:t>XSS</w:t>
-      </w:r>
-      <w:r>
-        <w:rPr>
-          <w:rFonts w:eastAsia="Times New Roman" w:cs="Times New Roman"/>
-          <w:szCs w:val="24"/>
-          <w:lang w:eastAsia="cs-CZ"/>
-        </w:rPr>
-        <w:t xml:space="preserve"> </w:t>
+      <w:r>
+        <w:rPr>
+          <w:rFonts w:eastAsia="Times New Roman" w:cs="Times New Roman"/>
+          <w:szCs w:val="24"/>
+          <w:lang w:eastAsia="cs-CZ"/>
+        </w:rPr>
+        <w:t>HTMLPurifier</w:t>
       </w:r>
     </w:p>
     <w:p>
@@ -1792,31 +1558,6 @@
           <w:lang w:eastAsia="cs-CZ"/>
         </w:rPr>
       </w:pPr>
-      <w:proofErr w:type="spellStart"/>
-      <w:r>
-        <w:rPr>
-          <w:rFonts w:eastAsia="Times New Roman" w:cs="Times New Roman"/>
-          <w:szCs w:val="24"/>
-          <w:lang w:eastAsia="cs-CZ"/>
-        </w:rPr>
-        <w:t>HTMLPurifier</w:t>
-      </w:r>
-      <w:proofErr w:type="spellEnd"/>
-    </w:p>
-    <w:p>
-      <w:pPr>
-        <w:numPr>
-          <w:ilvl w:val="1"/>
-          <w:numId w:val="5"/>
-        </w:numPr>
-        <w:spacing w:before="100" w:beforeAutospacing="1" w:after="100" w:afterAutospacing="1" w:line="240" w:lineRule="auto"/>
-        <w:rPr>
-          <w:rFonts w:eastAsia="Times New Roman" w:cs="Times New Roman"/>
-          <w:szCs w:val="24"/>
-          <w:lang w:eastAsia="cs-CZ"/>
-        </w:rPr>
-      </w:pPr>
-      <w:proofErr w:type="spellStart"/>
       <w:r>
         <w:rPr>
           <w:rFonts w:eastAsia="Times New Roman" w:cs="Times New Roman"/>
@@ -1825,7 +1566,6 @@
         </w:rPr>
         <w:t>htmlspecialchars</w:t>
       </w:r>
-      <w:proofErr w:type="spellEnd"/>
     </w:p>
     <w:p>
       <w:pPr>
@@ -1896,23 +1636,13 @@
           <w:lang w:eastAsia="cs-CZ"/>
         </w:rPr>
       </w:pPr>
-      <w:proofErr w:type="spellStart"/>
-      <w:r>
-        <w:rPr>
-          <w:rFonts w:eastAsia="Times New Roman" w:cs="Times New Roman"/>
-          <w:szCs w:val="24"/>
-          <w:lang w:eastAsia="cs-CZ"/>
-        </w:rPr>
-        <w:t>app</w:t>
-      </w:r>
-      <w:proofErr w:type="spellEnd"/>
-      <w:r>
-        <w:rPr>
-          <w:rFonts w:eastAsia="Times New Roman" w:cs="Times New Roman"/>
-          <w:szCs w:val="24"/>
-          <w:lang w:eastAsia="cs-CZ"/>
-        </w:rPr>
-        <w:t>/</w:t>
+      <w:r>
+        <w:rPr>
+          <w:rFonts w:eastAsia="Times New Roman" w:cs="Times New Roman"/>
+          <w:szCs w:val="24"/>
+          <w:lang w:eastAsia="cs-CZ"/>
+        </w:rPr>
+        <w:t>app/</w:t>
       </w:r>
     </w:p>
     <w:p>
@@ -1947,23 +1677,13 @@
           <w:lang w:eastAsia="cs-CZ"/>
         </w:rPr>
       </w:pPr>
-      <w:proofErr w:type="spellStart"/>
-      <w:r>
-        <w:rPr>
-          <w:rFonts w:eastAsia="Times New Roman" w:cs="Times New Roman"/>
-          <w:szCs w:val="24"/>
-          <w:lang w:eastAsia="cs-CZ"/>
-        </w:rPr>
-        <w:t>api</w:t>
-      </w:r>
-      <w:proofErr w:type="spellEnd"/>
-      <w:r>
-        <w:rPr>
-          <w:rFonts w:eastAsia="Times New Roman" w:cs="Times New Roman"/>
-          <w:szCs w:val="24"/>
-          <w:lang w:eastAsia="cs-CZ"/>
-        </w:rPr>
-        <w:t>/</w:t>
+      <w:r>
+        <w:rPr>
+          <w:rFonts w:eastAsia="Times New Roman" w:cs="Times New Roman"/>
+          <w:szCs w:val="24"/>
+          <w:lang w:eastAsia="cs-CZ"/>
+        </w:rPr>
+        <w:t>api/</w:t>
       </w:r>
     </w:p>
     <w:p>
@@ -1998,23 +1718,13 @@
           <w:lang w:eastAsia="cs-CZ"/>
         </w:rPr>
       </w:pPr>
-      <w:proofErr w:type="spellStart"/>
-      <w:r>
-        <w:rPr>
-          <w:rFonts w:eastAsia="Times New Roman" w:cs="Times New Roman"/>
-          <w:szCs w:val="24"/>
-          <w:lang w:eastAsia="cs-CZ"/>
-        </w:rPr>
-        <w:t>posts.php</w:t>
-      </w:r>
-      <w:proofErr w:type="spellEnd"/>
-      <w:r>
-        <w:rPr>
-          <w:rFonts w:eastAsia="Times New Roman" w:cs="Times New Roman"/>
-          <w:szCs w:val="24"/>
-          <w:lang w:eastAsia="cs-CZ"/>
-        </w:rPr>
-        <w:t xml:space="preserve">          </w:t>
+      <w:r>
+        <w:rPr>
+          <w:rFonts w:eastAsia="Times New Roman" w:cs="Times New Roman"/>
+          <w:szCs w:val="24"/>
+          <w:lang w:eastAsia="cs-CZ"/>
+        </w:rPr>
+        <w:t xml:space="preserve">posts.php          </w:t>
       </w:r>
     </w:p>
     <w:p>
@@ -2090,7 +1800,6 @@
           <w:lang w:eastAsia="cs-CZ"/>
         </w:rPr>
       </w:pPr>
-      <w:proofErr w:type="spellStart"/>
       <w:r>
         <w:rPr>
           <w:rFonts w:eastAsia="Times New Roman" w:cs="Times New Roman"/>
@@ -2099,7 +1808,6 @@
         </w:rPr>
         <w:t>reviews.php</w:t>
       </w:r>
-      <w:proofErr w:type="spellEnd"/>
     </w:p>
     <w:p>
       <w:pPr>
@@ -2174,7 +1882,6 @@
           <w:lang w:eastAsia="cs-CZ"/>
         </w:rPr>
       </w:pPr>
-      <w:proofErr w:type="spellStart"/>
       <w:r>
         <w:rPr>
           <w:rFonts w:eastAsia="Times New Roman" w:cs="Times New Roman"/>
@@ -2191,7 +1898,6 @@
         </w:rPr>
         <w:t>php</w:t>
       </w:r>
-      <w:proofErr w:type="spellEnd"/>
     </w:p>
     <w:p>
       <w:pPr>
@@ -2266,23 +1972,13 @@
           <w:lang w:eastAsia="cs-CZ"/>
         </w:rPr>
       </w:pPr>
-      <w:proofErr w:type="spellStart"/>
-      <w:r>
-        <w:rPr>
-          <w:rFonts w:eastAsia="Times New Roman" w:cs="Times New Roman"/>
-          <w:szCs w:val="24"/>
-          <w:lang w:eastAsia="cs-CZ"/>
-        </w:rPr>
-        <w:t>config</w:t>
-      </w:r>
-      <w:proofErr w:type="spellEnd"/>
-      <w:r>
-        <w:rPr>
-          <w:rFonts w:eastAsia="Times New Roman" w:cs="Times New Roman"/>
-          <w:szCs w:val="24"/>
-          <w:lang w:eastAsia="cs-CZ"/>
-        </w:rPr>
-        <w:t>/</w:t>
+      <w:r>
+        <w:rPr>
+          <w:rFonts w:eastAsia="Times New Roman" w:cs="Times New Roman"/>
+          <w:szCs w:val="24"/>
+          <w:lang w:eastAsia="cs-CZ"/>
+        </w:rPr>
+        <w:t>config/</w:t>
       </w:r>
     </w:p>
     <w:p>
@@ -2317,7 +2013,6 @@
           <w:lang w:eastAsia="cs-CZ"/>
         </w:rPr>
       </w:pPr>
-      <w:proofErr w:type="spellStart"/>
       <w:r>
         <w:rPr>
           <w:rFonts w:eastAsia="Times New Roman" w:cs="Times New Roman"/>
@@ -2326,7 +2021,6 @@
         </w:rPr>
         <w:t>config.php</w:t>
       </w:r>
-      <w:proofErr w:type="spellEnd"/>
     </w:p>
     <w:p>
       <w:pPr>
@@ -2407,18 +2101,8 @@
           <w:szCs w:val="24"/>
           <w:lang w:eastAsia="cs-CZ"/>
         </w:rPr>
-        <w:t xml:space="preserve">Vytvoří PDO </w:t>
-      </w:r>
-      <w:proofErr w:type="spellStart"/>
-      <w:r>
-        <w:rPr>
-          <w:rFonts w:eastAsia="Times New Roman" w:cs="Times New Roman"/>
-          <w:szCs w:val="24"/>
-          <w:lang w:eastAsia="cs-CZ"/>
-        </w:rPr>
-        <w:t>Singleton</w:t>
-      </w:r>
-      <w:proofErr w:type="spellEnd"/>
+        <w:t>Vytvoří PDO Singleton</w:t>
+      </w:r>
     </w:p>
     <w:p>
       <w:pPr>
@@ -2493,7 +2177,6 @@
           <w:lang w:eastAsia="cs-CZ"/>
         </w:rPr>
       </w:pPr>
-      <w:proofErr w:type="spellStart"/>
       <w:r>
         <w:rPr>
           <w:rFonts w:eastAsia="Times New Roman" w:cs="Times New Roman"/>
@@ -2502,7 +2185,6 @@
         </w:rPr>
         <w:t>db.php</w:t>
       </w:r>
-      <w:proofErr w:type="spellEnd"/>
     </w:p>
     <w:p>
       <w:pPr>
@@ -2601,23 +2283,13 @@
           <w:lang w:eastAsia="cs-CZ"/>
         </w:rPr>
       </w:pPr>
-      <w:proofErr w:type="spellStart"/>
-      <w:r>
-        <w:rPr>
-          <w:rFonts w:eastAsia="Times New Roman" w:cs="Times New Roman"/>
-          <w:szCs w:val="24"/>
-          <w:lang w:eastAsia="cs-CZ"/>
-        </w:rPr>
-        <w:t>controllers</w:t>
-      </w:r>
-      <w:proofErr w:type="spellEnd"/>
-      <w:r>
-        <w:rPr>
-          <w:rFonts w:eastAsia="Times New Roman" w:cs="Times New Roman"/>
-          <w:szCs w:val="24"/>
-          <w:lang w:eastAsia="cs-CZ"/>
-        </w:rPr>
-        <w:t>/</w:t>
+      <w:r>
+        <w:rPr>
+          <w:rFonts w:eastAsia="Times New Roman" w:cs="Times New Roman"/>
+          <w:szCs w:val="24"/>
+          <w:lang w:eastAsia="cs-CZ"/>
+        </w:rPr>
+        <w:t>controllers/</w:t>
       </w:r>
     </w:p>
     <w:p>
@@ -2652,7 +2324,6 @@
           <w:lang w:eastAsia="cs-CZ"/>
         </w:rPr>
       </w:pPr>
-      <w:proofErr w:type="spellStart"/>
       <w:r>
         <w:rPr>
           <w:rFonts w:eastAsia="Times New Roman" w:cs="Times New Roman"/>
@@ -2661,7 +2332,6 @@
         </w:rPr>
         <w:t>ArticlesController.php</w:t>
       </w:r>
-      <w:proofErr w:type="spellEnd"/>
     </w:p>
     <w:p>
       <w:pPr>
@@ -2695,7 +2365,6 @@
           <w:lang w:eastAsia="cs-CZ"/>
         </w:rPr>
       </w:pPr>
-      <w:proofErr w:type="spellStart"/>
       <w:r>
         <w:rPr>
           <w:rFonts w:eastAsia="Times New Roman" w:cs="Times New Roman"/>
@@ -2704,7 +2373,6 @@
         </w:rPr>
         <w:t>DeletePostController.php</w:t>
       </w:r>
-      <w:proofErr w:type="spellEnd"/>
     </w:p>
     <w:p>
       <w:pPr>
@@ -2719,7 +2387,6 @@
           <w:lang w:eastAsia="cs-CZ"/>
         </w:rPr>
       </w:pPr>
-      <w:proofErr w:type="spellStart"/>
       <w:r>
         <w:rPr>
           <w:rFonts w:eastAsia="Times New Roman" w:cs="Times New Roman"/>
@@ -2744,7 +2411,6 @@
         </w:rPr>
         <w:t>Controller.php</w:t>
       </w:r>
-      <w:proofErr w:type="spellEnd"/>
     </w:p>
     <w:p>
       <w:pPr>
@@ -2778,7 +2444,6 @@
           <w:lang w:eastAsia="cs-CZ"/>
         </w:rPr>
       </w:pPr>
-      <w:proofErr w:type="spellStart"/>
       <w:r>
         <w:rPr>
           <w:rFonts w:eastAsia="Times New Roman" w:cs="Times New Roman"/>
@@ -2787,7 +2452,6 @@
         </w:rPr>
         <w:t>EditPostController.php</w:t>
       </w:r>
-      <w:proofErr w:type="spellEnd"/>
     </w:p>
     <w:p>
       <w:pPr>
@@ -2821,7 +2485,6 @@
           <w:lang w:eastAsia="cs-CZ"/>
         </w:rPr>
       </w:pPr>
-      <w:proofErr w:type="spellStart"/>
       <w:r>
         <w:rPr>
           <w:rFonts w:eastAsia="Times New Roman" w:cs="Times New Roman"/>
@@ -2830,7 +2493,6 @@
         </w:rPr>
         <w:t>HomeController.php</w:t>
       </w:r>
-      <w:proofErr w:type="spellEnd"/>
     </w:p>
     <w:p>
       <w:pPr>
@@ -2864,16 +2526,15 @@
           <w:lang w:eastAsia="cs-CZ"/>
         </w:rPr>
       </w:pPr>
-      <w:proofErr w:type="spellStart"/>
-      <w:r>
-        <w:rPr>
-          <w:rFonts w:eastAsia="Times New Roman" w:cs="Times New Roman"/>
-          <w:szCs w:val="24"/>
-          <w:lang w:eastAsia="cs-CZ"/>
-        </w:rPr>
+      <w:r>
+        <w:rPr>
+          <w:rFonts w:eastAsia="Times New Roman" w:cs="Times New Roman"/>
+          <w:szCs w:val="24"/>
+          <w:lang w:eastAsia="cs-CZ"/>
+        </w:rPr>
+        <w:lastRenderedPageBreak/>
         <w:t>LoginErrorController.php</w:t>
       </w:r>
-      <w:proofErr w:type="spellEnd"/>
     </w:p>
     <w:p>
       <w:pPr>
@@ -2907,17 +2568,14 @@
           <w:lang w:eastAsia="cs-CZ"/>
         </w:rPr>
       </w:pPr>
-      <w:proofErr w:type="spellStart"/>
-      <w:r>
-        <w:rPr>
-          <w:rFonts w:eastAsia="Times New Roman" w:cs="Times New Roman"/>
-          <w:szCs w:val="24"/>
-          <w:lang w:eastAsia="cs-CZ"/>
-        </w:rPr>
-        <w:lastRenderedPageBreak/>
+      <w:r>
+        <w:rPr>
+          <w:rFonts w:eastAsia="Times New Roman" w:cs="Times New Roman"/>
+          <w:szCs w:val="24"/>
+          <w:lang w:eastAsia="cs-CZ"/>
+        </w:rPr>
         <w:t>LogoutController.php</w:t>
       </w:r>
-      <w:proofErr w:type="spellEnd"/>
     </w:p>
     <w:p>
       <w:pPr>
@@ -2951,7 +2609,6 @@
           <w:lang w:eastAsia="cs-CZ"/>
         </w:rPr>
       </w:pPr>
-      <w:proofErr w:type="spellStart"/>
       <w:r>
         <w:rPr>
           <w:rFonts w:eastAsia="Times New Roman" w:cs="Times New Roman"/>
@@ -2960,7 +2617,6 @@
         </w:rPr>
         <w:t>ManagePostsController.php</w:t>
       </w:r>
-      <w:proofErr w:type="spellEnd"/>
     </w:p>
     <w:p>
       <w:pPr>
@@ -2994,7 +2650,6 @@
           <w:lang w:eastAsia="cs-CZ"/>
         </w:rPr>
       </w:pPr>
-      <w:proofErr w:type="spellStart"/>
       <w:r>
         <w:rPr>
           <w:rFonts w:eastAsia="Times New Roman" w:cs="Times New Roman"/>
@@ -3003,7 +2658,6 @@
         </w:rPr>
         <w:t>ManageReviewsController.php</w:t>
       </w:r>
-      <w:proofErr w:type="spellEnd"/>
     </w:p>
     <w:p>
       <w:pPr>
@@ -3037,7 +2691,6 @@
           <w:lang w:eastAsia="cs-CZ"/>
         </w:rPr>
       </w:pPr>
-      <w:proofErr w:type="spellStart"/>
       <w:r>
         <w:rPr>
           <w:rFonts w:eastAsia="Times New Roman" w:cs="Times New Roman"/>
@@ -3046,7 +2699,6 @@
         </w:rPr>
         <w:t>MyPostController.php</w:t>
       </w:r>
-      <w:proofErr w:type="spellEnd"/>
     </w:p>
     <w:p>
       <w:pPr>
@@ -3080,7 +2732,6 @@
           <w:lang w:eastAsia="cs-CZ"/>
         </w:rPr>
       </w:pPr>
-      <w:proofErr w:type="spellStart"/>
       <w:r>
         <w:rPr>
           <w:rFonts w:eastAsia="Times New Roman" w:cs="Times New Roman"/>
@@ -3089,7 +2740,6 @@
         </w:rPr>
         <w:t>ProgramController.php</w:t>
       </w:r>
-      <w:proofErr w:type="spellEnd"/>
     </w:p>
     <w:p>
       <w:pPr>
@@ -3123,7 +2773,6 @@
           <w:lang w:eastAsia="cs-CZ"/>
         </w:rPr>
       </w:pPr>
-      <w:proofErr w:type="spellStart"/>
       <w:r>
         <w:rPr>
           <w:rFonts w:eastAsia="Times New Roman" w:cs="Times New Roman"/>
@@ -3132,7 +2781,6 @@
         </w:rPr>
         <w:t>RegistrationController.php</w:t>
       </w:r>
-      <w:proofErr w:type="spellEnd"/>
     </w:p>
     <w:p>
       <w:pPr>
@@ -3166,7 +2814,6 @@
           <w:lang w:eastAsia="cs-CZ"/>
         </w:rPr>
       </w:pPr>
-      <w:proofErr w:type="spellStart"/>
       <w:r>
         <w:rPr>
           <w:rFonts w:eastAsia="Times New Roman" w:cs="Times New Roman"/>
@@ -3175,7 +2822,6 @@
         </w:rPr>
         <w:t>ReviewController.php</w:t>
       </w:r>
-      <w:proofErr w:type="spellEnd"/>
     </w:p>
     <w:p>
       <w:pPr>
@@ -3209,7 +2855,6 @@
           <w:lang w:eastAsia="cs-CZ"/>
         </w:rPr>
       </w:pPr>
-      <w:proofErr w:type="spellStart"/>
       <w:r>
         <w:rPr>
           <w:rFonts w:eastAsia="Times New Roman" w:cs="Times New Roman"/>
@@ -3218,7 +2863,6 @@
         </w:rPr>
         <w:t>UploadController.php</w:t>
       </w:r>
-      <w:proofErr w:type="spellEnd"/>
     </w:p>
     <w:p>
       <w:pPr>
@@ -3252,7 +2896,6 @@
           <w:lang w:eastAsia="cs-CZ"/>
         </w:rPr>
       </w:pPr>
-      <w:proofErr w:type="spellStart"/>
       <w:r>
         <w:rPr>
           <w:rFonts w:eastAsia="Times New Roman" w:cs="Times New Roman"/>
@@ -3261,7 +2904,6 @@
         </w:rPr>
         <w:t>UserSettingsController.php</w:t>
       </w:r>
-      <w:proofErr w:type="spellEnd"/>
     </w:p>
     <w:p>
       <w:pPr>
@@ -3295,23 +2937,13 @@
           <w:lang w:eastAsia="cs-CZ"/>
         </w:rPr>
       </w:pPr>
-      <w:proofErr w:type="spellStart"/>
-      <w:r>
-        <w:rPr>
-          <w:rFonts w:eastAsia="Times New Roman" w:cs="Times New Roman"/>
-          <w:szCs w:val="24"/>
-          <w:lang w:eastAsia="cs-CZ"/>
-        </w:rPr>
-        <w:t>models</w:t>
-      </w:r>
-      <w:proofErr w:type="spellEnd"/>
-      <w:r>
-        <w:rPr>
-          <w:rFonts w:eastAsia="Times New Roman" w:cs="Times New Roman"/>
-          <w:szCs w:val="24"/>
-          <w:lang w:eastAsia="cs-CZ"/>
-        </w:rPr>
-        <w:t>/</w:t>
+      <w:r>
+        <w:rPr>
+          <w:rFonts w:eastAsia="Times New Roman" w:cs="Times New Roman"/>
+          <w:szCs w:val="24"/>
+          <w:lang w:eastAsia="cs-CZ"/>
+        </w:rPr>
+        <w:t>models/</w:t>
       </w:r>
     </w:p>
     <w:p>
@@ -3346,7 +2978,6 @@
           <w:lang w:eastAsia="cs-CZ"/>
         </w:rPr>
       </w:pPr>
-      <w:proofErr w:type="spellStart"/>
       <w:r>
         <w:rPr>
           <w:rFonts w:eastAsia="Times New Roman" w:cs="Times New Roman"/>
@@ -3355,7 +2986,6 @@
         </w:rPr>
         <w:t>Database.php</w:t>
       </w:r>
-      <w:proofErr w:type="spellEnd"/>
     </w:p>
     <w:p>
       <w:pPr>
@@ -3430,7 +3060,6 @@
           <w:lang w:eastAsia="cs-CZ"/>
         </w:rPr>
       </w:pPr>
-      <w:proofErr w:type="spellStart"/>
       <w:r>
         <w:rPr>
           <w:rFonts w:eastAsia="Times New Roman" w:cs="Times New Roman"/>
@@ -3439,7 +3068,6 @@
         </w:rPr>
         <w:t>PostModel.php</w:t>
       </w:r>
-      <w:proofErr w:type="spellEnd"/>
     </w:p>
     <w:p>
       <w:pPr>
@@ -3514,7 +3142,6 @@
           <w:lang w:eastAsia="cs-CZ"/>
         </w:rPr>
       </w:pPr>
-      <w:proofErr w:type="spellStart"/>
       <w:r>
         <w:rPr>
           <w:rFonts w:eastAsia="Times New Roman" w:cs="Times New Roman"/>
@@ -3523,7 +3150,6 @@
         </w:rPr>
         <w:t>ReviewModel.php</w:t>
       </w:r>
-      <w:proofErr w:type="spellEnd"/>
     </w:p>
     <w:p>
       <w:pPr>
@@ -3598,7 +3224,6 @@
           <w:lang w:eastAsia="cs-CZ"/>
         </w:rPr>
       </w:pPr>
-      <w:proofErr w:type="spellStart"/>
       <w:r>
         <w:rPr>
           <w:rFonts w:eastAsia="Times New Roman" w:cs="Times New Roman"/>
@@ -3607,7 +3232,6 @@
         </w:rPr>
         <w:t>UserModel.php</w:t>
       </w:r>
-      <w:proofErr w:type="spellEnd"/>
     </w:p>
     <w:p>
       <w:pPr>
@@ -3928,41 +3552,13 @@
           <w:lang w:eastAsia="cs-CZ"/>
         </w:rPr>
       </w:pPr>
-      <w:proofErr w:type="spellStart"/>
-      <w:r>
-        <w:rPr>
-          <w:rFonts w:eastAsia="Times New Roman" w:cs="Times New Roman"/>
-          <w:szCs w:val="24"/>
-          <w:lang w:eastAsia="cs-CZ"/>
-        </w:rPr>
-        <w:t>views</w:t>
-      </w:r>
-      <w:proofErr w:type="spellEnd"/>
-      <w:r>
-        <w:rPr>
-          <w:rFonts w:eastAsia="Times New Roman" w:cs="Times New Roman"/>
-          <w:szCs w:val="24"/>
-          <w:lang w:eastAsia="cs-CZ"/>
-        </w:rPr>
-        <w:t>/</w:t>
-      </w:r>
-      <w:proofErr w:type="spellStart"/>
-      <w:r>
-        <w:rPr>
-          <w:rFonts w:eastAsia="Times New Roman" w:cs="Times New Roman"/>
-          <w:szCs w:val="24"/>
-          <w:lang w:eastAsia="cs-CZ"/>
-        </w:rPr>
-        <w:t>twig</w:t>
-      </w:r>
-      <w:proofErr w:type="spellEnd"/>
-      <w:r>
-        <w:rPr>
-          <w:rFonts w:eastAsia="Times New Roman" w:cs="Times New Roman"/>
-          <w:szCs w:val="24"/>
-          <w:lang w:eastAsia="cs-CZ"/>
-        </w:rPr>
-        <w:t>/</w:t>
+      <w:r>
+        <w:rPr>
+          <w:rFonts w:eastAsia="Times New Roman" w:cs="Times New Roman"/>
+          <w:szCs w:val="24"/>
+          <w:lang w:eastAsia="cs-CZ"/>
+        </w:rPr>
+        <w:t>views/twig/</w:t>
       </w:r>
     </w:p>
     <w:p>
@@ -3997,8 +3593,6 @@
           <w:lang w:eastAsia="cs-CZ"/>
         </w:rPr>
       </w:pPr>
-      <w:proofErr w:type="spellStart"/>
-      <w:proofErr w:type="gramStart"/>
       <w:r>
         <w:rPr>
           <w:rFonts w:eastAsia="Times New Roman" w:cs="Times New Roman"/>
@@ -4007,8 +3601,6 @@
         </w:rPr>
         <w:t>articles.twig</w:t>
       </w:r>
-      <w:proofErr w:type="spellEnd"/>
-      <w:proofErr w:type="gramEnd"/>
     </w:p>
     <w:p>
       <w:pPr>
@@ -4042,8 +3634,6 @@
           <w:lang w:eastAsia="cs-CZ"/>
         </w:rPr>
       </w:pPr>
-      <w:proofErr w:type="spellStart"/>
-      <w:proofErr w:type="gramStart"/>
       <w:r>
         <w:rPr>
           <w:rFonts w:eastAsia="Times New Roman" w:cs="Times New Roman"/>
@@ -4052,8 +3642,6 @@
         </w:rPr>
         <w:t>base.twig</w:t>
       </w:r>
-      <w:proofErr w:type="spellEnd"/>
-      <w:proofErr w:type="gramEnd"/>
     </w:p>
     <w:p>
       <w:pPr>
@@ -4087,7 +3675,6 @@
           <w:lang w:eastAsia="cs-CZ"/>
         </w:rPr>
       </w:pPr>
-      <w:proofErr w:type="spellStart"/>
       <w:r>
         <w:rPr>
           <w:rFonts w:eastAsia="Times New Roman" w:cs="Times New Roman"/>
@@ -4096,7 +3683,6 @@
         </w:rPr>
         <w:t>editPost.twig</w:t>
       </w:r>
-      <w:proofErr w:type="spellEnd"/>
     </w:p>
     <w:p>
       <w:pPr>
@@ -4130,8 +3716,6 @@
           <w:lang w:eastAsia="cs-CZ"/>
         </w:rPr>
       </w:pPr>
-      <w:proofErr w:type="spellStart"/>
-      <w:proofErr w:type="gramStart"/>
       <w:r>
         <w:rPr>
           <w:rFonts w:eastAsia="Times New Roman" w:cs="Times New Roman"/>
@@ -4140,8 +3724,6 @@
         </w:rPr>
         <w:t>home.twig</w:t>
       </w:r>
-      <w:proofErr w:type="spellEnd"/>
-      <w:proofErr w:type="gramEnd"/>
     </w:p>
     <w:p>
       <w:pPr>
@@ -4175,7 +3757,6 @@
           <w:lang w:eastAsia="cs-CZ"/>
         </w:rPr>
       </w:pPr>
-      <w:proofErr w:type="spellStart"/>
       <w:r>
         <w:rPr>
           <w:rFonts w:eastAsia="Times New Roman" w:cs="Times New Roman"/>
@@ -4184,7 +3765,6 @@
         </w:rPr>
         <w:t>loginError.twig</w:t>
       </w:r>
-      <w:proofErr w:type="spellEnd"/>
     </w:p>
     <w:p>
       <w:pPr>
@@ -4218,7 +3798,6 @@
           <w:lang w:eastAsia="cs-CZ"/>
         </w:rPr>
       </w:pPr>
-      <w:proofErr w:type="spellStart"/>
       <w:r>
         <w:rPr>
           <w:rFonts w:eastAsia="Times New Roman" w:cs="Times New Roman"/>
@@ -4227,7 +3806,6 @@
         </w:rPr>
         <w:t>managePosts.twig</w:t>
       </w:r>
-      <w:proofErr w:type="spellEnd"/>
     </w:p>
     <w:p>
       <w:pPr>
@@ -4261,7 +3839,6 @@
           <w:lang w:eastAsia="cs-CZ"/>
         </w:rPr>
       </w:pPr>
-      <w:proofErr w:type="spellStart"/>
       <w:r>
         <w:rPr>
           <w:rFonts w:eastAsia="Times New Roman" w:cs="Times New Roman"/>
@@ -4270,7 +3847,6 @@
         </w:rPr>
         <w:t>manageReviews.twig</w:t>
       </w:r>
-      <w:proofErr w:type="spellEnd"/>
     </w:p>
     <w:p>
       <w:pPr>
@@ -4304,8 +3880,6 @@
           <w:lang w:eastAsia="cs-CZ"/>
         </w:rPr>
       </w:pPr>
-      <w:proofErr w:type="spellStart"/>
-      <w:proofErr w:type="gramStart"/>
       <w:r>
         <w:rPr>
           <w:rFonts w:eastAsia="Times New Roman" w:cs="Times New Roman"/>
@@ -4314,8 +3888,6 @@
         </w:rPr>
         <w:t>program.twig</w:t>
       </w:r>
-      <w:proofErr w:type="spellEnd"/>
-      <w:proofErr w:type="gramEnd"/>
     </w:p>
     <w:p>
       <w:pPr>
@@ -4349,8 +3921,6 @@
           <w:lang w:eastAsia="cs-CZ"/>
         </w:rPr>
       </w:pPr>
-      <w:proofErr w:type="spellStart"/>
-      <w:proofErr w:type="gramStart"/>
       <w:r>
         <w:rPr>
           <w:rFonts w:eastAsia="Times New Roman" w:cs="Times New Roman"/>
@@ -4359,8 +3929,6 @@
         </w:rPr>
         <w:t>registration.twig</w:t>
       </w:r>
-      <w:proofErr w:type="spellEnd"/>
-      <w:proofErr w:type="gramEnd"/>
     </w:p>
     <w:p>
       <w:pPr>
@@ -4394,8 +3962,6 @@
           <w:lang w:eastAsia="cs-CZ"/>
         </w:rPr>
       </w:pPr>
-      <w:proofErr w:type="spellStart"/>
-      <w:proofErr w:type="gramStart"/>
       <w:r>
         <w:rPr>
           <w:rFonts w:eastAsia="Times New Roman" w:cs="Times New Roman"/>
@@ -4404,8 +3970,6 @@
         </w:rPr>
         <w:t>review.twig</w:t>
       </w:r>
-      <w:proofErr w:type="spellEnd"/>
-      <w:proofErr w:type="gramEnd"/>
     </w:p>
     <w:p>
       <w:pPr>
@@ -4439,7 +4003,6 @@
           <w:lang w:eastAsia="cs-CZ"/>
         </w:rPr>
       </w:pPr>
-      <w:proofErr w:type="spellStart"/>
       <w:r>
         <w:rPr>
           <w:rFonts w:eastAsia="Times New Roman" w:cs="Times New Roman"/>
@@ -4448,7 +4011,6 @@
         </w:rPr>
         <w:t>reviewList.twig</w:t>
       </w:r>
-      <w:proofErr w:type="spellEnd"/>
     </w:p>
     <w:p>
       <w:pPr>
@@ -4482,8 +4044,6 @@
           <w:lang w:eastAsia="cs-CZ"/>
         </w:rPr>
       </w:pPr>
-      <w:proofErr w:type="spellStart"/>
-      <w:proofErr w:type="gramStart"/>
       <w:r>
         <w:rPr>
           <w:rFonts w:eastAsia="Times New Roman" w:cs="Times New Roman"/>
@@ -4492,8 +4052,6 @@
         </w:rPr>
         <w:t>upload.twig</w:t>
       </w:r>
-      <w:proofErr w:type="spellEnd"/>
-      <w:proofErr w:type="gramEnd"/>
     </w:p>
     <w:p>
       <w:pPr>
@@ -4527,7 +4085,6 @@
           <w:lang w:eastAsia="cs-CZ"/>
         </w:rPr>
       </w:pPr>
-      <w:proofErr w:type="spellStart"/>
       <w:r>
         <w:rPr>
           <w:rFonts w:eastAsia="Times New Roman" w:cs="Times New Roman"/>
@@ -4536,7 +4093,6 @@
         </w:rPr>
         <w:t>userSettings.twig</w:t>
       </w:r>
-      <w:proofErr w:type="spellEnd"/>
     </w:p>
     <w:p>
       <w:pPr>
@@ -4570,7 +4126,6 @@
           <w:lang w:eastAsia="cs-CZ"/>
         </w:rPr>
       </w:pPr>
-      <w:proofErr w:type="spellStart"/>
       <w:r>
         <w:rPr>
           <w:rFonts w:eastAsia="Times New Roman" w:cs="Times New Roman"/>
@@ -4579,7 +4134,6 @@
         </w:rPr>
         <w:t>MyApplication.php</w:t>
       </w:r>
-      <w:proofErr w:type="spellEnd"/>
     </w:p>
     <w:p>
       <w:pPr>
@@ -4627,25 +4181,7 @@
           <w:szCs w:val="24"/>
           <w:lang w:eastAsia="cs-CZ"/>
         </w:rPr>
-        <w:t xml:space="preserve">ozhoduje, který </w:t>
-      </w:r>
-      <w:proofErr w:type="spellStart"/>
-      <w:r>
-        <w:rPr>
-          <w:rFonts w:eastAsia="Times New Roman" w:cs="Times New Roman"/>
-          <w:szCs w:val="24"/>
-          <w:lang w:eastAsia="cs-CZ"/>
-        </w:rPr>
-        <w:t>controller</w:t>
-      </w:r>
-      <w:proofErr w:type="spellEnd"/>
-      <w:r>
-        <w:rPr>
-          <w:rFonts w:eastAsia="Times New Roman" w:cs="Times New Roman"/>
-          <w:szCs w:val="24"/>
-          <w:lang w:eastAsia="cs-CZ"/>
-        </w:rPr>
-        <w:t xml:space="preserve"> se má spustit</w:t>
+        <w:t>ozhoduje, který controller se má spustit</w:t>
       </w:r>
     </w:p>
     <w:p>
@@ -4686,25 +4222,7 @@
           <w:szCs w:val="24"/>
           <w:lang w:eastAsia="cs-CZ"/>
         </w:rPr>
-        <w:t xml:space="preserve">Správce </w:t>
-      </w:r>
-      <w:proofErr w:type="spellStart"/>
-      <w:r>
-        <w:rPr>
-          <w:rFonts w:eastAsia="Times New Roman" w:cs="Times New Roman"/>
-          <w:szCs w:val="24"/>
-          <w:lang w:eastAsia="cs-CZ"/>
-        </w:rPr>
-        <w:t>Twig</w:t>
-      </w:r>
-      <w:proofErr w:type="spellEnd"/>
-      <w:r>
-        <w:rPr>
-          <w:rFonts w:eastAsia="Times New Roman" w:cs="Times New Roman"/>
-          <w:szCs w:val="24"/>
-          <w:lang w:eastAsia="cs-CZ"/>
-        </w:rPr>
-        <w:t xml:space="preserve"> šablon</w:t>
+        <w:t>Správce Twig šablon</w:t>
       </w:r>
     </w:p>
     <w:p>
@@ -4788,23 +4306,13 @@
           <w:lang w:eastAsia="cs-CZ"/>
         </w:rPr>
       </w:pPr>
-      <w:proofErr w:type="spellStart"/>
-      <w:r>
-        <w:rPr>
-          <w:rFonts w:eastAsia="Times New Roman" w:cs="Times New Roman"/>
-          <w:szCs w:val="24"/>
-          <w:lang w:eastAsia="cs-CZ"/>
-        </w:rPr>
-        <w:t>uploads</w:t>
-      </w:r>
-      <w:proofErr w:type="spellEnd"/>
-      <w:r>
-        <w:rPr>
-          <w:rFonts w:eastAsia="Times New Roman" w:cs="Times New Roman"/>
-          <w:szCs w:val="24"/>
-          <w:lang w:eastAsia="cs-CZ"/>
-        </w:rPr>
-        <w:t>/</w:t>
+      <w:r>
+        <w:rPr>
+          <w:rFonts w:eastAsia="Times New Roman" w:cs="Times New Roman"/>
+          <w:szCs w:val="24"/>
+          <w:lang w:eastAsia="cs-CZ"/>
+        </w:rPr>
+        <w:t>uploads/</w:t>
       </w:r>
     </w:p>
     <w:p>
@@ -4880,23 +4388,13 @@
           <w:lang w:eastAsia="cs-CZ"/>
         </w:rPr>
       </w:pPr>
-      <w:proofErr w:type="spellStart"/>
-      <w:r>
-        <w:rPr>
-          <w:rFonts w:eastAsia="Times New Roman" w:cs="Times New Roman"/>
-          <w:szCs w:val="24"/>
-          <w:lang w:eastAsia="cs-CZ"/>
-        </w:rPr>
-        <w:t>img</w:t>
-      </w:r>
-      <w:proofErr w:type="spellEnd"/>
-      <w:r>
-        <w:rPr>
-          <w:rFonts w:eastAsia="Times New Roman" w:cs="Times New Roman"/>
-          <w:szCs w:val="24"/>
-          <w:lang w:eastAsia="cs-CZ"/>
-        </w:rPr>
-        <w:t xml:space="preserve">/                    </w:t>
+      <w:r>
+        <w:rPr>
+          <w:rFonts w:eastAsia="Times New Roman" w:cs="Times New Roman"/>
+          <w:szCs w:val="24"/>
+          <w:lang w:eastAsia="cs-CZ"/>
+        </w:rPr>
+        <w:t xml:space="preserve">img/                    </w:t>
       </w:r>
     </w:p>
     <w:p>
@@ -4982,6 +4480,7 @@
           <w:szCs w:val="48"/>
           <w:lang w:eastAsia="cs-CZ"/>
         </w:rPr>
+        <w:lastRenderedPageBreak/>
         <w:t>5. Architektura aplikace (MVC)</w:t>
       </w:r>
     </w:p>
@@ -4998,7 +4497,6 @@
           <w:lang w:eastAsia="cs-CZ"/>
         </w:rPr>
       </w:pPr>
-      <w:proofErr w:type="spellStart"/>
       <w:r>
         <w:rPr>
           <w:rFonts w:eastAsia="Times New Roman" w:cs="Times New Roman"/>
@@ -5008,10 +4506,8 @@
           <w:szCs w:val="27"/>
           <w:lang w:eastAsia="cs-CZ"/>
         </w:rPr>
-        <w:lastRenderedPageBreak/>
         <w:t>Models</w:t>
       </w:r>
-      <w:proofErr w:type="spellEnd"/>
     </w:p>
     <w:p>
       <w:pPr>
@@ -5116,7 +4612,6 @@
           <w:lang w:eastAsia="cs-CZ"/>
         </w:rPr>
       </w:pPr>
-      <w:proofErr w:type="spellStart"/>
       <w:r>
         <w:rPr>
           <w:rFonts w:eastAsia="Times New Roman" w:cs="Times New Roman"/>
@@ -5128,7 +4623,6 @@
         </w:rPr>
         <w:t>Controllers</w:t>
       </w:r>
-      <w:proofErr w:type="spellEnd"/>
     </w:p>
     <w:p>
       <w:pPr>
@@ -5215,25 +4709,7 @@
           <w:szCs w:val="24"/>
           <w:lang w:eastAsia="cs-CZ"/>
         </w:rPr>
-        <w:t xml:space="preserve">Předání dat do </w:t>
-      </w:r>
-      <w:proofErr w:type="spellStart"/>
-      <w:r>
-        <w:rPr>
-          <w:rFonts w:eastAsia="Times New Roman" w:cs="Times New Roman"/>
-          <w:szCs w:val="24"/>
-          <w:lang w:eastAsia="cs-CZ"/>
-        </w:rPr>
-        <w:t>Twig</w:t>
-      </w:r>
-      <w:proofErr w:type="spellEnd"/>
-      <w:r>
-        <w:rPr>
-          <w:rFonts w:eastAsia="Times New Roman" w:cs="Times New Roman"/>
-          <w:szCs w:val="24"/>
-          <w:lang w:eastAsia="cs-CZ"/>
-        </w:rPr>
-        <w:t xml:space="preserve"> šablon</w:t>
+        <w:t>Předání dat do Twig šablon</w:t>
       </w:r>
     </w:p>
     <w:p>
@@ -5249,7 +4725,6 @@
           <w:lang w:eastAsia="cs-CZ"/>
         </w:rPr>
       </w:pPr>
-      <w:proofErr w:type="spellStart"/>
       <w:r>
         <w:rPr>
           <w:rFonts w:eastAsia="Times New Roman" w:cs="Times New Roman"/>
@@ -5259,10 +4734,57 @@
           <w:szCs w:val="27"/>
           <w:lang w:eastAsia="cs-CZ"/>
         </w:rPr>
-        <w:t>Views</w:t>
-      </w:r>
-      <w:proofErr w:type="spellEnd"/>
-      <w:r>
+        <w:t>Views (Twig)</w:t>
+      </w:r>
+    </w:p>
+    <w:p>
+      <w:pPr>
+        <w:numPr>
+          <w:ilvl w:val="0"/>
+          <w:numId w:val="8"/>
+        </w:numPr>
+        <w:spacing w:before="100" w:beforeAutospacing="1" w:after="100" w:afterAutospacing="1" w:line="240" w:lineRule="auto"/>
+        <w:rPr>
+          <w:rFonts w:eastAsia="Times New Roman" w:cs="Times New Roman"/>
+          <w:szCs w:val="24"/>
+          <w:lang w:eastAsia="cs-CZ"/>
+        </w:rPr>
+      </w:pPr>
+      <w:r>
+        <w:rPr>
+          <w:rFonts w:eastAsia="Times New Roman" w:cs="Times New Roman"/>
+          <w:szCs w:val="24"/>
+          <w:lang w:eastAsia="cs-CZ"/>
+        </w:rPr>
+        <w:t>Zobrazení dat</w:t>
+      </w:r>
+    </w:p>
+    <w:p>
+      <w:pPr>
+        <w:numPr>
+          <w:ilvl w:val="0"/>
+          <w:numId w:val="8"/>
+        </w:numPr>
+        <w:spacing w:before="100" w:beforeAutospacing="1" w:after="100" w:afterAutospacing="1" w:line="240" w:lineRule="auto"/>
+        <w:rPr>
+          <w:rFonts w:eastAsia="Times New Roman" w:cs="Times New Roman"/>
+          <w:szCs w:val="24"/>
+          <w:lang w:eastAsia="cs-CZ"/>
+        </w:rPr>
+      </w:pPr>
+      <w:r>
+        <w:rPr>
+          <w:rFonts w:eastAsia="Times New Roman" w:cs="Times New Roman"/>
+          <w:szCs w:val="24"/>
+          <w:lang w:eastAsia="cs-CZ"/>
+        </w:rPr>
+        <w:t>Minimální logika (pouze výpisy, podmínky)</w:t>
+      </w:r>
+    </w:p>
+    <w:p>
+      <w:pPr>
+        <w:spacing w:before="100" w:beforeAutospacing="1" w:after="100" w:afterAutospacing="1" w:line="240" w:lineRule="auto"/>
+        <w:outlineLvl w:val="2"/>
         <w:rPr>
           <w:rFonts w:eastAsia="Times New Roman" w:cs="Times New Roman"/>
           <w:b/>
@@ -5271,9 +4793,7 @@
           <w:szCs w:val="27"/>
           <w:lang w:eastAsia="cs-CZ"/>
         </w:rPr>
-        <w:t xml:space="preserve"> (</w:t>
-      </w:r>
-      <w:proofErr w:type="spellStart"/>
+      </w:pPr>
       <w:r>
         <w:rPr>
           <w:rFonts w:eastAsia="Times New Roman" w:cs="Times New Roman"/>
@@ -5283,10 +4803,145 @@
           <w:szCs w:val="27"/>
           <w:lang w:eastAsia="cs-CZ"/>
         </w:rPr>
-        <w:t>Twig</w:t>
-      </w:r>
-      <w:proofErr w:type="spellEnd"/>
-      <w:r>
+        <w:t>REST API</w:t>
+      </w:r>
+    </w:p>
+    <w:p>
+      <w:pPr>
+        <w:numPr>
+          <w:ilvl w:val="0"/>
+          <w:numId w:val="9"/>
+        </w:numPr>
+        <w:spacing w:before="100" w:beforeAutospacing="1" w:after="100" w:afterAutospacing="1" w:line="240" w:lineRule="auto"/>
+        <w:rPr>
+          <w:rFonts w:eastAsia="Times New Roman" w:cs="Times New Roman"/>
+          <w:szCs w:val="24"/>
+          <w:lang w:eastAsia="cs-CZ"/>
+        </w:rPr>
+      </w:pPr>
+      <w:r>
+        <w:rPr>
+          <w:rFonts w:eastAsia="Times New Roman" w:cs="Times New Roman"/>
+          <w:szCs w:val="24"/>
+          <w:lang w:eastAsia="cs-CZ"/>
+        </w:rPr>
+        <w:t xml:space="preserve">users.php </w:t>
+      </w:r>
+    </w:p>
+    <w:p>
+      <w:pPr>
+        <w:numPr>
+          <w:ilvl w:val="1"/>
+          <w:numId w:val="9"/>
+        </w:numPr>
+        <w:spacing w:before="100" w:beforeAutospacing="1" w:after="100" w:afterAutospacing="1" w:line="240" w:lineRule="auto"/>
+        <w:rPr>
+          <w:rFonts w:eastAsia="Times New Roman" w:cs="Times New Roman"/>
+          <w:szCs w:val="24"/>
+          <w:lang w:eastAsia="cs-CZ"/>
+        </w:rPr>
+      </w:pPr>
+      <w:r>
+        <w:rPr>
+          <w:rFonts w:eastAsia="Times New Roman" w:cs="Times New Roman"/>
+          <w:szCs w:val="24"/>
+          <w:lang w:eastAsia="cs-CZ"/>
+        </w:rPr>
+        <w:t>změna rolí, blokace</w:t>
+      </w:r>
+    </w:p>
+    <w:p>
+      <w:pPr>
+        <w:numPr>
+          <w:ilvl w:val="0"/>
+          <w:numId w:val="9"/>
+        </w:numPr>
+        <w:spacing w:before="100" w:beforeAutospacing="1" w:after="100" w:afterAutospacing="1" w:line="240" w:lineRule="auto"/>
+        <w:rPr>
+          <w:rFonts w:eastAsia="Times New Roman" w:cs="Times New Roman"/>
+          <w:szCs w:val="24"/>
+          <w:lang w:eastAsia="cs-CZ"/>
+        </w:rPr>
+      </w:pPr>
+      <w:r>
+        <w:rPr>
+          <w:rFonts w:eastAsia="Times New Roman" w:cs="Times New Roman"/>
+          <w:szCs w:val="24"/>
+          <w:lang w:eastAsia="cs-CZ"/>
+        </w:rPr>
+        <w:t xml:space="preserve">posts.php </w:t>
+      </w:r>
+    </w:p>
+    <w:p>
+      <w:pPr>
+        <w:numPr>
+          <w:ilvl w:val="1"/>
+          <w:numId w:val="9"/>
+        </w:numPr>
+        <w:spacing w:before="100" w:beforeAutospacing="1" w:after="100" w:afterAutospacing="1" w:line="240" w:lineRule="auto"/>
+        <w:rPr>
+          <w:rFonts w:eastAsia="Times New Roman" w:cs="Times New Roman"/>
+          <w:szCs w:val="24"/>
+          <w:lang w:eastAsia="cs-CZ"/>
+        </w:rPr>
+      </w:pPr>
+      <w:r>
+        <w:rPr>
+          <w:rFonts w:eastAsia="Times New Roman" w:cs="Times New Roman"/>
+          <w:szCs w:val="24"/>
+          <w:lang w:eastAsia="cs-CZ"/>
+        </w:rPr>
+        <w:t>přiřazení recenzentů, schválit/zamítnout</w:t>
+      </w:r>
+    </w:p>
+    <w:p>
+      <w:pPr>
+        <w:numPr>
+          <w:ilvl w:val="0"/>
+          <w:numId w:val="9"/>
+        </w:numPr>
+        <w:spacing w:before="100" w:beforeAutospacing="1" w:after="100" w:afterAutospacing="1" w:line="240" w:lineRule="auto"/>
+        <w:rPr>
+          <w:rFonts w:eastAsia="Times New Roman" w:cs="Times New Roman"/>
+          <w:szCs w:val="24"/>
+          <w:lang w:eastAsia="cs-CZ"/>
+        </w:rPr>
+      </w:pPr>
+      <w:r>
+        <w:rPr>
+          <w:rFonts w:eastAsia="Times New Roman" w:cs="Times New Roman"/>
+          <w:szCs w:val="24"/>
+          <w:lang w:eastAsia="cs-CZ"/>
+        </w:rPr>
+        <w:t xml:space="preserve">reviews.php </w:t>
+      </w:r>
+    </w:p>
+    <w:p>
+      <w:pPr>
+        <w:numPr>
+          <w:ilvl w:val="1"/>
+          <w:numId w:val="9"/>
+        </w:numPr>
+        <w:spacing w:before="100" w:beforeAutospacing="1" w:after="100" w:afterAutospacing="1" w:line="240" w:lineRule="auto"/>
+        <w:rPr>
+          <w:rFonts w:eastAsia="Times New Roman" w:cs="Times New Roman"/>
+          <w:szCs w:val="24"/>
+          <w:lang w:eastAsia="cs-CZ"/>
+        </w:rPr>
+      </w:pPr>
+      <w:r>
+        <w:rPr>
+          <w:rFonts w:eastAsia="Times New Roman" w:cs="Times New Roman"/>
+          <w:szCs w:val="24"/>
+          <w:lang w:eastAsia="cs-CZ"/>
+        </w:rPr>
+        <w:t>zápis recenze, schválení recenze</w:t>
+      </w:r>
+    </w:p>
+    <w:p>
+      <w:pPr>
+        <w:spacing w:before="100" w:beforeAutospacing="1" w:after="100" w:afterAutospacing="1" w:line="240" w:lineRule="auto"/>
+        <w:outlineLvl w:val="2"/>
         <w:rPr>
           <w:rFonts w:eastAsia="Times New Roman" w:cs="Times New Roman"/>
           <w:b/>
@@ -5295,57 +4950,8 @@
           <w:szCs w:val="27"/>
           <w:lang w:eastAsia="cs-CZ"/>
         </w:rPr>
-        <w:t>)</w:t>
-      </w:r>
-    </w:p>
-    <w:p>
-      <w:pPr>
-        <w:numPr>
-          <w:ilvl w:val="0"/>
-          <w:numId w:val="8"/>
-        </w:numPr>
-        <w:spacing w:before="100" w:beforeAutospacing="1" w:after="100" w:afterAutospacing="1" w:line="240" w:lineRule="auto"/>
-        <w:rPr>
-          <w:rFonts w:eastAsia="Times New Roman" w:cs="Times New Roman"/>
-          <w:szCs w:val="24"/>
-          <w:lang w:eastAsia="cs-CZ"/>
-        </w:rPr>
-      </w:pPr>
-      <w:r>
-        <w:rPr>
-          <w:rFonts w:eastAsia="Times New Roman" w:cs="Times New Roman"/>
-          <w:szCs w:val="24"/>
-          <w:lang w:eastAsia="cs-CZ"/>
-        </w:rPr>
-        <w:t>Zobrazení dat</w:t>
-      </w:r>
-    </w:p>
-    <w:p>
-      <w:pPr>
-        <w:numPr>
-          <w:ilvl w:val="0"/>
-          <w:numId w:val="8"/>
-        </w:numPr>
-        <w:spacing w:before="100" w:beforeAutospacing="1" w:after="100" w:afterAutospacing="1" w:line="240" w:lineRule="auto"/>
-        <w:rPr>
-          <w:rFonts w:eastAsia="Times New Roman" w:cs="Times New Roman"/>
-          <w:szCs w:val="24"/>
-          <w:lang w:eastAsia="cs-CZ"/>
-        </w:rPr>
-      </w:pPr>
-      <w:r>
-        <w:rPr>
-          <w:rFonts w:eastAsia="Times New Roman" w:cs="Times New Roman"/>
-          <w:szCs w:val="24"/>
-          <w:lang w:eastAsia="cs-CZ"/>
-        </w:rPr>
-        <w:t>Minimální logika (pouze výpisy, podmínky)</w:t>
-      </w:r>
-    </w:p>
-    <w:p>
-      <w:pPr>
-        <w:spacing w:before="100" w:beforeAutospacing="1" w:after="100" w:afterAutospacing="1" w:line="240" w:lineRule="auto"/>
-        <w:outlineLvl w:val="2"/>
+      </w:pPr>
+      <w:r>
         <w:rPr>
           <w:rFonts w:eastAsia="Times New Roman" w:cs="Times New Roman"/>
           <w:b/>
@@ -5354,217 +4960,7 @@
           <w:szCs w:val="27"/>
           <w:lang w:eastAsia="cs-CZ"/>
         </w:rPr>
-      </w:pPr>
-      <w:r>
-        <w:rPr>
-          <w:rFonts w:eastAsia="Times New Roman" w:cs="Times New Roman"/>
-          <w:b/>
-          <w:bCs/>
-          <w:sz w:val="27"/>
-          <w:szCs w:val="27"/>
-          <w:lang w:eastAsia="cs-CZ"/>
-        </w:rPr>
-        <w:t>REST API</w:t>
-      </w:r>
-    </w:p>
-    <w:p>
-      <w:pPr>
-        <w:numPr>
-          <w:ilvl w:val="0"/>
-          <w:numId w:val="9"/>
-        </w:numPr>
-        <w:spacing w:before="100" w:beforeAutospacing="1" w:after="100" w:afterAutospacing="1" w:line="240" w:lineRule="auto"/>
-        <w:rPr>
-          <w:rFonts w:eastAsia="Times New Roman" w:cs="Times New Roman"/>
-          <w:szCs w:val="24"/>
-          <w:lang w:eastAsia="cs-CZ"/>
-        </w:rPr>
-      </w:pPr>
-      <w:proofErr w:type="spellStart"/>
-      <w:r>
-        <w:rPr>
-          <w:rFonts w:eastAsia="Times New Roman" w:cs="Times New Roman"/>
-          <w:szCs w:val="24"/>
-          <w:lang w:eastAsia="cs-CZ"/>
-        </w:rPr>
-        <w:t>users.php</w:t>
-      </w:r>
-      <w:proofErr w:type="spellEnd"/>
-      <w:r>
-        <w:rPr>
-          <w:rFonts w:eastAsia="Times New Roman" w:cs="Times New Roman"/>
-          <w:szCs w:val="24"/>
-          <w:lang w:eastAsia="cs-CZ"/>
-        </w:rPr>
-        <w:t xml:space="preserve"> </w:t>
-      </w:r>
-    </w:p>
-    <w:p>
-      <w:pPr>
-        <w:numPr>
-          <w:ilvl w:val="1"/>
-          <w:numId w:val="9"/>
-        </w:numPr>
-        <w:spacing w:before="100" w:beforeAutospacing="1" w:after="100" w:afterAutospacing="1" w:line="240" w:lineRule="auto"/>
-        <w:rPr>
-          <w:rFonts w:eastAsia="Times New Roman" w:cs="Times New Roman"/>
-          <w:szCs w:val="24"/>
-          <w:lang w:eastAsia="cs-CZ"/>
-        </w:rPr>
-      </w:pPr>
-      <w:r>
-        <w:rPr>
-          <w:rFonts w:eastAsia="Times New Roman" w:cs="Times New Roman"/>
-          <w:szCs w:val="24"/>
-          <w:lang w:eastAsia="cs-CZ"/>
-        </w:rPr>
-        <w:t>změna rolí, blokace</w:t>
-      </w:r>
-    </w:p>
-    <w:p>
-      <w:pPr>
-        <w:numPr>
-          <w:ilvl w:val="0"/>
-          <w:numId w:val="9"/>
-        </w:numPr>
-        <w:spacing w:before="100" w:beforeAutospacing="1" w:after="100" w:afterAutospacing="1" w:line="240" w:lineRule="auto"/>
-        <w:rPr>
-          <w:rFonts w:eastAsia="Times New Roman" w:cs="Times New Roman"/>
-          <w:szCs w:val="24"/>
-          <w:lang w:eastAsia="cs-CZ"/>
-        </w:rPr>
-      </w:pPr>
-      <w:proofErr w:type="spellStart"/>
-      <w:r>
-        <w:rPr>
-          <w:rFonts w:eastAsia="Times New Roman" w:cs="Times New Roman"/>
-          <w:szCs w:val="24"/>
-          <w:lang w:eastAsia="cs-CZ"/>
-        </w:rPr>
-        <w:t>posts.php</w:t>
-      </w:r>
-      <w:proofErr w:type="spellEnd"/>
-      <w:r>
-        <w:rPr>
-          <w:rFonts w:eastAsia="Times New Roman" w:cs="Times New Roman"/>
-          <w:szCs w:val="24"/>
-          <w:lang w:eastAsia="cs-CZ"/>
-        </w:rPr>
-        <w:t xml:space="preserve"> </w:t>
-      </w:r>
-    </w:p>
-    <w:p>
-      <w:pPr>
-        <w:numPr>
-          <w:ilvl w:val="1"/>
-          <w:numId w:val="9"/>
-        </w:numPr>
-        <w:spacing w:before="100" w:beforeAutospacing="1" w:after="100" w:afterAutospacing="1" w:line="240" w:lineRule="auto"/>
-        <w:rPr>
-          <w:rFonts w:eastAsia="Times New Roman" w:cs="Times New Roman"/>
-          <w:szCs w:val="24"/>
-          <w:lang w:eastAsia="cs-CZ"/>
-        </w:rPr>
-      </w:pPr>
-      <w:r>
-        <w:rPr>
-          <w:rFonts w:eastAsia="Times New Roman" w:cs="Times New Roman"/>
-          <w:szCs w:val="24"/>
-          <w:lang w:eastAsia="cs-CZ"/>
-        </w:rPr>
-        <w:t>přiřazení recenzentů, schválit/zamítnout</w:t>
-      </w:r>
-    </w:p>
-    <w:p>
-      <w:pPr>
-        <w:numPr>
-          <w:ilvl w:val="0"/>
-          <w:numId w:val="9"/>
-        </w:numPr>
-        <w:spacing w:before="100" w:beforeAutospacing="1" w:after="100" w:afterAutospacing="1" w:line="240" w:lineRule="auto"/>
-        <w:rPr>
-          <w:rFonts w:eastAsia="Times New Roman" w:cs="Times New Roman"/>
-          <w:szCs w:val="24"/>
-          <w:lang w:eastAsia="cs-CZ"/>
-        </w:rPr>
-      </w:pPr>
-      <w:proofErr w:type="spellStart"/>
-      <w:r>
-        <w:rPr>
-          <w:rFonts w:eastAsia="Times New Roman" w:cs="Times New Roman"/>
-          <w:szCs w:val="24"/>
-          <w:lang w:eastAsia="cs-CZ"/>
-        </w:rPr>
-        <w:t>reviews.php</w:t>
-      </w:r>
-      <w:proofErr w:type="spellEnd"/>
-      <w:r>
-        <w:rPr>
-          <w:rFonts w:eastAsia="Times New Roman" w:cs="Times New Roman"/>
-          <w:szCs w:val="24"/>
-          <w:lang w:eastAsia="cs-CZ"/>
-        </w:rPr>
-        <w:t xml:space="preserve"> </w:t>
-      </w:r>
-    </w:p>
-    <w:p>
-      <w:pPr>
-        <w:numPr>
-          <w:ilvl w:val="1"/>
-          <w:numId w:val="9"/>
-        </w:numPr>
-        <w:spacing w:before="100" w:beforeAutospacing="1" w:after="100" w:afterAutospacing="1" w:line="240" w:lineRule="auto"/>
-        <w:rPr>
-          <w:rFonts w:eastAsia="Times New Roman" w:cs="Times New Roman"/>
-          <w:szCs w:val="24"/>
-          <w:lang w:eastAsia="cs-CZ"/>
-        </w:rPr>
-      </w:pPr>
-      <w:r>
-        <w:rPr>
-          <w:rFonts w:eastAsia="Times New Roman" w:cs="Times New Roman"/>
-          <w:szCs w:val="24"/>
-          <w:lang w:eastAsia="cs-CZ"/>
-        </w:rPr>
-        <w:t>zápis recenze, schválení recenze</w:t>
-      </w:r>
-    </w:p>
-    <w:p>
-      <w:pPr>
-        <w:spacing w:before="100" w:beforeAutospacing="1" w:after="100" w:afterAutospacing="1" w:line="240" w:lineRule="auto"/>
-        <w:outlineLvl w:val="2"/>
-        <w:rPr>
-          <w:rFonts w:eastAsia="Times New Roman" w:cs="Times New Roman"/>
-          <w:b/>
-          <w:bCs/>
-          <w:sz w:val="27"/>
-          <w:szCs w:val="27"/>
-          <w:lang w:eastAsia="cs-CZ"/>
-        </w:rPr>
-      </w:pPr>
-      <w:proofErr w:type="spellStart"/>
-      <w:r>
-        <w:rPr>
-          <w:rFonts w:eastAsia="Times New Roman" w:cs="Times New Roman"/>
-          <w:b/>
-          <w:bCs/>
-          <w:sz w:val="27"/>
-          <w:szCs w:val="27"/>
-          <w:lang w:eastAsia="cs-CZ"/>
-        </w:rPr>
-        <w:t>JavaScriptový</w:t>
-      </w:r>
-      <w:proofErr w:type="spellEnd"/>
-      <w:r>
-        <w:rPr>
-          <w:rFonts w:eastAsia="Times New Roman" w:cs="Times New Roman"/>
-          <w:b/>
-          <w:bCs/>
-          <w:sz w:val="27"/>
-          <w:szCs w:val="27"/>
-          <w:lang w:eastAsia="cs-CZ"/>
-        </w:rPr>
-        <w:t xml:space="preserve"> klient</w:t>
+        <w:t>JavaScriptový klient</w:t>
       </w:r>
     </w:p>
     <w:p>
@@ -5815,7 +5211,6 @@
                 <w:lang w:eastAsia="cs-CZ"/>
               </w:rPr>
             </w:pPr>
-            <w:proofErr w:type="spellStart"/>
             <w:r>
               <w:rPr>
                 <w:rFonts w:eastAsia="Times New Roman" w:cs="Times New Roman"/>
@@ -5824,7 +5219,6 @@
               </w:rPr>
               <w:t>SuperAdmin</w:t>
             </w:r>
-            <w:proofErr w:type="spellEnd"/>
           </w:p>
         </w:tc>
         <w:tc>
@@ -6352,6 +5746,7 @@
                 <w:szCs w:val="24"/>
                 <w:lang w:eastAsia="cs-CZ"/>
               </w:rPr>
+              <w:lastRenderedPageBreak/>
               <w:t>Autor 0</w:t>
             </w:r>
           </w:p>
@@ -6667,7 +6062,6 @@
           <w:szCs w:val="48"/>
           <w:lang w:eastAsia="cs-CZ"/>
         </w:rPr>
-        <w:lastRenderedPageBreak/>
         <w:t>7</w:t>
       </w:r>
       <w:r>
@@ -6787,7 +6181,6 @@
                 <w:lang w:eastAsia="cs-CZ"/>
               </w:rPr>
             </w:pPr>
-            <w:proofErr w:type="spellStart"/>
             <w:r>
               <w:rPr>
                 <w:rFonts w:eastAsia="Times New Roman" w:cs="Times New Roman"/>
@@ -6796,7 +6189,6 @@
               </w:rPr>
               <w:t>Superadmin</w:t>
             </w:r>
-            <w:proofErr w:type="spellEnd"/>
           </w:p>
         </w:tc>
         <w:tc>
@@ -6932,25 +6324,7 @@
                 <w:szCs w:val="24"/>
                 <w:lang w:eastAsia="cs-CZ"/>
               </w:rPr>
-              <w:t xml:space="preserve">Sám nemůže nahrávat </w:t>
-            </w:r>
-            <w:proofErr w:type="spellStart"/>
-            <w:r>
-              <w:rPr>
-                <w:rFonts w:eastAsia="Times New Roman" w:cs="Times New Roman"/>
-                <w:szCs w:val="24"/>
-                <w:lang w:eastAsia="cs-CZ"/>
-              </w:rPr>
-              <w:t>pdf</w:t>
-            </w:r>
-            <w:proofErr w:type="spellEnd"/>
-            <w:r>
-              <w:rPr>
-                <w:rFonts w:eastAsia="Times New Roman" w:cs="Times New Roman"/>
-                <w:szCs w:val="24"/>
-                <w:lang w:eastAsia="cs-CZ"/>
-              </w:rPr>
-              <w:t xml:space="preserve"> ani recenzovat</w:t>
+              <w:t>Sám nemůže nahrávat pdf ani recenzovat</w:t>
             </w:r>
           </w:p>
         </w:tc>
@@ -7098,25 +6472,7 @@
                 <w:szCs w:val="24"/>
                 <w:lang w:eastAsia="cs-CZ"/>
               </w:rPr>
-              <w:t xml:space="preserve">Sám nemůže nahrávat </w:t>
-            </w:r>
-            <w:proofErr w:type="spellStart"/>
-            <w:r>
-              <w:rPr>
-                <w:rFonts w:eastAsia="Times New Roman" w:cs="Times New Roman"/>
-                <w:szCs w:val="24"/>
-                <w:lang w:eastAsia="cs-CZ"/>
-              </w:rPr>
-              <w:t>pdf</w:t>
-            </w:r>
-            <w:proofErr w:type="spellEnd"/>
-            <w:r>
-              <w:rPr>
-                <w:rFonts w:eastAsia="Times New Roman" w:cs="Times New Roman"/>
-                <w:szCs w:val="24"/>
-                <w:lang w:eastAsia="cs-CZ"/>
-              </w:rPr>
-              <w:t xml:space="preserve"> ani recenzovat</w:t>
+              <w:t>Sám nemůže nahrávat pdf ani recenzovat</w:t>
             </w:r>
           </w:p>
         </w:tc>
@@ -7281,25 +6637,7 @@
                 <w:szCs w:val="24"/>
                 <w:lang w:eastAsia="cs-CZ"/>
               </w:rPr>
-              <w:t>články s </w:t>
-            </w:r>
-            <w:proofErr w:type="spellStart"/>
-            <w:r>
-              <w:rPr>
-                <w:rFonts w:eastAsia="Times New Roman" w:cs="Times New Roman"/>
-                <w:szCs w:val="24"/>
-                <w:lang w:eastAsia="cs-CZ"/>
-              </w:rPr>
-              <w:t>pdf</w:t>
-            </w:r>
-            <w:proofErr w:type="spellEnd"/>
-            <w:r>
-              <w:rPr>
-                <w:rFonts w:eastAsia="Times New Roman" w:cs="Times New Roman"/>
-                <w:szCs w:val="24"/>
-                <w:lang w:eastAsia="cs-CZ"/>
-              </w:rPr>
-              <w:t xml:space="preserve"> a upravovat je do schválení či zamítnutí</w:t>
+              <w:t>články s pdf a upravovat je do schválení či zamítnutí</w:t>
             </w:r>
           </w:p>
         </w:tc>
@@ -7421,6 +6759,7 @@
           <w:szCs w:val="48"/>
           <w:lang w:eastAsia="cs-CZ"/>
         </w:rPr>
+        <w:lastRenderedPageBreak/>
         <w:drawing>
           <wp:anchor distT="0" distB="0" distL="114300" distR="114300" simplePos="0" relativeHeight="251658240" behindDoc="0" locked="0" layoutInCell="1" allowOverlap="1" wp14:anchorId="284FF0E6" wp14:editId="478D3004">
             <wp:simplePos x="0" y="0"/>

</xml_diff>